<commit_message>
Poids égaux, réseau force-directed, gabarit bi-format (LaTeX / HTML→PDF), PDF et Word régénérés, ronde 4
- Score : poids égaux (1/3 citations, 1/3 année, 1/3 récurrence) dans les scripts Python, R et le Rmd
- Réseau de citations : disposition par forces (networkx spring / igraph layout_with_fr) au lieu du cercle
- Gabarit : préambule LaTeX séparé, sortie html_document + CSS (en-tête, pagination, Times/Liberation) et
  script Scripts/imprimer_gabarit_pdf.sh (impression Chromium) ; PDF produit ici avec R 4.5/pandoc (conda-forge)
- Ronde 4 : Veltman, Boulet et Castonguay 1979 ; Boulet et al. 1981 ; Veltman 1976 ; bibliographie d'Albouy 2008
  partiellement confirmée via Scholar Gateway
- Scripts/maj_citations_scholar.py + Data/citations_google_scholar.csv pour injecter les comptes Google Scholar

Co-Authored-By: Claude Fable 5.1 <noreply@anthropic.com>
Claude-Session: https://claude.ai/code/session_01445z6xKrBFqCGGPpGngyXf
</commit_message>
<xml_diff>
--- a/Gabarit/gabarit_snowballing.docx
+++ b/Gabarit/gabarit_snowballing.docx
@@ -159,7 +159,7 @@
           <w:color w:val="000000"/>
           <w:sz w:val="24"/>
         </w:rPr>
-        <w:t>Nombre total de mots : 1148 (page titre et bibliographie exclues)</w:t>
+        <w:t>Nombre total de mots : 1159 (page titre et bibliographie exclues)</w:t>
       </w:r>
     </w:p>
     <w:p>
@@ -368,7 +368,7 @@
           <w:color w:val="000000"/>
           <w:sz w:val="24"/>
         </w:rPr>
-        <w:t xml:space="preserve"> de Porter (1965), en ne retenant que celles qui traitent des francophones et des anglophones (Blishen, 1970 ; Cuneo et Curtis, 1975 ; Darroch, 1979 ; Ogmundson et McLaughlin, 1992 ; Nakhaie, 1997 ; Wanner, 1999, 2005). Au terme de ces rondes, le corpus compte 100 publications dont 98 bibliographies ont été dépouillées ; la dernière ronde n'a plus produit de référence nouvelle répondant aux critères, ce qui marque la saturation.</w:t>
+        <w:t xml:space="preserve"> de Porter (1965), en ne retenant que celles qui traitent des francophones et des anglophones (Blishen, 1970 ; Cuneo et Curtis, 1975 ; Darroch, 1979 ; Ogmundson et McLaughlin, 1992 ; Nakhaie, 1997 ; Wanner, 1999, 2005). Au terme de ces rondes, le corpus compte 103 publications dont 101 bibliographies ont été dépouillées ; la dernière ronde n'a plus produit de référence nouvelle répondant aux critères, ce qui marque la saturation.</w:t>
       </w:r>
     </w:p>
     <w:p>
@@ -424,7 +424,7 @@
           <w:color w:val="000000"/>
           <w:sz w:val="24"/>
         </w:rPr>
-        <w:t xml:space="preserve">Suivant la méthode CLESSN, chaque publication reçoit un indice de pertinence compris entre 0 et 1 qui combine trois indicateurs normalisés par la méthode min-max : le nombre de citations (transformé en logarithme pour atténuer l'asymétrie entre les classiques et les articles récents), l'année de publication (1 pour la plus récente, 0 pour la plus ancienne) et la pertinence, mesurée par la récurrence de la publication dans les bibliographies dépouillées du corpus. La pondération retenue est de 0,35 pour les citations, 0,25 pour l'année et 0,40 pour la récurrence, le dernier indicateur étant le plus proche de la question de recherche. Le graphique de la section suivante présente les trente publications incluses qui obtiennent l'indice le plus élevé ; le code qui le produit figure dans ce document et dans le script </w:t>
+        <w:t xml:space="preserve">Suivant la méthode CLESSN, chaque publication reçoit un indice de pertinence compris entre 0 et 1 qui combine trois indicateurs normalisés par la méthode min-max : le nombre de citations (transformé en logarithme pour atténuer l'asymétrie entre les classiques et les articles récents), l'année de publication (1 pour la plus récente, 0 pour la plus ancienne) et la pertinence, mesurée par la récurrence de la publication dans les bibliographies dépouillées du corpus. Les trois indicateurs reçoivent un poids égal (un tiers chacun), comme dans le script de référence de la CLESSN. Le graphique de la section suivante présente les trente publications incluses qui obtiennent l'indice le plus élevé ; le code qui le produit figure dans ce document et dans le script </w:t>
       </w:r>
       <w:r>
         <w:rPr>
@@ -468,7 +468,7 @@
           <w:color w:val="000000"/>
           <w:sz w:val="24"/>
         </w:rPr>
-        <w:t>Pour visualiser la structure du champ, on construit enfin le réseau de citations entre les trente lectures retenues : chaque publication est un nœud placé sur un cercle dans l'ordre chronologique, chaque flèche relie une publication à celles qu'elle cite parmi les trente, et la taille du point est proportionnelle au nombre de citations reçues des autres membres du groupe. Ce graphique permet de repérer d'un coup d'œil les textes fondateurs vers lesquels convergent les flèches (le Livre III de la Commission royale d'enquête sur le bilinguisme et le biculturalisme, l'étude de Raynauld, Marion et Béland, la thèse de Vaillancourt et le rapport de Boulet), les textes de synthèse qui citent beaucoup sans être encore cités (les rapports récents) et les lignées disciplinaires qui ne se citent guère entre elles (économie du langage et sociologie de la mobilité).</w:t>
+        <w:t>Pour visualiser la structure du champ, on construit enfin le réseau de citations entre les trente lectures retenues : chaque publication est un nœud, chaque flèche relie une publication à celles qu'elle cite parmi les trente, la taille du point est proportionnelle au nombre de citations reçues des autres membres du groupe, et la disposition par forces (algorithme de Fruchterman et Reingold) rapproche les publications qui se citent mutuellement. Ce graphique permet de repérer d'un coup d'œil les textes fondateurs vers lesquels convergent les flèches (le Livre III de la Commission royale d'enquête sur le bilinguisme et le biculturalisme, l'étude de Raynauld, Marion et Béland, la thèse de Vaillancourt et le rapport de Boulet), les textes de synthèse qui citent beaucoup sans être encore cités (les rapports récents) et les lignées disciplinaires qui ne se citent guère entre elles (économie du langage et sociologie de la mobilité).</w:t>
       </w:r>
     </w:p>
     <w:p>
@@ -563,7 +563,7 @@
           <w:color w:val="000000"/>
           <w:sz w:val="24"/>
         </w:rPr>
-        <w:t>Figure 1. Liste des trente lectures les plus pertinentes selon l'indice de pertinence pondéré (citations 0,35 ; année 0,25 ; récurrence dans les bibliographies du corpus 0,40).</w:t>
+        <w:t>Figure 1. Liste des trente lectures les plus pertinentes selon l'indice de pertinence (moyenne à poids égaux des citations, de l'année et de la récurrence dans les bibliographies du corpus).</w:t>
       </w:r>
     </w:p>
     <w:p>
@@ -573,7 +573,7 @@
       <w:r>
         <w:drawing>
           <wp:inline xmlns:a="http://schemas.openxmlformats.org/drawingml/2006/main" xmlns:pic="http://schemas.openxmlformats.org/drawingml/2006/picture">
-            <wp:extent cx="5486400" cy="5486400"/>
+            <wp:extent cx="5486400" cy="4457700"/>
             <wp:docPr id="2" name="Picture 2"/>
             <wp:cNvGraphicFramePr>
               <a:graphicFrameLocks noChangeAspect="1"/>
@@ -594,7 +594,7 @@
                   <pic:spPr>
                     <a:xfrm>
                       <a:off x="0" y="0"/>
-                      <a:ext cx="5486400" cy="5486400"/>
+                      <a:ext cx="5486400" cy="4457700"/>
                     </a:xfrm>
                     <a:prstGeom prst="rect"/>
                   </pic:spPr>
@@ -616,7 +616,7 @@
           <w:color w:val="000000"/>
           <w:sz w:val="24"/>
         </w:rPr>
-        <w:t>Figure 2. Réseau de citations entre les trente lectures les plus pertinentes (ordre chronologique sur le cercle ; flèche : « cite » ; taille du point et nombre entre parenthèses : citations reçues des autres lectures du groupe).</w:t>
+        <w:t>Figure 2. Réseau de citations entre les trente lectures les plus pertinentes (disposition par forces : les publications qui se citent sont rapprochées ; flèche : « cite » ; taille du point et nombre entre parenthèses : citations reçues des autres lectures du groupe).</w:t>
       </w:r>
     </w:p>
     <w:p>
@@ -806,7 +806,7 @@
                 <w:color w:val="000000"/>
                 <w:sz w:val="20"/>
               </w:rPr>
-              <w:t>50</w:t>
+              <w:t>52</w:t>
             </w:r>
           </w:p>
         </w:tc>
@@ -902,7 +902,7 @@
                 <w:color w:val="000000"/>
                 <w:sz w:val="20"/>
               </w:rPr>
-              <w:t>80</w:t>
+              <w:t>83</w:t>
             </w:r>
           </w:p>
         </w:tc>
@@ -1096,7 +1096,7 @@
                 <w:color w:val="000000"/>
                 <w:sz w:val="20"/>
               </w:rPr>
-              <w:t>46</w:t>
+              <w:t>49</w:t>
             </w:r>
           </w:p>
         </w:tc>
@@ -1115,7 +1115,7 @@
                 <w:color w:val="000000"/>
                 <w:sz w:val="20"/>
               </w:rPr>
-              <w:t>0.60</w:t>
+              <w:t>0.61</w:t>
             </w:r>
           </w:p>
         </w:tc>
@@ -1212,7 +1212,7 @@
                 <w:color w:val="000000"/>
                 <w:sz w:val="20"/>
               </w:rPr>
-              <w:t>0.59</w:t>
+              <w:t>0.58</w:t>
             </w:r>
           </w:p>
         </w:tc>
@@ -1600,7 +1600,7 @@
                 <w:color w:val="000000"/>
                 <w:sz w:val="20"/>
               </w:rPr>
-              <w:t>0.54</w:t>
+              <w:t>0.53</w:t>
             </w:r>
           </w:p>
         </w:tc>
@@ -1678,7 +1678,7 @@
                 <w:color w:val="000000"/>
                 <w:sz w:val="20"/>
               </w:rPr>
-              <w:t>47</w:t>
+              <w:t>48</w:t>
             </w:r>
           </w:p>
         </w:tc>
@@ -2065,7 +2065,7 @@
                 <w:color w:val="000000"/>
                 <w:sz w:val="20"/>
               </w:rPr>
-              <w:t>53</w:t>
+              <w:t>56</w:t>
             </w:r>
           </w:p>
         </w:tc>
@@ -2084,7 +2084,7 @@
                 <w:color w:val="000000"/>
                 <w:sz w:val="20"/>
               </w:rPr>
-              <w:t>0.50</w:t>
+              <w:t>0.51</w:t>
             </w:r>
           </w:p>
         </w:tc>
@@ -2161,7 +2161,7 @@
                 <w:color w:val="000000"/>
                 <w:sz w:val="20"/>
               </w:rPr>
-              <w:t>43</w:t>
+              <w:t>44</w:t>
             </w:r>
           </w:p>
         </w:tc>
@@ -2258,7 +2258,7 @@
                 <w:color w:val="000000"/>
                 <w:sz w:val="20"/>
               </w:rPr>
-              <w:t>27</w:t>
+              <w:t>28</w:t>
             </w:r>
           </w:p>
         </w:tc>
@@ -2374,7 +2374,7 @@
                 <w:color w:val="000000"/>
                 <w:sz w:val="20"/>
               </w:rPr>
-              <w:t>0.47</w:t>
+              <w:t>0.46</w:t>
             </w:r>
           </w:p>
         </w:tc>
@@ -2607,295 +2607,6 @@
                 <w:color w:val="000000"/>
                 <w:sz w:val="20"/>
               </w:rPr>
-              <w:t>(Vaillancourt et al., 2013)</w:t>
-            </w:r>
-          </w:p>
-        </w:tc>
-        <w:tc>
-          <w:tcPr>
-            <w:tcW w:type="dxa" w:w="1881"/>
-          </w:tcPr>
-          <w:p>
-            <w:pPr>
-              <w:spacing w:line="240" w:lineRule="auto"/>
-            </w:pPr>
-            <w:r/>
-            <w:r>
-              <w:rPr>
-                <w:rFonts w:ascii="Times New Roman" w:hAnsi="Times New Roman" w:eastAsia="Times New Roman" w:cs="Times New Roman"/>
-                <w:color w:val="000000"/>
-                <w:sz w:val="20"/>
-              </w:rPr>
-              <w:t>9</w:t>
-            </w:r>
-          </w:p>
-        </w:tc>
-        <w:tc>
-          <w:tcPr>
-            <w:tcW w:type="dxa" w:w="1881"/>
-          </w:tcPr>
-          <w:p>
-            <w:pPr>
-              <w:spacing w:line="240" w:lineRule="auto"/>
-            </w:pPr>
-            <w:r/>
-            <w:r>
-              <w:rPr>
-                <w:rFonts w:ascii="Times New Roman" w:hAnsi="Times New Roman" w:eastAsia="Times New Roman" w:cs="Times New Roman"/>
-                <w:color w:val="000000"/>
-                <w:sz w:val="20"/>
-              </w:rPr>
-              <w:t>15</w:t>
-            </w:r>
-          </w:p>
-        </w:tc>
-        <w:tc>
-          <w:tcPr>
-            <w:tcW w:type="dxa" w:w="1881"/>
-          </w:tcPr>
-          <w:p>
-            <w:pPr>
-              <w:spacing w:line="240" w:lineRule="auto"/>
-            </w:pPr>
-            <w:r/>
-            <w:r>
-              <w:rPr>
-                <w:rFonts w:ascii="Times New Roman" w:hAnsi="Times New Roman" w:eastAsia="Times New Roman" w:cs="Times New Roman"/>
-                <w:color w:val="000000"/>
-                <w:sz w:val="20"/>
-              </w:rPr>
-              <w:t>0.43</w:t>
-            </w:r>
-          </w:p>
-        </w:tc>
-      </w:tr>
-      <w:tr>
-        <w:tc>
-          <w:tcPr>
-            <w:tcW w:type="dxa" w:w="1881"/>
-          </w:tcPr>
-          <w:p>
-            <w:pPr>
-              <w:spacing w:line="240" w:lineRule="auto"/>
-            </w:pPr>
-            <w:r/>
-            <w:r>
-              <w:rPr>
-                <w:rFonts w:ascii="Times New Roman" w:hAnsi="Times New Roman" w:eastAsia="Times New Roman" w:cs="Times New Roman"/>
-                <w:color w:val="000000"/>
-                <w:sz w:val="20"/>
-              </w:rPr>
-              <w:t>21</w:t>
-            </w:r>
-          </w:p>
-        </w:tc>
-        <w:tc>
-          <w:tcPr>
-            <w:tcW w:type="dxa" w:w="1881"/>
-          </w:tcPr>
-          <w:p>
-            <w:pPr>
-              <w:spacing w:line="240" w:lineRule="auto"/>
-            </w:pPr>
-            <w:r/>
-            <w:r>
-              <w:rPr>
-                <w:rFonts w:ascii="Times New Roman" w:hAnsi="Times New Roman" w:eastAsia="Times New Roman" w:cs="Times New Roman"/>
-                <w:color w:val="000000"/>
-                <w:sz w:val="20"/>
-              </w:rPr>
-              <w:t>(Vaillancourt, 2020)</w:t>
-            </w:r>
-          </w:p>
-        </w:tc>
-        <w:tc>
-          <w:tcPr>
-            <w:tcW w:type="dxa" w:w="1881"/>
-          </w:tcPr>
-          <w:p>
-            <w:pPr>
-              <w:spacing w:line="240" w:lineRule="auto"/>
-            </w:pPr>
-            <w:r/>
-            <w:r>
-              <w:rPr>
-                <w:rFonts w:ascii="Times New Roman" w:hAnsi="Times New Roman" w:eastAsia="Times New Roman" w:cs="Times New Roman"/>
-                <w:color w:val="000000"/>
-                <w:sz w:val="20"/>
-              </w:rPr>
-            </w:r>
-          </w:p>
-        </w:tc>
-        <w:tc>
-          <w:tcPr>
-            <w:tcW w:type="dxa" w:w="1881"/>
-          </w:tcPr>
-          <w:p>
-            <w:pPr>
-              <w:spacing w:line="240" w:lineRule="auto"/>
-            </w:pPr>
-            <w:r/>
-            <w:r>
-              <w:rPr>
-                <w:rFonts w:ascii="Times New Roman" w:hAnsi="Times New Roman" w:eastAsia="Times New Roman" w:cs="Times New Roman"/>
-                <w:color w:val="000000"/>
-                <w:sz w:val="20"/>
-              </w:rPr>
-              <w:t>4</w:t>
-            </w:r>
-          </w:p>
-        </w:tc>
-        <w:tc>
-          <w:tcPr>
-            <w:tcW w:type="dxa" w:w="1881"/>
-          </w:tcPr>
-          <w:p>
-            <w:pPr>
-              <w:spacing w:line="240" w:lineRule="auto"/>
-            </w:pPr>
-            <w:r/>
-            <w:r>
-              <w:rPr>
-                <w:rFonts w:ascii="Times New Roman" w:hAnsi="Times New Roman" w:eastAsia="Times New Roman" w:cs="Times New Roman"/>
-                <w:color w:val="000000"/>
-                <w:sz w:val="20"/>
-              </w:rPr>
-              <w:t>0.42</w:t>
-            </w:r>
-          </w:p>
-        </w:tc>
-      </w:tr>
-      <w:tr>
-        <w:tc>
-          <w:tcPr>
-            <w:tcW w:type="dxa" w:w="1881"/>
-          </w:tcPr>
-          <w:p>
-            <w:pPr>
-              <w:spacing w:line="240" w:lineRule="auto"/>
-            </w:pPr>
-            <w:r/>
-            <w:r>
-              <w:rPr>
-                <w:rFonts w:ascii="Times New Roman" w:hAnsi="Times New Roman" w:eastAsia="Times New Roman" w:cs="Times New Roman"/>
-                <w:color w:val="000000"/>
-                <w:sz w:val="20"/>
-              </w:rPr>
-              <w:t>22</w:t>
-            </w:r>
-          </w:p>
-        </w:tc>
-        <w:tc>
-          <w:tcPr>
-            <w:tcW w:type="dxa" w:w="1881"/>
-          </w:tcPr>
-          <w:p>
-            <w:pPr>
-              <w:spacing w:line="240" w:lineRule="auto"/>
-            </w:pPr>
-            <w:r/>
-            <w:r>
-              <w:rPr>
-                <w:rFonts w:ascii="Times New Roman" w:hAnsi="Times New Roman" w:eastAsia="Times New Roman" w:cs="Times New Roman"/>
-                <w:color w:val="000000"/>
-                <w:sz w:val="20"/>
-              </w:rPr>
-              <w:t>(Vaillancourt, 1988)</w:t>
-            </w:r>
-          </w:p>
-        </w:tc>
-        <w:tc>
-          <w:tcPr>
-            <w:tcW w:type="dxa" w:w="1881"/>
-          </w:tcPr>
-          <w:p>
-            <w:pPr>
-              <w:spacing w:line="240" w:lineRule="auto"/>
-            </w:pPr>
-            <w:r/>
-            <w:r>
-              <w:rPr>
-                <w:rFonts w:ascii="Times New Roman" w:hAnsi="Times New Roman" w:eastAsia="Times New Roman" w:cs="Times New Roman"/>
-                <w:color w:val="000000"/>
-                <w:sz w:val="20"/>
-              </w:rPr>
-            </w:r>
-          </w:p>
-        </w:tc>
-        <w:tc>
-          <w:tcPr>
-            <w:tcW w:type="dxa" w:w="1881"/>
-          </w:tcPr>
-          <w:p>
-            <w:pPr>
-              <w:spacing w:line="240" w:lineRule="auto"/>
-            </w:pPr>
-            <w:r/>
-            <w:r>
-              <w:rPr>
-                <w:rFonts w:ascii="Times New Roman" w:hAnsi="Times New Roman" w:eastAsia="Times New Roman" w:cs="Times New Roman"/>
-                <w:color w:val="000000"/>
-                <w:sz w:val="20"/>
-              </w:rPr>
-              <w:t>23</w:t>
-            </w:r>
-          </w:p>
-        </w:tc>
-        <w:tc>
-          <w:tcPr>
-            <w:tcW w:type="dxa" w:w="1881"/>
-          </w:tcPr>
-          <w:p>
-            <w:pPr>
-              <w:spacing w:line="240" w:lineRule="auto"/>
-            </w:pPr>
-            <w:r/>
-            <w:r>
-              <w:rPr>
-                <w:rFonts w:ascii="Times New Roman" w:hAnsi="Times New Roman" w:eastAsia="Times New Roman" w:cs="Times New Roman"/>
-                <w:color w:val="000000"/>
-                <w:sz w:val="20"/>
-              </w:rPr>
-              <w:t>0.42</w:t>
-            </w:r>
-          </w:p>
-        </w:tc>
-      </w:tr>
-      <w:tr>
-        <w:tc>
-          <w:tcPr>
-            <w:tcW w:type="dxa" w:w="1881"/>
-          </w:tcPr>
-          <w:p>
-            <w:pPr>
-              <w:spacing w:line="240" w:lineRule="auto"/>
-            </w:pPr>
-            <w:r/>
-            <w:r>
-              <w:rPr>
-                <w:rFonts w:ascii="Times New Roman" w:hAnsi="Times New Roman" w:eastAsia="Times New Roman" w:cs="Times New Roman"/>
-                <w:color w:val="000000"/>
-                <w:sz w:val="20"/>
-              </w:rPr>
-              <w:t>23</w:t>
-            </w:r>
-          </w:p>
-        </w:tc>
-        <w:tc>
-          <w:tcPr>
-            <w:tcW w:type="dxa" w:w="1881"/>
-          </w:tcPr>
-          <w:p>
-            <w:pPr>
-              <w:spacing w:line="240" w:lineRule="auto"/>
-            </w:pPr>
-            <w:r/>
-            <w:r>
-              <w:rPr>
-                <w:rFonts w:ascii="Times New Roman" w:hAnsi="Times New Roman" w:eastAsia="Times New Roman" w:cs="Times New Roman"/>
-                <w:color w:val="000000"/>
-                <w:sz w:val="20"/>
-              </w:rPr>
               <w:t>(PERT, 2023)</w:t>
             </w:r>
           </w:p>
@@ -2973,7 +2684,7 @@
                 <w:color w:val="000000"/>
                 <w:sz w:val="20"/>
               </w:rPr>
-              <w:t>24</w:t>
+              <w:t>21</w:t>
             </w:r>
           </w:p>
         </w:tc>
@@ -3070,7 +2781,489 @@
                 <w:color w:val="000000"/>
                 <w:sz w:val="20"/>
               </w:rPr>
+              <w:t>22</w:t>
+            </w:r>
+          </w:p>
+        </w:tc>
+        <w:tc>
+          <w:tcPr>
+            <w:tcW w:type="dxa" w:w="1881"/>
+          </w:tcPr>
+          <w:p>
+            <w:pPr>
+              <w:spacing w:line="240" w:lineRule="auto"/>
+            </w:pPr>
+            <w:r/>
+            <w:r>
+              <w:rPr>
+                <w:rFonts w:ascii="Times New Roman" w:hAnsi="Times New Roman" w:eastAsia="Times New Roman" w:cs="Times New Roman"/>
+                <w:color w:val="000000"/>
+                <w:sz w:val="20"/>
+              </w:rPr>
+              <w:t>(Vaillancourt et al., 2013)</w:t>
+            </w:r>
+          </w:p>
+        </w:tc>
+        <w:tc>
+          <w:tcPr>
+            <w:tcW w:type="dxa" w:w="1881"/>
+          </w:tcPr>
+          <w:p>
+            <w:pPr>
+              <w:spacing w:line="240" w:lineRule="auto"/>
+            </w:pPr>
+            <w:r/>
+            <w:r>
+              <w:rPr>
+                <w:rFonts w:ascii="Times New Roman" w:hAnsi="Times New Roman" w:eastAsia="Times New Roman" w:cs="Times New Roman"/>
+                <w:color w:val="000000"/>
+                <w:sz w:val="20"/>
+              </w:rPr>
+              <w:t>9</w:t>
+            </w:r>
+          </w:p>
+        </w:tc>
+        <w:tc>
+          <w:tcPr>
+            <w:tcW w:type="dxa" w:w="1881"/>
+          </w:tcPr>
+          <w:p>
+            <w:pPr>
+              <w:spacing w:line="240" w:lineRule="auto"/>
+            </w:pPr>
+            <w:r/>
+            <w:r>
+              <w:rPr>
+                <w:rFonts w:ascii="Times New Roman" w:hAnsi="Times New Roman" w:eastAsia="Times New Roman" w:cs="Times New Roman"/>
+                <w:color w:val="000000"/>
+                <w:sz w:val="20"/>
+              </w:rPr>
+              <w:t>15</w:t>
+            </w:r>
+          </w:p>
+        </w:tc>
+        <w:tc>
+          <w:tcPr>
+            <w:tcW w:type="dxa" w:w="1881"/>
+          </w:tcPr>
+          <w:p>
+            <w:pPr>
+              <w:spacing w:line="240" w:lineRule="auto"/>
+            </w:pPr>
+            <w:r/>
+            <w:r>
+              <w:rPr>
+                <w:rFonts w:ascii="Times New Roman" w:hAnsi="Times New Roman" w:eastAsia="Times New Roman" w:cs="Times New Roman"/>
+                <w:color w:val="000000"/>
+                <w:sz w:val="20"/>
+              </w:rPr>
+              <w:t>0.42</w:t>
+            </w:r>
+          </w:p>
+        </w:tc>
+      </w:tr>
+      <w:tr>
+        <w:tc>
+          <w:tcPr>
+            <w:tcW w:type="dxa" w:w="1881"/>
+          </w:tcPr>
+          <w:p>
+            <w:pPr>
+              <w:spacing w:line="240" w:lineRule="auto"/>
+            </w:pPr>
+            <w:r/>
+            <w:r>
+              <w:rPr>
+                <w:rFonts w:ascii="Times New Roman" w:hAnsi="Times New Roman" w:eastAsia="Times New Roman" w:cs="Times New Roman"/>
+                <w:color w:val="000000"/>
+                <w:sz w:val="20"/>
+              </w:rPr>
+              <w:t>23</w:t>
+            </w:r>
+          </w:p>
+        </w:tc>
+        <w:tc>
+          <w:tcPr>
+            <w:tcW w:type="dxa" w:w="1881"/>
+          </w:tcPr>
+          <w:p>
+            <w:pPr>
+              <w:spacing w:line="240" w:lineRule="auto"/>
+            </w:pPr>
+            <w:r/>
+            <w:r>
+              <w:rPr>
+                <w:rFonts w:ascii="Times New Roman" w:hAnsi="Times New Roman" w:eastAsia="Times New Roman" w:cs="Times New Roman"/>
+                <w:color w:val="000000"/>
+                <w:sz w:val="20"/>
+              </w:rPr>
+              <w:t>(Vaillancourt, 2020)</w:t>
+            </w:r>
+          </w:p>
+        </w:tc>
+        <w:tc>
+          <w:tcPr>
+            <w:tcW w:type="dxa" w:w="1881"/>
+          </w:tcPr>
+          <w:p>
+            <w:pPr>
+              <w:spacing w:line="240" w:lineRule="auto"/>
+            </w:pPr>
+            <w:r/>
+            <w:r>
+              <w:rPr>
+                <w:rFonts w:ascii="Times New Roman" w:hAnsi="Times New Roman" w:eastAsia="Times New Roman" w:cs="Times New Roman"/>
+                <w:color w:val="000000"/>
+                <w:sz w:val="20"/>
+              </w:rPr>
+            </w:r>
+          </w:p>
+        </w:tc>
+        <w:tc>
+          <w:tcPr>
+            <w:tcW w:type="dxa" w:w="1881"/>
+          </w:tcPr>
+          <w:p>
+            <w:pPr>
+              <w:spacing w:line="240" w:lineRule="auto"/>
+            </w:pPr>
+            <w:r/>
+            <w:r>
+              <w:rPr>
+                <w:rFonts w:ascii="Times New Roman" w:hAnsi="Times New Roman" w:eastAsia="Times New Roman" w:cs="Times New Roman"/>
+                <w:color w:val="000000"/>
+                <w:sz w:val="20"/>
+              </w:rPr>
+              <w:t>4</w:t>
+            </w:r>
+          </w:p>
+        </w:tc>
+        <w:tc>
+          <w:tcPr>
+            <w:tcW w:type="dxa" w:w="1881"/>
+          </w:tcPr>
+          <w:p>
+            <w:pPr>
+              <w:spacing w:line="240" w:lineRule="auto"/>
+            </w:pPr>
+            <w:r/>
+            <w:r>
+              <w:rPr>
+                <w:rFonts w:ascii="Times New Roman" w:hAnsi="Times New Roman" w:eastAsia="Times New Roman" w:cs="Times New Roman"/>
+                <w:color w:val="000000"/>
+                <w:sz w:val="20"/>
+              </w:rPr>
+              <w:t>0.42</w:t>
+            </w:r>
+          </w:p>
+        </w:tc>
+      </w:tr>
+      <w:tr>
+        <w:tc>
+          <w:tcPr>
+            <w:tcW w:type="dxa" w:w="1881"/>
+          </w:tcPr>
+          <w:p>
+            <w:pPr>
+              <w:spacing w:line="240" w:lineRule="auto"/>
+            </w:pPr>
+            <w:r/>
+            <w:r>
+              <w:rPr>
+                <w:rFonts w:ascii="Times New Roman" w:hAnsi="Times New Roman" w:eastAsia="Times New Roman" w:cs="Times New Roman"/>
+                <w:color w:val="000000"/>
+                <w:sz w:val="20"/>
+              </w:rPr>
+              <w:t>24</w:t>
+            </w:r>
+          </w:p>
+        </w:tc>
+        <w:tc>
+          <w:tcPr>
+            <w:tcW w:type="dxa" w:w="1881"/>
+          </w:tcPr>
+          <w:p>
+            <w:pPr>
+              <w:spacing w:line="240" w:lineRule="auto"/>
+            </w:pPr>
+            <w:r/>
+            <w:r>
+              <w:rPr>
+                <w:rFonts w:ascii="Times New Roman" w:hAnsi="Times New Roman" w:eastAsia="Times New Roman" w:cs="Times New Roman"/>
+                <w:color w:val="000000"/>
+                <w:sz w:val="20"/>
+              </w:rPr>
+              <w:t>(Migué, 1970)</w:t>
+            </w:r>
+          </w:p>
+        </w:tc>
+        <w:tc>
+          <w:tcPr>
+            <w:tcW w:type="dxa" w:w="1881"/>
+          </w:tcPr>
+          <w:p>
+            <w:pPr>
+              <w:spacing w:line="240" w:lineRule="auto"/>
+            </w:pPr>
+            <w:r/>
+            <w:r>
+              <w:rPr>
+                <w:rFonts w:ascii="Times New Roman" w:hAnsi="Times New Roman" w:eastAsia="Times New Roman" w:cs="Times New Roman"/>
+                <w:color w:val="000000"/>
+                <w:sz w:val="20"/>
+              </w:rPr>
+              <w:t>19</w:t>
+            </w:r>
+          </w:p>
+        </w:tc>
+        <w:tc>
+          <w:tcPr>
+            <w:tcW w:type="dxa" w:w="1881"/>
+          </w:tcPr>
+          <w:p>
+            <w:pPr>
+              <w:spacing w:line="240" w:lineRule="auto"/>
+            </w:pPr>
+            <w:r/>
+            <w:r>
+              <w:rPr>
+                <w:rFonts w:ascii="Times New Roman" w:hAnsi="Times New Roman" w:eastAsia="Times New Roman" w:cs="Times New Roman"/>
+                <w:color w:val="000000"/>
+                <w:sz w:val="20"/>
+              </w:rPr>
+              <w:t>33</w:t>
+            </w:r>
+          </w:p>
+        </w:tc>
+        <w:tc>
+          <w:tcPr>
+            <w:tcW w:type="dxa" w:w="1881"/>
+          </w:tcPr>
+          <w:p>
+            <w:pPr>
+              <w:spacing w:line="240" w:lineRule="auto"/>
+            </w:pPr>
+            <w:r/>
+            <w:r>
+              <w:rPr>
+                <w:rFonts w:ascii="Times New Roman" w:hAnsi="Times New Roman" w:eastAsia="Times New Roman" w:cs="Times New Roman"/>
+                <w:color w:val="000000"/>
+                <w:sz w:val="20"/>
+              </w:rPr>
+              <w:t>0.42</w:t>
+            </w:r>
+          </w:p>
+        </w:tc>
+      </w:tr>
+      <w:tr>
+        <w:tc>
+          <w:tcPr>
+            <w:tcW w:type="dxa" w:w="1881"/>
+          </w:tcPr>
+          <w:p>
+            <w:pPr>
+              <w:spacing w:line="240" w:lineRule="auto"/>
+            </w:pPr>
+            <w:r/>
+            <w:r>
+              <w:rPr>
+                <w:rFonts w:ascii="Times New Roman" w:hAnsi="Times New Roman" w:eastAsia="Times New Roman" w:cs="Times New Roman"/>
+                <w:color w:val="000000"/>
+                <w:sz w:val="20"/>
+              </w:rPr>
               <w:t>25</w:t>
+            </w:r>
+          </w:p>
+        </w:tc>
+        <w:tc>
+          <w:tcPr>
+            <w:tcW w:type="dxa" w:w="1881"/>
+          </w:tcPr>
+          <w:p>
+            <w:pPr>
+              <w:spacing w:line="240" w:lineRule="auto"/>
+            </w:pPr>
+            <w:r/>
+            <w:r>
+              <w:rPr>
+                <w:rFonts w:ascii="Times New Roman" w:hAnsi="Times New Roman" w:eastAsia="Times New Roman" w:cs="Times New Roman"/>
+                <w:color w:val="000000"/>
+                <w:sz w:val="20"/>
+              </w:rPr>
+              <w:t>(Vaillancourt et Fontaine, 2017)</w:t>
+            </w:r>
+          </w:p>
+        </w:tc>
+        <w:tc>
+          <w:tcPr>
+            <w:tcW w:type="dxa" w:w="1881"/>
+          </w:tcPr>
+          <w:p>
+            <w:pPr>
+              <w:spacing w:line="240" w:lineRule="auto"/>
+            </w:pPr>
+            <w:r/>
+            <w:r>
+              <w:rPr>
+                <w:rFonts w:ascii="Times New Roman" w:hAnsi="Times New Roman" w:eastAsia="Times New Roman" w:cs="Times New Roman"/>
+                <w:color w:val="000000"/>
+                <w:sz w:val="20"/>
+              </w:rPr>
+            </w:r>
+          </w:p>
+        </w:tc>
+        <w:tc>
+          <w:tcPr>
+            <w:tcW w:type="dxa" w:w="1881"/>
+          </w:tcPr>
+          <w:p>
+            <w:pPr>
+              <w:spacing w:line="240" w:lineRule="auto"/>
+            </w:pPr>
+            <w:r/>
+            <w:r>
+              <w:rPr>
+                <w:rFonts w:ascii="Times New Roman" w:hAnsi="Times New Roman" w:eastAsia="Times New Roman" w:cs="Times New Roman"/>
+                <w:color w:val="000000"/>
+                <w:sz w:val="20"/>
+              </w:rPr>
+              <w:t>4</w:t>
+            </w:r>
+          </w:p>
+        </w:tc>
+        <w:tc>
+          <w:tcPr>
+            <w:tcW w:type="dxa" w:w="1881"/>
+          </w:tcPr>
+          <w:p>
+            <w:pPr>
+              <w:spacing w:line="240" w:lineRule="auto"/>
+            </w:pPr>
+            <w:r/>
+            <w:r>
+              <w:rPr>
+                <w:rFonts w:ascii="Times New Roman" w:hAnsi="Times New Roman" w:eastAsia="Times New Roman" w:cs="Times New Roman"/>
+                <w:color w:val="000000"/>
+                <w:sz w:val="20"/>
+              </w:rPr>
+              <w:t>0.41</w:t>
+            </w:r>
+          </w:p>
+        </w:tc>
+      </w:tr>
+      <w:tr>
+        <w:tc>
+          <w:tcPr>
+            <w:tcW w:type="dxa" w:w="1881"/>
+          </w:tcPr>
+          <w:p>
+            <w:pPr>
+              <w:spacing w:line="240" w:lineRule="auto"/>
+            </w:pPr>
+            <w:r/>
+            <w:r>
+              <w:rPr>
+                <w:rFonts w:ascii="Times New Roman" w:hAnsi="Times New Roman" w:eastAsia="Times New Roman" w:cs="Times New Roman"/>
+                <w:color w:val="000000"/>
+                <w:sz w:val="20"/>
+              </w:rPr>
+              <w:t>26</w:t>
+            </w:r>
+          </w:p>
+        </w:tc>
+        <w:tc>
+          <w:tcPr>
+            <w:tcW w:type="dxa" w:w="1881"/>
+          </w:tcPr>
+          <w:p>
+            <w:pPr>
+              <w:spacing w:line="240" w:lineRule="auto"/>
+            </w:pPr>
+            <w:r/>
+            <w:r>
+              <w:rPr>
+                <w:rFonts w:ascii="Times New Roman" w:hAnsi="Times New Roman" w:eastAsia="Times New Roman" w:cs="Times New Roman"/>
+                <w:color w:val="000000"/>
+                <w:sz w:val="20"/>
+              </w:rPr>
+              <w:t>(Floch et Pocock, 2012)</w:t>
+            </w:r>
+          </w:p>
+        </w:tc>
+        <w:tc>
+          <w:tcPr>
+            <w:tcW w:type="dxa" w:w="1881"/>
+          </w:tcPr>
+          <w:p>
+            <w:pPr>
+              <w:spacing w:line="240" w:lineRule="auto"/>
+            </w:pPr>
+            <w:r/>
+            <w:r>
+              <w:rPr>
+                <w:rFonts w:ascii="Times New Roman" w:hAnsi="Times New Roman" w:eastAsia="Times New Roman" w:cs="Times New Roman"/>
+                <w:color w:val="000000"/>
+                <w:sz w:val="20"/>
+              </w:rPr>
+            </w:r>
+          </w:p>
+        </w:tc>
+        <w:tc>
+          <w:tcPr>
+            <w:tcW w:type="dxa" w:w="1881"/>
+          </w:tcPr>
+          <w:p>
+            <w:pPr>
+              <w:spacing w:line="240" w:lineRule="auto"/>
+            </w:pPr>
+            <w:r/>
+            <w:r>
+              <w:rPr>
+                <w:rFonts w:ascii="Times New Roman" w:hAnsi="Times New Roman" w:eastAsia="Times New Roman" w:cs="Times New Roman"/>
+                <w:color w:val="000000"/>
+                <w:sz w:val="20"/>
+              </w:rPr>
+              <w:t>7</w:t>
+            </w:r>
+          </w:p>
+        </w:tc>
+        <w:tc>
+          <w:tcPr>
+            <w:tcW w:type="dxa" w:w="1881"/>
+          </w:tcPr>
+          <w:p>
+            <w:pPr>
+              <w:spacing w:line="240" w:lineRule="auto"/>
+            </w:pPr>
+            <w:r/>
+            <w:r>
+              <w:rPr>
+                <w:rFonts w:ascii="Times New Roman" w:hAnsi="Times New Roman" w:eastAsia="Times New Roman" w:cs="Times New Roman"/>
+                <w:color w:val="000000"/>
+                <w:sz w:val="20"/>
+              </w:rPr>
+              <w:t>0.41</w:t>
+            </w:r>
+          </w:p>
+        </w:tc>
+      </w:tr>
+      <w:tr>
+        <w:tc>
+          <w:tcPr>
+            <w:tcW w:type="dxa" w:w="1881"/>
+          </w:tcPr>
+          <w:p>
+            <w:pPr>
+              <w:spacing w:line="240" w:lineRule="auto"/>
+            </w:pPr>
+            <w:r/>
+            <w:r>
+              <w:rPr>
+                <w:rFonts w:ascii="Times New Roman" w:hAnsi="Times New Roman" w:eastAsia="Times New Roman" w:cs="Times New Roman"/>
+                <w:color w:val="000000"/>
+                <w:sz w:val="20"/>
+              </w:rPr>
+              <w:t>27</w:t>
             </w:r>
           </w:p>
         </w:tc>
@@ -3166,7 +3359,7 @@
                 <w:color w:val="000000"/>
                 <w:sz w:val="20"/>
               </w:rPr>
-              <w:t>26</w:t>
+              <w:t>28</w:t>
             </w:r>
           </w:p>
         </w:tc>
@@ -3185,104 +3378,7 @@
                 <w:color w:val="000000"/>
                 <w:sz w:val="20"/>
               </w:rPr>
-              <w:t>(Migué, 1970)</w:t>
-            </w:r>
-          </w:p>
-        </w:tc>
-        <w:tc>
-          <w:tcPr>
-            <w:tcW w:type="dxa" w:w="1881"/>
-          </w:tcPr>
-          <w:p>
-            <w:pPr>
-              <w:spacing w:line="240" w:lineRule="auto"/>
-            </w:pPr>
-            <w:r/>
-            <w:r>
-              <w:rPr>
-                <w:rFonts w:ascii="Times New Roman" w:hAnsi="Times New Roman" w:eastAsia="Times New Roman" w:cs="Times New Roman"/>
-                <w:color w:val="000000"/>
-                <w:sz w:val="20"/>
-              </w:rPr>
-              <w:t>19</w:t>
-            </w:r>
-          </w:p>
-        </w:tc>
-        <w:tc>
-          <w:tcPr>
-            <w:tcW w:type="dxa" w:w="1881"/>
-          </w:tcPr>
-          <w:p>
-            <w:pPr>
-              <w:spacing w:line="240" w:lineRule="auto"/>
-            </w:pPr>
-            <w:r/>
-            <w:r>
-              <w:rPr>
-                <w:rFonts w:ascii="Times New Roman" w:hAnsi="Times New Roman" w:eastAsia="Times New Roman" w:cs="Times New Roman"/>
-                <w:color w:val="000000"/>
-                <w:sz w:val="20"/>
-              </w:rPr>
-              <w:t>30</w:t>
-            </w:r>
-          </w:p>
-        </w:tc>
-        <w:tc>
-          <w:tcPr>
-            <w:tcW w:type="dxa" w:w="1881"/>
-          </w:tcPr>
-          <w:p>
-            <w:pPr>
-              <w:spacing w:line="240" w:lineRule="auto"/>
-            </w:pPr>
-            <w:r/>
-            <w:r>
-              <w:rPr>
-                <w:rFonts w:ascii="Times New Roman" w:hAnsi="Times New Roman" w:eastAsia="Times New Roman" w:cs="Times New Roman"/>
-                <w:color w:val="000000"/>
-                <w:sz w:val="20"/>
-              </w:rPr>
-              <w:t>0.41</w:t>
-            </w:r>
-          </w:p>
-        </w:tc>
-      </w:tr>
-      <w:tr>
-        <w:tc>
-          <w:tcPr>
-            <w:tcW w:type="dxa" w:w="1881"/>
-          </w:tcPr>
-          <w:p>
-            <w:pPr>
-              <w:spacing w:line="240" w:lineRule="auto"/>
-            </w:pPr>
-            <w:r/>
-            <w:r>
-              <w:rPr>
-                <w:rFonts w:ascii="Times New Roman" w:hAnsi="Times New Roman" w:eastAsia="Times New Roman" w:cs="Times New Roman"/>
-                <w:color w:val="000000"/>
-                <w:sz w:val="20"/>
-              </w:rPr>
-              <w:t>27</w:t>
-            </w:r>
-          </w:p>
-        </w:tc>
-        <w:tc>
-          <w:tcPr>
-            <w:tcW w:type="dxa" w:w="1881"/>
-          </w:tcPr>
-          <w:p>
-            <w:pPr>
-              <w:spacing w:line="240" w:lineRule="auto"/>
-            </w:pPr>
-            <w:r/>
-            <w:r>
-              <w:rPr>
-                <w:rFonts w:ascii="Times New Roman" w:hAnsi="Times New Roman" w:eastAsia="Times New Roman" w:cs="Times New Roman"/>
-                <w:color w:val="000000"/>
-                <w:sz w:val="20"/>
-              </w:rPr>
-              <w:t>(Floch et Pocock, 2012)</w:t>
+              <w:t>(Vaillancourt, 1988)</w:t>
             </w:r>
           </w:p>
         </w:tc>
@@ -3319,103 +3415,7 @@
                 <w:color w:val="000000"/>
                 <w:sz w:val="20"/>
               </w:rPr>
-              <w:t>7</w:t>
-            </w:r>
-          </w:p>
-        </w:tc>
-        <w:tc>
-          <w:tcPr>
-            <w:tcW w:type="dxa" w:w="1881"/>
-          </w:tcPr>
-          <w:p>
-            <w:pPr>
-              <w:spacing w:line="240" w:lineRule="auto"/>
-            </w:pPr>
-            <w:r/>
-            <w:r>
-              <w:rPr>
-                <w:rFonts w:ascii="Times New Roman" w:hAnsi="Times New Roman" w:eastAsia="Times New Roman" w:cs="Times New Roman"/>
-                <w:color w:val="000000"/>
-                <w:sz w:val="20"/>
-              </w:rPr>
-              <w:t>0.41</w:t>
-            </w:r>
-          </w:p>
-        </w:tc>
-      </w:tr>
-      <w:tr>
-        <w:tc>
-          <w:tcPr>
-            <w:tcW w:type="dxa" w:w="1881"/>
-          </w:tcPr>
-          <w:p>
-            <w:pPr>
-              <w:spacing w:line="240" w:lineRule="auto"/>
-            </w:pPr>
-            <w:r/>
-            <w:r>
-              <w:rPr>
-                <w:rFonts w:ascii="Times New Roman" w:hAnsi="Times New Roman" w:eastAsia="Times New Roman" w:cs="Times New Roman"/>
-                <w:color w:val="000000"/>
-                <w:sz w:val="20"/>
-              </w:rPr>
-              <w:t>28</w:t>
-            </w:r>
-          </w:p>
-        </w:tc>
-        <w:tc>
-          <w:tcPr>
-            <w:tcW w:type="dxa" w:w="1881"/>
-          </w:tcPr>
-          <w:p>
-            <w:pPr>
-              <w:spacing w:line="240" w:lineRule="auto"/>
-            </w:pPr>
-            <w:r/>
-            <w:r>
-              <w:rPr>
-                <w:rFonts w:ascii="Times New Roman" w:hAnsi="Times New Roman" w:eastAsia="Times New Roman" w:cs="Times New Roman"/>
-                <w:color w:val="000000"/>
-                <w:sz w:val="20"/>
-              </w:rPr>
-              <w:t>(Vaillancourt et Fontaine, 2017)</w:t>
-            </w:r>
-          </w:p>
-        </w:tc>
-        <w:tc>
-          <w:tcPr>
-            <w:tcW w:type="dxa" w:w="1881"/>
-          </w:tcPr>
-          <w:p>
-            <w:pPr>
-              <w:spacing w:line="240" w:lineRule="auto"/>
-            </w:pPr>
-            <w:r/>
-            <w:r>
-              <w:rPr>
-                <w:rFonts w:ascii="Times New Roman" w:hAnsi="Times New Roman" w:eastAsia="Times New Roman" w:cs="Times New Roman"/>
-                <w:color w:val="000000"/>
-                <w:sz w:val="20"/>
-              </w:rPr>
-            </w:r>
-          </w:p>
-        </w:tc>
-        <w:tc>
-          <w:tcPr>
-            <w:tcW w:type="dxa" w:w="1881"/>
-          </w:tcPr>
-          <w:p>
-            <w:pPr>
-              <w:spacing w:line="240" w:lineRule="auto"/>
-            </w:pPr>
-            <w:r/>
-            <w:r>
-              <w:rPr>
-                <w:rFonts w:ascii="Times New Roman" w:hAnsi="Times New Roman" w:eastAsia="Times New Roman" w:cs="Times New Roman"/>
-                <w:color w:val="000000"/>
-                <w:sz w:val="20"/>
-              </w:rPr>
-              <w:t>4</w:t>
+              <w:t>23</w:t>
             </w:r>
           </w:p>
         </w:tc>
@@ -3512,7 +3512,7 @@
                 <w:color w:val="000000"/>
                 <w:sz w:val="20"/>
               </w:rPr>
-              <w:t>21</w:t>
+              <w:t>23</w:t>
             </w:r>
           </w:p>
         </w:tc>
@@ -3571,7 +3571,7 @@
                 <w:color w:val="000000"/>
                 <w:sz w:val="20"/>
               </w:rPr>
-              <w:t>(Vaillancourt et Touchette, 2001)</w:t>
+              <w:t>(Grenier et Nadeau, 2016)</w:t>
             </w:r>
           </w:p>
         </w:tc>
@@ -3608,7 +3608,7 @@
                 <w:color w:val="000000"/>
                 <w:sz w:val="20"/>
               </w:rPr>
-              <w:t>13</w:t>
+              <w:t>4</w:t>
             </w:r>
           </w:p>
         </w:tc>
@@ -3658,7 +3658,21 @@
           <w:color w:val="000000"/>
           <w:sz w:val="24"/>
         </w:rPr>
-        <w:t>Bibliographie</w:t>
+        <w:t>3. Bibliographie {-}</w:t>
+      </w:r>
+    </w:p>
+    <w:p>
+      <w:pPr>
+        <w:spacing w:line="480" w:lineRule="auto"/>
+        <w:jc w:val="both"/>
+      </w:pPr>
+      <w:r>
+        <w:rPr>
+          <w:rFonts w:ascii="Times New Roman" w:hAnsi="Times New Roman" w:eastAsia="Times New Roman" w:cs="Times New Roman"/>
+          <w:color w:val="000000"/>
+          <w:sz w:val="24"/>
+        </w:rPr>
+        <w:t>&lt;div class="bibliographie"&gt;</w:t>
       </w:r>
     </w:p>
     <w:p>
@@ -3989,6 +4003,36 @@
           <w:sz w:val="24"/>
         </w:rPr>
         <w:t>. https://doi.org/10.2307/135415</w:t>
+      </w:r>
+    </w:p>
+    <w:p>
+      <w:pPr>
+        <w:ind w:left="709" w:hanging="709"/>
+      </w:pPr>
+      <w:r>
+        <w:rPr>
+          <w:rFonts w:ascii="Times New Roman" w:hAnsi="Times New Roman" w:eastAsia="Times New Roman" w:cs="Times New Roman"/>
+          <w:color w:val="000000"/>
+          <w:sz w:val="24"/>
+        </w:rPr>
+        <w:t xml:space="preserve">Grenier, G. et Nadeau, S. (2016). English as the lingua franca and the economic value of other languages: The case of the language of work in the Montreal labor market. </w:t>
+      </w:r>
+      <w:r>
+        <w:rPr>
+          <w:rFonts w:ascii="Times New Roman" w:hAnsi="Times New Roman" w:eastAsia="Times New Roman" w:cs="Times New Roman"/>
+          <w:i/>
+          <w:color w:val="000000"/>
+          <w:sz w:val="24"/>
+        </w:rPr>
+        <w:t>In M. Gazzola et B.-A. Wickström (dir.), The Economics of Language Policy, Cambridge (MA) : MIT Press, 267-312</w:t>
+      </w:r>
+      <w:r>
+        <w:rPr>
+          <w:rFonts w:ascii="Times New Roman" w:hAnsi="Times New Roman" w:eastAsia="Times New Roman" w:cs="Times New Roman"/>
+          <w:color w:val="000000"/>
+          <w:sz w:val="24"/>
+        </w:rPr>
+        <w:t>.</w:t>
       </w:r>
     </w:p>
     <w:p>
@@ -4511,36 +4555,6 @@
           <w:color w:val="000000"/>
           <w:sz w:val="24"/>
         </w:rPr>
-        <w:t xml:space="preserve">Vaillancourt, F. et Touchette, C. (2001). Le statut du français sur le marché du travail au Québec, de 1970 à 1995 : les revenus de travail. </w:t>
-      </w:r>
-      <w:r>
-        <w:rPr>
-          <w:rFonts w:ascii="Times New Roman" w:hAnsi="Times New Roman" w:eastAsia="Times New Roman" w:cs="Times New Roman"/>
-          <w:i/>
-          <w:color w:val="000000"/>
-          <w:sz w:val="24"/>
-        </w:rPr>
-        <w:t>Montréal : CIRANO, Rapport de projet 2001RP-04 (pour le Conseil de la langue française)</w:t>
-      </w:r>
-      <w:r>
-        <w:rPr>
-          <w:rFonts w:ascii="Times New Roman" w:hAnsi="Times New Roman" w:eastAsia="Times New Roman" w:cs="Times New Roman"/>
-          <w:color w:val="000000"/>
-          <w:sz w:val="24"/>
-        </w:rPr>
-        <w:t>.</w:t>
-      </w:r>
-    </w:p>
-    <w:p>
-      <w:pPr>
-        <w:ind w:left="709" w:hanging="709"/>
-      </w:pPr>
-      <w:r>
-        <w:rPr>
-          <w:rFonts w:ascii="Times New Roman" w:hAnsi="Times New Roman" w:eastAsia="Times New Roman" w:cs="Times New Roman"/>
-          <w:color w:val="000000"/>
-          <w:sz w:val="24"/>
-        </w:rPr>
         <w:t xml:space="preserve">Vaillancourt, F., Tousignant, J., Chatel-DeRepentigny, J. et Coutu-Mantha, S. (2013). Revenus de travail et rendement des attributs linguistiques au Québec en 2005 et depuis 1970. </w:t>
       </w:r>
       <w:r>
@@ -4559,6 +4573,20 @@
           <w:sz w:val="24"/>
         </w:rPr>
         <w:t>. https://doi.org/10.3138/cpp.39.supplement1.s25</w:t>
+      </w:r>
+    </w:p>
+    <w:p>
+      <w:pPr>
+        <w:spacing w:line="480" w:lineRule="auto"/>
+        <w:jc w:val="both"/>
+      </w:pPr>
+      <w:r>
+        <w:rPr>
+          <w:rFonts w:ascii="Times New Roman" w:hAnsi="Times New Roman" w:eastAsia="Times New Roman" w:cs="Times New Roman"/>
+          <w:color w:val="000000"/>
+          <w:sz w:val="24"/>
+        </w:rPr>
+        <w:t>&lt;/div&gt;</w:t>
       </w:r>
     </w:p>
     <w:sectPr>

</xml_diff>

<commit_message>
Gabarit : graphiques intégrés au fil du texte (figures 1 et 2 dans les sections indice et réseau), numérotation des figures et tableaux, aperçus des pages
Co-Authored-By: Claude Fable 5.1 <noreply@anthropic.com>
Claude-Session: https://claude.ai/code/session_01445z6xKrBFqCGGPpGngyXf
</commit_message>
<xml_diff>
--- a/Gabarit/gabarit_snowballing.docx
+++ b/Gabarit/gabarit_snowballing.docx
@@ -159,7 +159,7 @@
           <w:color w:val="000000"/>
           <w:sz w:val="24"/>
         </w:rPr>
-        <w:t>Nombre total de mots : 1159 (page titre et bibliographie exclues)</w:t>
+        <w:t>Nombre total de mots : 1229 (page titre et bibliographie exclues)</w:t>
       </w:r>
     </w:p>
     <w:p>
@@ -424,7 +424,7 @@
           <w:color w:val="000000"/>
           <w:sz w:val="24"/>
         </w:rPr>
-        <w:t xml:space="preserve">Suivant la méthode CLESSN, chaque publication reçoit un indice de pertinence compris entre 0 et 1 qui combine trois indicateurs normalisés par la méthode min-max : le nombre de citations (transformé en logarithme pour atténuer l'asymétrie entre les classiques et les articles récents), l'année de publication (1 pour la plus récente, 0 pour la plus ancienne) et la pertinence, mesurée par la récurrence de la publication dans les bibliographies dépouillées du corpus. Les trois indicateurs reçoivent un poids égal (un tiers chacun), comme dans le script de référence de la CLESSN. Le graphique de la section suivante présente les trente publications incluses qui obtiennent l'indice le plus élevé ; le code qui le produit figure dans ce document et dans le script </w:t>
+        <w:t xml:space="preserve">Suivant la méthode CLESSN, chaque publication reçoit un indice de pertinence compris entre 0 et 1 qui combine trois indicateurs normalisés par la méthode min-max : le nombre de citations (transformé en logarithme pour atténuer l'asymétrie entre les classiques et les articles récents), l'année de publication (1 pour la plus récente, 0 pour la plus ancienne) et la pertinence, mesurée par la récurrence de la publication dans les bibliographies dépouillées du corpus. Les trois indicateurs reçoivent un poids égal (un tiers chacun), comme dans le script de référence de la CLESSN. La figure 1 présente les trente publications incluses qui obtiennent l'indice le plus élevé ; le code qui la produit figure dans ce document et dans le script </w:t>
       </w:r>
       <w:r>
         <w:rPr>
@@ -441,76 +441,6 @@
           <w:sz w:val="24"/>
         </w:rPr>
         <w:t>.</w:t>
-      </w:r>
-    </w:p>
-    <w:p>
-      <w:pPr>
-        <w:pStyle w:val="Heading2"/>
-      </w:pPr>
-      <w:r>
-        <w:rPr>
-          <w:rFonts w:ascii="Times New Roman" w:hAnsi="Times New Roman" w:eastAsia="Times New Roman" w:cs="Times New Roman"/>
-          <w:b/>
-          <w:color w:val="000000"/>
-          <w:sz w:val="24"/>
-        </w:rPr>
-        <w:t>1.6 Réseau de citations</w:t>
-      </w:r>
-    </w:p>
-    <w:p>
-      <w:pPr>
-        <w:spacing w:line="480" w:lineRule="auto"/>
-        <w:jc w:val="both"/>
-      </w:pPr>
-      <w:r>
-        <w:rPr>
-          <w:rFonts w:ascii="Times New Roman" w:hAnsi="Times New Roman" w:eastAsia="Times New Roman" w:cs="Times New Roman"/>
-          <w:color w:val="000000"/>
-          <w:sz w:val="24"/>
-        </w:rPr>
-        <w:t>Pour visualiser la structure du champ, on construit enfin le réseau de citations entre les trente lectures retenues : chaque publication est un nœud, chaque flèche relie une publication à celles qu'elle cite parmi les trente, la taille du point est proportionnelle au nombre de citations reçues des autres membres du groupe, et la disposition par forces (algorithme de Fruchterman et Reingold) rapproche les publications qui se citent mutuellement. Ce graphique permet de repérer d'un coup d'œil les textes fondateurs vers lesquels convergent les flèches (le Livre III de la Commission royale d'enquête sur le bilinguisme et le biculturalisme, l'étude de Raynauld, Marion et Béland, la thèse de Vaillancourt et le rapport de Boulet), les textes de synthèse qui citent beaucoup sans être encore cités (les rapports récents) et les lignées disciplinaires qui ne se citent guère entre elles (économie du langage et sociologie de la mobilité).</w:t>
-      </w:r>
-    </w:p>
-    <w:p>
-      <w:pPr>
-        <w:pStyle w:val="Heading2"/>
-      </w:pPr>
-      <w:r>
-        <w:rPr>
-          <w:rFonts w:ascii="Times New Roman" w:hAnsi="Times New Roman" w:eastAsia="Times New Roman" w:cs="Times New Roman"/>
-          <w:b/>
-          <w:color w:val="000000"/>
-          <w:sz w:val="24"/>
-        </w:rPr>
-        <w:t>1.7 Limites</w:t>
-      </w:r>
-    </w:p>
-    <w:p>
-      <w:pPr>
-        <w:spacing w:line="480" w:lineRule="auto"/>
-        <w:jc w:val="both"/>
-      </w:pPr>
-      <w:r>
-        <w:rPr>
-          <w:rFonts w:ascii="Times New Roman" w:hAnsi="Times New Roman" w:eastAsia="Times New Roman" w:cs="Times New Roman"/>
-          <w:color w:val="000000"/>
-          <w:sz w:val="24"/>
-        </w:rPr>
-        <w:t>Les comptes de citations proviennent du moteur Consensus (données Semantic Scholar) plutôt que de Google Scholar, qui n'était pas accessible depuis l'environnement d'exécution ; ils sont systématiquement plus faibles et doivent être mis à jour avant publication. Les rapports gouvernementaux et les ouvrages non indexés se sont vu attribuer la médiane du corpus, ce qui est signalé dans la grille. Les bibliographies ont été reconstituées à partir des références affichées par les moteurs bibliographiques et de la connaissance des textes plutôt qu'à partir des fichiers PDF, de sorte que les comptes de récurrence constituent des bornes inférieures à valider lors de la lecture. Enfin, la méthode par boule de neige tend à surreprésenter les auteurs les plus prolifiques d'un champ, ici l'économie du langage montréalaise, ce que la troisième ronde, ancrée dans la sociologie de la stratification, visait à corriger.</w:t>
-      </w:r>
-    </w:p>
-    <w:p>
-      <w:pPr>
-        <w:pStyle w:val="Heading1"/>
-      </w:pPr>
-      <w:r>
-        <w:rPr>
-          <w:rFonts w:ascii="Times New Roman" w:hAnsi="Times New Roman" w:eastAsia="Times New Roman" w:cs="Times New Roman"/>
-          <w:b/>
-          <w:color w:val="000000"/>
-          <w:sz w:val="24"/>
-        </w:rPr>
-        <w:t>2. Les trente lectures les plus pertinentes et leur réseau de citations</w:t>
       </w:r>
     </w:p>
     <w:p>
@@ -568,6 +498,48 @@
     </w:p>
     <w:p>
       <w:pPr>
+        <w:spacing w:line="480" w:lineRule="auto"/>
+        <w:jc w:val="both"/>
+      </w:pPr>
+      <w:r>
+        <w:rPr>
+          <w:rFonts w:ascii="Times New Roman" w:hAnsi="Times New Roman" w:eastAsia="Times New Roman" w:cs="Times New Roman"/>
+          <w:color w:val="000000"/>
+          <w:sz w:val="24"/>
+        </w:rPr>
+        <w:t>Les lectures de tête combinent les trois propriétés recherchées : des classiques très cités (Porter, 1965 ; Carliner, 1981 ; Lieberson, 1970), des textes que tout le corpus cite (Commission royale d'enquête sur le bilinguisme et le biculturalisme, 1969 ; Vaillancourt, 1980 ; Boulet, 1980) et des synthèses récentes (Albouy, 2008 ; Vaillancourt et al., 2007 ; Christofides et Swidinsky, 2010).</w:t>
+      </w:r>
+    </w:p>
+    <w:p>
+      <w:pPr>
+        <w:pStyle w:val="Heading2"/>
+      </w:pPr>
+      <w:r>
+        <w:rPr>
+          <w:rFonts w:ascii="Times New Roman" w:hAnsi="Times New Roman" w:eastAsia="Times New Roman" w:cs="Times New Roman"/>
+          <w:b/>
+          <w:color w:val="000000"/>
+          <w:sz w:val="24"/>
+        </w:rPr>
+        <w:t>1.6 Réseau de citations</w:t>
+      </w:r>
+    </w:p>
+    <w:p>
+      <w:pPr>
+        <w:spacing w:line="480" w:lineRule="auto"/>
+        <w:jc w:val="both"/>
+      </w:pPr>
+      <w:r>
+        <w:rPr>
+          <w:rFonts w:ascii="Times New Roman" w:hAnsi="Times New Roman" w:eastAsia="Times New Roman" w:cs="Times New Roman"/>
+          <w:color w:val="000000"/>
+          <w:sz w:val="24"/>
+        </w:rPr>
+        <w:t>Pour visualiser la structure du champ, on construit enfin le réseau de citations entre les trente lectures retenues : chaque publication est un nœud, chaque flèche relie une publication à celles qu'elle cite parmi les trente, la taille du point est proportionnelle au nombre de citations reçues des autres membres du groupe, et la disposition par forces (algorithme de Fruchterman et Reingold) rapproche les publications qui se citent mutuellement. Ce graphique permet de repérer d'un coup d'œil les textes fondateurs vers lesquels convergent les flèches (le Livre III de la Commission royale d'enquête sur le bilinguisme et le biculturalisme, l'étude de Raynauld, Marion et Béland, la thèse de Vaillancourt et le rapport de Boulet), les textes de synthèse qui citent beaucoup sans être encore cités (les rapports récents) et les lignées disciplinaires qui ne se citent guère entre elles (économie du langage et sociologie de la mobilité). La figure 2 présente ce réseau.</w:t>
+      </w:r>
+    </w:p>
+    <w:p>
+      <w:pPr>
         <w:jc w:val="center"/>
       </w:pPr>
       <w:r>
@@ -617,6 +589,62 @@
           <w:sz w:val="24"/>
         </w:rPr>
         <w:t>Figure 2. Réseau de citations entre les trente lectures les plus pertinentes (disposition par forces : les publications qui se citent sont rapprochées ; flèche : « cite » ; taille du point et nombre entre parenthèses : citations reçues des autres lectures du groupe).</w:t>
+      </w:r>
+    </w:p>
+    <w:p>
+      <w:pPr>
+        <w:pStyle w:val="Heading2"/>
+      </w:pPr>
+      <w:r>
+        <w:rPr>
+          <w:rFonts w:ascii="Times New Roman" w:hAnsi="Times New Roman" w:eastAsia="Times New Roman" w:cs="Times New Roman"/>
+          <w:b/>
+          <w:color w:val="000000"/>
+          <w:sz w:val="24"/>
+        </w:rPr>
+        <w:t>1.7 Limites</w:t>
+      </w:r>
+    </w:p>
+    <w:p>
+      <w:pPr>
+        <w:spacing w:line="480" w:lineRule="auto"/>
+        <w:jc w:val="both"/>
+      </w:pPr>
+      <w:r>
+        <w:rPr>
+          <w:rFonts w:ascii="Times New Roman" w:hAnsi="Times New Roman" w:eastAsia="Times New Roman" w:cs="Times New Roman"/>
+          <w:color w:val="000000"/>
+          <w:sz w:val="24"/>
+        </w:rPr>
+        <w:t>Les comptes de citations proviennent du moteur Consensus (données Semantic Scholar) plutôt que de Google Scholar, qui n'était pas accessible depuis l'environnement d'exécution ; ils sont systématiquement plus faibles et doivent être mis à jour avant publication. Les rapports gouvernementaux et les ouvrages non indexés se sont vu attribuer la médiane du corpus, ce qui est signalé dans la grille. Les bibliographies ont été reconstituées à partir des références affichées par les moteurs bibliographiques et de la connaissance des textes plutôt qu'à partir des fichiers PDF, de sorte que les comptes de récurrence constituent des bornes inférieures à valider lors de la lecture. Enfin, la méthode par boule de neige tend à surreprésenter les auteurs les plus prolifiques d'un champ, ici l'économie du langage montréalaise, ce que la troisième ronde, ancrée dans la sociologie de la stratification, visait à corriger.</w:t>
+      </w:r>
+    </w:p>
+    <w:p>
+      <w:pPr>
+        <w:pStyle w:val="Heading1"/>
+      </w:pPr>
+      <w:r>
+        <w:rPr>
+          <w:rFonts w:ascii="Times New Roman" w:hAnsi="Times New Roman" w:eastAsia="Times New Roman" w:cs="Times New Roman"/>
+          <w:b/>
+          <w:color w:val="000000"/>
+          <w:sz w:val="24"/>
+        </w:rPr>
+        <w:t>2. Les trente lectures retenues</w:t>
+      </w:r>
+    </w:p>
+    <w:p>
+      <w:pPr>
+        <w:spacing w:line="480" w:lineRule="auto"/>
+        <w:jc w:val="both"/>
+      </w:pPr>
+      <w:r>
+        <w:rPr>
+          <w:rFonts w:ascii="Times New Roman" w:hAnsi="Times New Roman" w:eastAsia="Times New Roman" w:cs="Times New Roman"/>
+          <w:color w:val="000000"/>
+          <w:sz w:val="24"/>
+        </w:rPr>
+        <w:t>Le tableau 1 reprend, pour chacune des trente lectures de la figure 1, les trois composantes de l'indice de pertinence.</w:t>
       </w:r>
     </w:p>
     <w:p>

</xml_diff>

<commit_message>
Gabarit : retrait d'une phrase en double avant le tableau 1
Co-Authored-By: Claude Fable 5.1 <noreply@anthropic.com>
Claude-Session: https://claude.ai/code/session_01445z6xKrBFqCGGPpGngyXf
</commit_message>
<xml_diff>
--- a/Gabarit/gabarit_snowballing.docx
+++ b/Gabarit/gabarit_snowballing.docx
@@ -159,7 +159,7 @@
           <w:color w:val="000000"/>
           <w:sz w:val="24"/>
         </w:rPr>
-        <w:t>Nombre total de mots : 1229 (page titre et bibliographie exclues)</w:t>
+        <w:t>Nombre total de mots : 1215 (page titre et bibliographie exclues)</w:t>
       </w:r>
     </w:p>
     <w:p>
@@ -645,20 +645,6 @@
           <w:sz w:val="24"/>
         </w:rPr>
         <w:t>Le tableau 1 reprend, pour chacune des trente lectures de la figure 1, les trois composantes de l'indice de pertinence.</w:t>
-      </w:r>
-    </w:p>
-    <w:p>
-      <w:pPr>
-        <w:spacing w:line="480" w:lineRule="auto"/>
-        <w:jc w:val="both"/>
-      </w:pPr>
-      <w:r>
-        <w:rPr>
-          <w:rFonts w:ascii="Times New Roman" w:hAnsi="Times New Roman" w:eastAsia="Times New Roman" w:cs="Times New Roman"/>
-          <w:color w:val="000000"/>
-          <w:sz w:val="24"/>
-        </w:rPr>
-        <w:t>Le tableau suivant reprend les trois composantes de l'indice pour chacune des trente lectures.</w:t>
       </w:r>
     </w:p>
     <w:tbl>

</xml_diff>

<commit_message>
Gabarit restructuré : Introduction / Méthode (2 pages, figures intégrées, sans tableau) / Revue de littérature
Co-Authored-By: Claude Fable 5.1 <noreply@anthropic.com>
Claude-Session: https://claude.ai/code/session_01445z6xKrBFqCGGPpGngyXf
</commit_message>
<xml_diff>
--- a/Gabarit/gabarit_snowballing.docx
+++ b/Gabarit/gabarit_snowballing.docx
@@ -159,7 +159,7 @@
           <w:color w:val="000000"/>
           <w:sz w:val="24"/>
         </w:rPr>
-        <w:t>Nombre total de mots : 1273 (page titre et bibliographie exclues)</w:t>
+        <w:t>Nombre total de mots : 387 (page titre et bibliographie exclues)</w:t>
       </w:r>
     </w:p>
     <w:p>
@@ -184,21 +184,7 @@
           <w:color w:val="000000"/>
           <w:sz w:val="24"/>
         </w:rPr>
-        <w:t>1. Méthode de repérage des références</w:t>
-      </w:r>
-    </w:p>
-    <w:p>
-      <w:pPr>
-        <w:pStyle w:val="Heading2"/>
-      </w:pPr>
-      <w:r>
-        <w:rPr>
-          <w:rFonts w:ascii="Times New Roman" w:hAnsi="Times New Roman" w:eastAsia="Times New Roman" w:cs="Times New Roman"/>
-          <w:b/>
-          <w:color w:val="000000"/>
-          <w:sz w:val="24"/>
-        </w:rPr>
-        <w:t>1.1 Principe : la revue par « boule de neige »</w:t>
+        <w:t>1. Introduction</w:t>
       </w:r>
     </w:p>
     <w:p>
@@ -212,7 +198,35 @@
           <w:color w:val="000000"/>
           <w:sz w:val="24"/>
         </w:rPr>
-        <w:t xml:space="preserve">Le repérage des sources repose sur la méthode du </w:t>
+        <w:t>[À rédiger.]</w:t>
+      </w:r>
+    </w:p>
+    <w:p>
+      <w:pPr>
+        <w:pStyle w:val="Heading1"/>
+      </w:pPr>
+      <w:r>
+        <w:rPr>
+          <w:rFonts w:ascii="Times New Roman" w:hAnsi="Times New Roman" w:eastAsia="Times New Roman" w:cs="Times New Roman"/>
+          <w:b/>
+          <w:color w:val="000000"/>
+          <w:sz w:val="24"/>
+        </w:rPr>
+        <w:t>2. Méthode</w:t>
+      </w:r>
+    </w:p>
+    <w:p>
+      <w:pPr>
+        <w:spacing w:line="480" w:lineRule="auto"/>
+        <w:jc w:val="both"/>
+      </w:pPr>
+      <w:r>
+        <w:rPr>
+          <w:rFonts w:ascii="Times New Roman" w:hAnsi="Times New Roman" w:eastAsia="Times New Roman" w:cs="Times New Roman"/>
+          <w:color w:val="000000"/>
+          <w:sz w:val="24"/>
+        </w:rPr>
+        <w:t xml:space="preserve">Le repérage des sources suit la méthode du </w:t>
       </w:r>
       <w:r>
         <w:rPr>
@@ -229,7 +243,7 @@
           <w:color w:val="000000"/>
           <w:sz w:val="24"/>
         </w:rPr>
-        <w:t xml:space="preserve"> (perles de littérature) telle que décrite par Jalali et Wohlin (2012) et enseignée par la Chaire de leadership en enseignement des sciences sociales numériques (CLESSN). Plutôt que d'interroger plusieurs bases de données avec des mots-clés, on part d'un petit ensemble de publications récentes et centrales, puis on dépouille systématiquement leurs listes de références (</w:t>
+        <w:t xml:space="preserve"> (Jalali et Wohlin, 2012) enseignée par la CLESSN : à partir d'un ensemble de départ de onze publications récentes couvrant cinq communautés savantes (économie du langage, histoire économique, sociologie de la stratification, aménagement linguistique, littérature grise sur le recensement de 2021), on dépouille les listes de références (</w:t>
       </w:r>
       <w:r>
         <w:rPr>
@@ -238,7 +252,7 @@
           <w:color w:val="000000"/>
           <w:sz w:val="24"/>
         </w:rPr>
-        <w:t>backward snowballing</w:t>
+        <w:t>backward</w:t>
       </w:r>
       <w:r>
         <w:rPr>
@@ -246,7 +260,7 @@
           <w:color w:val="000000"/>
           <w:sz w:val="24"/>
         </w:rPr>
-        <w:t>) et les publications qui les citent (</w:t>
+        <w:t>) et les publications citantes (</w:t>
       </w:r>
       <w:r>
         <w:rPr>
@@ -255,7 +269,7 @@
           <w:color w:val="000000"/>
           <w:sz w:val="24"/>
         </w:rPr>
-        <w:t>forward snowballing</w:t>
+        <w:t>forward</w:t>
       </w:r>
       <w:r>
         <w:rPr>
@@ -263,95 +277,7 @@
           <w:color w:val="000000"/>
           <w:sz w:val="24"/>
         </w:rPr>
-        <w:t xml:space="preserve">). Chaque publication retenue devient à son tour un point de départ, et l'on répète l'opération jusqu'à saturation, c'est-à-dire jusqu'à ce qu'une ronde n'apporte plus de référence pertinente. L'ensemble des publications repérées, ainsi que la bibliographie dépouillée de chacune, est consigné dans une grille (fichier </w:t>
-      </w:r>
-      <w:r>
-        <w:rPr>
-          <w:rFonts w:ascii="Times New Roman" w:hAnsi="Times New Roman" w:eastAsia="Times New Roman" w:cs="Times New Roman"/>
-          <w:color w:val="000000"/>
-          <w:sz w:val="24"/>
-        </w:rPr>
-        <w:t>Data/grille_snowballing.csv</w:t>
-      </w:r>
-      <w:r>
-        <w:rPr>
-          <w:rFonts w:ascii="Times New Roman" w:hAnsi="Times New Roman" w:eastAsia="Times New Roman" w:cs="Times New Roman"/>
-          <w:color w:val="000000"/>
-          <w:sz w:val="24"/>
-        </w:rPr>
-        <w:t xml:space="preserve"> et </w:t>
-      </w:r>
-      <w:r>
-        <w:rPr>
-          <w:rFonts w:ascii="Times New Roman" w:hAnsi="Times New Roman" w:eastAsia="Times New Roman" w:cs="Times New Roman"/>
-          <w:color w:val="000000"/>
-          <w:sz w:val="24"/>
-        </w:rPr>
-        <w:t>Data/grille_snowballing.xlsx</w:t>
-      </w:r>
-      <w:r>
-        <w:rPr>
-          <w:rFonts w:ascii="Times New Roman" w:hAnsi="Times New Roman" w:eastAsia="Times New Roman" w:cs="Times New Roman"/>
-          <w:color w:val="000000"/>
-          <w:sz w:val="24"/>
-        </w:rPr>
-        <w:t xml:space="preserve"> du dépôt).</w:t>
-      </w:r>
-    </w:p>
-    <w:p>
-      <w:pPr>
-        <w:pStyle w:val="Heading2"/>
-      </w:pPr>
-      <w:r>
-        <w:rPr>
-          <w:rFonts w:ascii="Times New Roman" w:hAnsi="Times New Roman" w:eastAsia="Times New Roman" w:cs="Times New Roman"/>
-          <w:b/>
-          <w:color w:val="000000"/>
-          <w:sz w:val="24"/>
-        </w:rPr>
-        <w:t>1.2 Ensemble de départ</w:t>
-      </w:r>
-    </w:p>
-    <w:p>
-      <w:pPr>
-        <w:spacing w:line="480" w:lineRule="auto"/>
-        <w:jc w:val="both"/>
-      </w:pPr>
-      <w:r>
-        <w:rPr>
-          <w:rFonts w:ascii="Times New Roman" w:hAnsi="Times New Roman" w:eastAsia="Times New Roman" w:cs="Times New Roman"/>
-          <w:color w:val="000000"/>
-          <w:sz w:val="24"/>
-        </w:rPr>
-        <w:t>L'ensemble de départ compte onze publications choisies pour couvrir les différentes communautés savantes qui s'intéressent à la question : l'économie du langage et du travail (Albouy, 2008 ; Nadeau, 2010 ; Christofides et Swidinsky, 2010 ; Vaillancourt et al., 2013 ; Vaillancourt et al., 2024), l'histoire économique (Dean et Geloso, 2022 ; Gagnon et al., 2023), la sociologie et la démographie (Béland et al., 2010), la psychologie sociale et l'aménagement linguistique (Bourhis, 2019 ; Grenier, 2019) et la littérature grise récente sur le recensement de 2021 (Donovan et Bell, 2024). Ces textes ont été repérés à partir des mots-clés de la question de recherche et de leurs synonymes (francophones, anglophones, langue maternelle, revenu de travail, écart salarial, statut socioprofessionnel, mobilité, propriété des entreprises, Québec, recensement, Loi 101) dans le moteur académique Consensus et par recherche web.</w:t>
-      </w:r>
-    </w:p>
-    <w:p>
-      <w:pPr>
-        <w:pStyle w:val="Heading2"/>
-      </w:pPr>
-      <w:r>
-        <w:rPr>
-          <w:rFonts w:ascii="Times New Roman" w:hAnsi="Times New Roman" w:eastAsia="Times New Roman" w:cs="Times New Roman"/>
-          <w:b/>
-          <w:color w:val="000000"/>
-          <w:sz w:val="24"/>
-        </w:rPr>
-        <w:t>1.3 Rondes de dépouillement</w:t>
-      </w:r>
-    </w:p>
-    <w:p>
-      <w:pPr>
-        <w:spacing w:line="480" w:lineRule="auto"/>
-        <w:jc w:val="both"/>
-      </w:pPr>
-      <w:r>
-        <w:rPr>
-          <w:rFonts w:ascii="Times New Roman" w:hAnsi="Times New Roman" w:eastAsia="Times New Roman" w:cs="Times New Roman"/>
-          <w:color w:val="000000"/>
-          <w:sz w:val="24"/>
-        </w:rPr>
-        <w:t xml:space="preserve">Trois rondes ont été nécessaires. La première ronde a dépouillé les bibliographies des onze textes de départ et repéré leurs citants : elle a fait émerger le noyau de l'économie du langage au Québec (Vaillancourt, 1980 ; Carliner, 1981 ; Lacroix et Vaillancourt, 1981 ; Shapiro et Stelcner, 1987, 1997 ; Grenier, 1987 ; Bloom et Grenier, 1992), les documents fondateurs issus du recensement de 1961 (Commission royale d'enquête sur le bilinguisme et le biculturalisme, 1969 ; Raynauld, Marion et Béland, 1966 ; Raynauld, 1974) et les travaux sociologiques sur la stratification linguistique (Porter, 1965 ; Lieberson, 1970 ; Lanphier et Morris, 1974 ; Fenwick, 1982 ; Levine, 1990). La deuxième ronde a dépouillé ces nouvelles publications et ajouté les études de mobilité et d'attainment du statut (de Jocas et Rocher, 1957 ; McRoberts et al., 1976 ; Boyd et al., 1985 ; Béland, 1987 ; Laczko, 1995), les explications théoriques (Migué, 1970 ; Dofny et Rioux, 1962 ; Guindon, 1964 ; McRoberts, 1979) et la série de rapports sur la propriété des entreprises et les revenus de travail (Vaillancourt, 1988, 1991 ; Vaillancourt et Carpentier, 1989 ; Sales et Bélanger, 1985 ; Vaillancourt et Touchette, 2001 ; Vaillancourt et Vaillancourt, 2005 ; Vaillancourt, 2018, 2020). La troisième ronde a raffiné le repérage en examinant les publications qui citent l'échelle de classes professionnelles de Blishen (1958) et </w:t>
+        <w:t xml:space="preserve">), puis on répète l'opération avec chaque texte retenu jusqu'à saturation. Quatre rondes, dont une consacrée aux travaux citant l'échelle professionnelle de Blishen (1958) et </w:t>
       </w:r>
       <w:r>
         <w:rPr>
@@ -368,21 +294,7 @@
           <w:color w:val="000000"/>
           <w:sz w:val="24"/>
         </w:rPr>
-        <w:t xml:space="preserve"> de Porter (1965), en ne retenant que celles qui traitent des francophones et des anglophones (Blishen, 1970 ; Cuneo et Curtis, 1975 ; Darroch, 1979 ; Ogmundson et McLaughlin, 1992 ; Nakhaie, 1997 ; Wanner, 1999, 2005). Au terme de ces rondes, le corpus compte 103 publications dont 101 bibliographies ont été dépouillées ; la dernière ronde n'a plus produit de référence nouvelle répondant aux critères, ce qui marque la saturation.</w:t>
-      </w:r>
-    </w:p>
-    <w:p>
-      <w:pPr>
-        <w:pStyle w:val="Heading2"/>
-      </w:pPr>
-      <w:r>
-        <w:rPr>
-          <w:rFonts w:ascii="Times New Roman" w:hAnsi="Times New Roman" w:eastAsia="Times New Roman" w:cs="Times New Roman"/>
-          <w:b/>
-          <w:color w:val="000000"/>
-          <w:sz w:val="24"/>
-        </w:rPr>
-        <w:t>1.4 Critères d'inclusion</w:t>
+        <w:t xml:space="preserve"> de Porter (1965), ont produit un corpus de 103 publications et 101 bibliographies dépouillées. Une publication est retenue si elle compare explicitement francophones et anglophones au Québec (critère obligatoire) et si elle mesure le revenu d'emploi ou le statut socioprofessionnel, couvre un recensement de 1961 à 2021 ou propose une explication (au moins trois points sur six) ; les travaux de contexte sont conservés dans la grille sans être classés.</w:t>
       </w:r>
     </w:p>
     <w:p>
@@ -396,35 +308,16 @@
           <w:color w:val="000000"/>
           <w:sz w:val="24"/>
         </w:rPr>
-        <w:t>Une publication est retenue si elle compare explicitement les francophones et les anglophones du Québec (critère obligatoire, 2 points), si elle mesure le revenu d'emploi ou le statut socioprofessionnel (2 points), si elle couvre au moins un recensement de la période 1961-2021 (1 point) et si elle propose une explication de l'écart ou de son évolution (1 point). Les publications qui obtiennent au moins trois points sont incluses ; celles qui ne remplissent pas le critère obligatoire mais qui sont indispensables à la compréhension du problème (outils de mesure du statut, travaux sur la mosaïque verticale canadienne, études d'immigrants) sont conservées dans la grille avec le statut « contexte » sans entrer dans le classement.</w:t>
+        <w:t xml:space="preserve">Chaque publication reçoit un indice de pertinence de 0 à 1, moyenne à poids égaux de trois indicateurs normalisés (min-max) : le nombre de citations Google Scholar (en logarithme ; relevé avec un script Python fondé sur la bibliothèque </w:t>
       </w:r>
-    </w:p>
-    <w:p>
-      <w:pPr>
-        <w:pStyle w:val="Heading2"/>
-      </w:pPr>
       <w:r>
         <w:rPr>
           <w:rFonts w:ascii="Times New Roman" w:hAnsi="Times New Roman" w:eastAsia="Times New Roman" w:cs="Times New Roman"/>
-          <w:b/>
+          <w:i/>
           <w:color w:val="000000"/>
           <w:sz w:val="24"/>
         </w:rPr>
-        <w:t>1.5 Indice de pertinence</w:t>
-      </w:r>
-    </w:p>
-    <w:p>
-      <w:pPr>
-        <w:spacing w:line="480" w:lineRule="auto"/>
-        <w:jc w:val="both"/>
-      </w:pPr>
-      <w:r>
-        <w:rPr>
-          <w:rFonts w:ascii="Times New Roman" w:hAnsi="Times New Roman" w:eastAsia="Times New Roman" w:cs="Times New Roman"/>
-          <w:color w:val="000000"/>
-          <w:sz w:val="24"/>
-        </w:rPr>
-        <w:t xml:space="preserve">Suivant la méthode CLESSN, chaque publication reçoit un indice de pertinence compris entre 0 et 1 qui combine trois indicateurs normalisés par la méthode min-max : le nombre de citations (transformé en logarithme pour atténuer l'asymétrie entre les classiques et les articles récents), l'année de publication (1 pour la plus récente, 0 pour la plus ancienne) et la pertinence, mesurée par la récurrence de la publication dans les bibliographies dépouillées du corpus. Les trois indicateurs reçoivent un poids égal (un tiers chacun), comme dans le script de référence de la CLESSN. La figure 1 présente les trente publications incluses qui obtiennent l'indice le plus élevé ; le code qui la produit figure dans ce document et dans le script </w:t>
+        <w:t>scholarly</w:t>
       </w:r>
       <w:r>
         <w:rPr>
@@ -432,7 +325,7 @@
           <w:color w:val="000000"/>
           <w:sz w:val="24"/>
         </w:rPr>
-        <w:t>CodeR/graphique_snowballing.R</w:t>
+        <w:t xml:space="preserve">, sinon compte Consensus ramené à l'échelle de Google Scholar), l'année de publication et la récurrence, soit le nombre de bibliographies du corpus qui citent la publication. La figure 1 classe les trente publications incluses les mieux notées ; la figure 2 montre comment elles se citent, la disposition par forces rapprochant les textes qui se citent mutuellement. Les fondateurs vers lesquels convergent les flèches (Commission royale d'enquête sur le bilinguisme et le biculturalisme, 1969 ; Raynauld, Marion et Béland, 1966 ; Vaillancourt, 1980) s'y distinguent des synthèses récentes qui citent sans être encore citées. La grille (CSV et Excel), les bibliographies, les scripts Python (construction de la grille, score, réseau, export Zotero) et le code R des figures sont dans le dépôt GitHub </w:t>
       </w:r>
       <w:r>
         <w:rPr>
@@ -440,7 +333,15 @@
           <w:color w:val="000000"/>
           <w:sz w:val="24"/>
         </w:rPr>
-        <w:t>.</w:t>
+        <w:t>stratification_qc</w:t>
+      </w:r>
+      <w:r>
+        <w:rPr>
+          <w:rFonts w:ascii="Times New Roman" w:hAnsi="Times New Roman" w:eastAsia="Times New Roman" w:cs="Times New Roman"/>
+          <w:color w:val="000000"/>
+          <w:sz w:val="24"/>
+        </w:rPr>
+        <w:t xml:space="preserve"> ; les bibliographies ayant été reconstituées sans accès aux PDF, les récurrences sont des bornes inférieures.</w:t>
       </w:r>
     </w:p>
     <w:p>
@@ -450,7 +351,7 @@
       <w:r>
         <w:drawing>
           <wp:inline xmlns:a="http://schemas.openxmlformats.org/drawingml/2006/main" xmlns:pic="http://schemas.openxmlformats.org/drawingml/2006/picture">
-            <wp:extent cx="5760720" cy="4874455"/>
+            <wp:extent cx="4572000" cy="3526971"/>
             <wp:docPr id="1" name="Picture 1"/>
             <wp:cNvGraphicFramePr>
               <a:graphicFrameLocks noChangeAspect="1"/>
@@ -459,7 +360,7 @@
               <a:graphicData uri="http://schemas.openxmlformats.org/drawingml/2006/picture">
                 <pic:pic>
                   <pic:nvPicPr>
-                    <pic:cNvPr id="0" name="lectures_snowballing_top30.png"/>
+                    <pic:cNvPr id="0" name="lectures_snowballing_top30_court.png"/>
                     <pic:cNvPicPr/>
                   </pic:nvPicPr>
                   <pic:blipFill>
@@ -471,7 +372,7 @@
                   <pic:spPr>
                     <a:xfrm>
                       <a:off x="0" y="0"/>
-                      <a:ext cx="5760720" cy="4874455"/>
+                      <a:ext cx="4572000" cy="3526971"/>
                     </a:xfrm>
                     <a:prstGeom prst="rect"/>
                   </pic:spPr>
@@ -493,49 +394,7 @@
           <w:color w:val="000000"/>
           <w:sz w:val="24"/>
         </w:rPr>
-        <w:t>Figure 1. Liste des trente lectures les plus pertinentes selon l'indice de pertinence (moyenne à poids égaux des citations, de l'année et de la récurrence dans les bibliographies du corpus).</w:t>
-      </w:r>
-    </w:p>
-    <w:p>
-      <w:pPr>
-        <w:spacing w:line="480" w:lineRule="auto"/>
-        <w:jc w:val="both"/>
-      </w:pPr>
-      <w:r>
-        <w:rPr>
-          <w:rFonts w:ascii="Times New Roman" w:hAnsi="Times New Roman" w:eastAsia="Times New Roman" w:cs="Times New Roman"/>
-          <w:color w:val="000000"/>
-          <w:sz w:val="24"/>
-        </w:rPr>
-        <w:t>Les lectures de tête combinent les trois propriétés recherchées : des classiques très cités (Porter, 1965 ; Carliner, 1981 ; Lieberson, 1970), des textes que tout le corpus cite (Commission royale d'enquête sur le bilinguisme et le biculturalisme, 1969 ; Vaillancourt, 1980 ; Boulet, 1980) et des synthèses récentes (Albouy, 2008 ; Vaillancourt et al., 2007 ; Christofides et Swidinsky, 2010).</w:t>
-      </w:r>
-    </w:p>
-    <w:p>
-      <w:pPr>
-        <w:pStyle w:val="Heading2"/>
-      </w:pPr>
-      <w:r>
-        <w:rPr>
-          <w:rFonts w:ascii="Times New Roman" w:hAnsi="Times New Roman" w:eastAsia="Times New Roman" w:cs="Times New Roman"/>
-          <w:b/>
-          <w:color w:val="000000"/>
-          <w:sz w:val="24"/>
-        </w:rPr>
-        <w:t>1.6 Réseau de citations</w:t>
-      </w:r>
-    </w:p>
-    <w:p>
-      <w:pPr>
-        <w:spacing w:line="480" w:lineRule="auto"/>
-        <w:jc w:val="both"/>
-      </w:pPr>
-      <w:r>
-        <w:rPr>
-          <w:rFonts w:ascii="Times New Roman" w:hAnsi="Times New Roman" w:eastAsia="Times New Roman" w:cs="Times New Roman"/>
-          <w:color w:val="000000"/>
-          <w:sz w:val="24"/>
-        </w:rPr>
-        <w:t>Pour visualiser la structure du champ, on construit enfin le réseau de citations entre les trente lectures retenues : chaque publication est un nœud, chaque flèche relie une publication à celles qu'elle cite parmi les trente, la taille du point est proportionnelle au nombre de citations reçues des autres membres du groupe, et la disposition par forces (algorithme de Fruchterman et Reingold) rapproche les publications qui se citent mutuellement. Ce graphique permet de repérer d'un coup d'œil les textes fondateurs vers lesquels convergent les flèches (le Livre III de la Commission royale d'enquête sur le bilinguisme et le biculturalisme, l'étude de Raynauld, Marion et Béland, la thèse de Vaillancourt et le rapport de Boulet), les textes de synthèse qui citent beaucoup sans être encore cités (les rapports récents) et les lignées disciplinaires qui ne se citent guère entre elles (économie du langage et sociologie de la mobilité). La figure 2 présente ce réseau.</w:t>
+        <w:t>Figure 1. Les trente lectures les plus pertinentes (indice = moyenne à poids égaux des citations, de l'année et de la récurrence dans les bibliographies du corpus).</w:t>
       </w:r>
     </w:p>
     <w:p>
@@ -545,7 +404,7 @@
       <w:r>
         <w:drawing>
           <wp:inline xmlns:a="http://schemas.openxmlformats.org/drawingml/2006/main" xmlns:pic="http://schemas.openxmlformats.org/drawingml/2006/picture">
-            <wp:extent cx="5486400" cy="4457700"/>
+            <wp:extent cx="4206240" cy="3417570"/>
             <wp:docPr id="2" name="Picture 2"/>
             <wp:cNvGraphicFramePr>
               <a:graphicFrameLocks noChangeAspect="1"/>
@@ -566,7 +425,7 @@
                   <pic:spPr>
                     <a:xfrm>
                       <a:off x="0" y="0"/>
-                      <a:ext cx="5486400" cy="4457700"/>
+                      <a:ext cx="4206240" cy="3417570"/>
                     </a:xfrm>
                     <a:prstGeom prst="rect"/>
                   </pic:spPr>
@@ -588,12 +447,12 @@
           <w:color w:val="000000"/>
           <w:sz w:val="24"/>
         </w:rPr>
-        <w:t>Figure 2. Réseau de citations entre les trente lectures les plus pertinentes (disposition par forces : les publications qui se citent sont rapprochées ; flèche : « cite » ; taille du point et nombre entre parenthèses : citations reçues des autres lectures du groupe).</w:t>
+        <w:t>Figure 2. Réseau de citations entre les trente lectures (flèche : « cite » ; taille du point : citations reçues des autres lectures ; disposition par forces).</w:t>
       </w:r>
     </w:p>
     <w:p>
       <w:pPr>
-        <w:pStyle w:val="Heading2"/>
+        <w:pStyle w:val="Heading1"/>
       </w:pPr>
       <w:r>
         <w:rPr>
@@ -602,7 +461,7 @@
           <w:color w:val="000000"/>
           <w:sz w:val="24"/>
         </w:rPr>
-        <w:t>1.7 Limites</w:t>
+        <w:t>3. Revue de littérature</w:t>
       </w:r>
     </w:p>
     <w:p>
@@ -616,72 +475,7 @@
           <w:color w:val="000000"/>
           <w:sz w:val="24"/>
         </w:rPr>
-        <w:t xml:space="preserve">Les comptes de citations Google Scholar ont été relevés le 3 septembre 2026 pour </w:t>
-      </w:r>
-      <w:r>
-        <w:rPr>
-          <w:rFonts w:ascii="Times New Roman" w:hAnsi="Times New Roman" w:eastAsia="Times New Roman" w:cs="Times New Roman"/>
-          <w:color w:val="000000"/>
-          <w:sz w:val="24"/>
-        </w:rPr>
-        <w:t>r sum(!is.na(grille$citations_google_scholar))</w:t>
-      </w:r>
-      <w:r>
-        <w:rPr>
-          <w:rFonts w:ascii="Times New Roman" w:hAnsi="Times New Roman" w:eastAsia="Times New Roman" w:cs="Times New Roman"/>
-          <w:color w:val="000000"/>
-          <w:sz w:val="24"/>
-        </w:rPr>
-        <w:t xml:space="preserve"> publications, dont l'essentiel du classement, à l'aide du script </w:t>
-      </w:r>
-      <w:r>
-        <w:rPr>
-          <w:rFonts w:ascii="Times New Roman" w:hAnsi="Times New Roman" w:eastAsia="Times New Roman" w:cs="Times New Roman"/>
-          <w:color w:val="000000"/>
-          <w:sz w:val="24"/>
-        </w:rPr>
-        <w:t>Scripts/recuperer_citations_scholar.py</w:t>
-      </w:r>
-      <w:r>
-        <w:rPr>
-          <w:rFonts w:ascii="Times New Roman" w:hAnsi="Times New Roman" w:eastAsia="Times New Roman" w:cs="Times New Roman"/>
-          <w:color w:val="000000"/>
-          <w:sz w:val="24"/>
-        </w:rPr>
-        <w:t xml:space="preserve"> (bibliothèque </w:t>
-      </w:r>
-      <w:r>
-        <w:rPr>
-          <w:rFonts w:ascii="Times New Roman" w:hAnsi="Times New Roman" w:eastAsia="Times New Roman" w:cs="Times New Roman"/>
-          <w:i/>
-          <w:color w:val="000000"/>
-          <w:sz w:val="24"/>
-        </w:rPr>
-        <w:t>scholarly</w:t>
-      </w:r>
-      <w:r>
-        <w:rPr>
-          <w:rFonts w:ascii="Times New Roman" w:hAnsi="Times New Roman" w:eastAsia="Times New Roman" w:cs="Times New Roman"/>
-          <w:color w:val="000000"/>
-          <w:sz w:val="24"/>
-        </w:rPr>
-        <w:t>). Pour les autres, le compte du moteur Consensus (données Semantic Scholar), systématiquement plus faible, a été ramené à l'échelle de Google Scholar par le ratio médian observé sur les publications qui disposent des deux comptes (</w:t>
-      </w:r>
-      <w:r>
-        <w:rPr>
-          <w:rFonts w:ascii="Times New Roman" w:hAnsi="Times New Roman" w:eastAsia="Times New Roman" w:cs="Times New Roman"/>
-          <w:color w:val="000000"/>
-          <w:sz w:val="24"/>
-        </w:rPr>
-        <w:t>r round(ratio, 2)</w:t>
-      </w:r>
-      <w:r>
-        <w:rPr>
-          <w:rFonts w:ascii="Times New Roman" w:hAnsi="Times New Roman" w:eastAsia="Times New Roman" w:cs="Times New Roman"/>
-          <w:color w:val="000000"/>
-          <w:sz w:val="24"/>
-        </w:rPr>
-        <w:t>) ; les rapports et ouvrages introuvables dans les deux sources se sont vu attribuer la médiane, ce qui est signalé dans la grille. Le rapport de la Commission royale d'enquête sur le bilinguisme et le biculturalisme est dispersé dans Google Scholar en de nombreuses notices, de sorte que son compte est sous-estimé. Les bibliographies ont été reconstituées à partir des références affichées par les moteurs bibliographiques et de la connaissance des textes plutôt qu'à partir des fichiers PDF, de sorte que les comptes de récurrence constituent des bornes inférieures à valider lors de la lecture. Enfin, la méthode par boule de neige tend à surreprésenter les auteurs les plus prolifiques d'un champ, ici l'économie du langage montréalaise, ce que la troisième ronde, ancrée dans la sociologie de la stratification, visait à corriger.</w:t>
+        <w:t>[À rédiger.]</w:t>
       </w:r>
     </w:p>
     <w:p>
@@ -695,3648 +489,7 @@
           <w:color w:val="000000"/>
           <w:sz w:val="24"/>
         </w:rPr>
-        <w:t>2. Les trente lectures retenues</w:t>
-      </w:r>
-    </w:p>
-    <w:p>
-      <w:pPr>
-        <w:spacing w:line="480" w:lineRule="auto"/>
-        <w:jc w:val="both"/>
-      </w:pPr>
-      <w:r>
-        <w:rPr>
-          <w:rFonts w:ascii="Times New Roman" w:hAnsi="Times New Roman" w:eastAsia="Times New Roman" w:cs="Times New Roman"/>
-          <w:color w:val="000000"/>
-          <w:sz w:val="24"/>
-        </w:rPr>
-        <w:t>Le tableau 1 reprend, pour chacune des trente lectures de la figure 1, les trois composantes de l'indice de pertinence.</w:t>
-      </w:r>
-    </w:p>
-    <w:tbl>
-      <w:tblPr>
-        <w:tblStyle w:val="TableGrid"/>
-        <w:tblW w:type="auto" w:w="0"/>
-        <w:tblLook w:firstColumn="1" w:firstRow="1" w:lastColumn="0" w:lastRow="0" w:noHBand="0" w:noVBand="1" w:val="04A0"/>
-      </w:tblPr>
-      <w:tblGrid>
-        <w:gridCol w:w="1568"/>
-        <w:gridCol w:w="1568"/>
-        <w:gridCol w:w="1568"/>
-        <w:gridCol w:w="1568"/>
-        <w:gridCol w:w="1568"/>
-        <w:gridCol w:w="1568"/>
-      </w:tblGrid>
-      <w:tr>
-        <w:tc>
-          <w:tcPr>
-            <w:tcW w:type="dxa" w:w="1568"/>
-          </w:tcPr>
-          <w:p>
-            <w:r/>
-            <w:r>
-              <w:rPr>
-                <w:rFonts w:ascii="Times New Roman" w:hAnsi="Times New Roman" w:eastAsia="Times New Roman" w:cs="Times New Roman"/>
-                <w:b/>
-                <w:color w:val="000000"/>
-                <w:sz w:val="20"/>
-              </w:rPr>
-              <w:t>Rang</w:t>
-            </w:r>
-          </w:p>
-        </w:tc>
-        <w:tc>
-          <w:tcPr>
-            <w:tcW w:type="dxa" w:w="1568"/>
-          </w:tcPr>
-          <w:p>
-            <w:r/>
-            <w:r>
-              <w:rPr>
-                <w:rFonts w:ascii="Times New Roman" w:hAnsi="Times New Roman" w:eastAsia="Times New Roman" w:cs="Times New Roman"/>
-                <w:b/>
-                <w:color w:val="000000"/>
-                <w:sz w:val="20"/>
-              </w:rPr>
-              <w:t>Publication</w:t>
-            </w:r>
-          </w:p>
-        </w:tc>
-        <w:tc>
-          <w:tcPr>
-            <w:tcW w:type="dxa" w:w="1568"/>
-          </w:tcPr>
-          <w:p>
-            <w:r/>
-            <w:r>
-              <w:rPr>
-                <w:rFonts w:ascii="Times New Roman" w:hAnsi="Times New Roman" w:eastAsia="Times New Roman" w:cs="Times New Roman"/>
-                <w:b/>
-                <w:color w:val="000000"/>
-                <w:sz w:val="20"/>
-              </w:rPr>
-              <w:t>Citations</w:t>
-            </w:r>
-          </w:p>
-        </w:tc>
-        <w:tc>
-          <w:tcPr>
-            <w:tcW w:type="dxa" w:w="1568"/>
-          </w:tcPr>
-          <w:p>
-            <w:r/>
-            <w:r>
-              <w:rPr>
-                <w:rFonts w:ascii="Times New Roman" w:hAnsi="Times New Roman" w:eastAsia="Times New Roman" w:cs="Times New Roman"/>
-                <w:b/>
-                <w:color w:val="000000"/>
-                <w:sz w:val="20"/>
-              </w:rPr>
-              <w:t>Source</w:t>
-            </w:r>
-          </w:p>
-        </w:tc>
-        <w:tc>
-          <w:tcPr>
-            <w:tcW w:type="dxa" w:w="1568"/>
-          </w:tcPr>
-          <w:p>
-            <w:r/>
-            <w:r>
-              <w:rPr>
-                <w:rFonts w:ascii="Times New Roman" w:hAnsi="Times New Roman" w:eastAsia="Times New Roman" w:cs="Times New Roman"/>
-                <w:b/>
-                <w:color w:val="000000"/>
-                <w:sz w:val="20"/>
-              </w:rPr>
-              <w:t>Récurrence</w:t>
-            </w:r>
-          </w:p>
-        </w:tc>
-        <w:tc>
-          <w:tcPr>
-            <w:tcW w:type="dxa" w:w="1568"/>
-          </w:tcPr>
-          <w:p>
-            <w:r/>
-            <w:r>
-              <w:rPr>
-                <w:rFonts w:ascii="Times New Roman" w:hAnsi="Times New Roman" w:eastAsia="Times New Roman" w:cs="Times New Roman"/>
-                <w:b/>
-                <w:color w:val="000000"/>
-                <w:sz w:val="20"/>
-              </w:rPr>
-              <w:t>Indice</w:t>
-            </w:r>
-          </w:p>
-        </w:tc>
-      </w:tr>
-      <w:tr>
-        <w:tc>
-          <w:tcPr>
-            <w:tcW w:type="dxa" w:w="1568"/>
-          </w:tcPr>
-          <w:p>
-            <w:pPr>
-              <w:spacing w:line="240" w:lineRule="auto"/>
-            </w:pPr>
-            <w:r/>
-            <w:r>
-              <w:rPr>
-                <w:rFonts w:ascii="Times New Roman" w:hAnsi="Times New Roman" w:eastAsia="Times New Roman" w:cs="Times New Roman"/>
-                <w:color w:val="000000"/>
-                <w:sz w:val="20"/>
-              </w:rPr>
-              <w:t>1</w:t>
-            </w:r>
-          </w:p>
-        </w:tc>
-        <w:tc>
-          <w:tcPr>
-            <w:tcW w:type="dxa" w:w="1568"/>
-          </w:tcPr>
-          <w:p>
-            <w:pPr>
-              <w:spacing w:line="240" w:lineRule="auto"/>
-            </w:pPr>
-            <w:r/>
-            <w:r>
-              <w:rPr>
-                <w:rFonts w:ascii="Times New Roman" w:hAnsi="Times New Roman" w:eastAsia="Times New Roman" w:cs="Times New Roman"/>
-                <w:color w:val="000000"/>
-                <w:sz w:val="20"/>
-              </w:rPr>
-              <w:t>(Porter, 1965)</w:t>
-            </w:r>
-          </w:p>
-        </w:tc>
-        <w:tc>
-          <w:tcPr>
-            <w:tcW w:type="dxa" w:w="1568"/>
-          </w:tcPr>
-          <w:p>
-            <w:pPr>
-              <w:spacing w:line="240" w:lineRule="auto"/>
-            </w:pPr>
-            <w:r/>
-            <w:r>
-              <w:rPr>
-                <w:rFonts w:ascii="Times New Roman" w:hAnsi="Times New Roman" w:eastAsia="Times New Roman" w:cs="Times New Roman"/>
-                <w:color w:val="000000"/>
-                <w:sz w:val="20"/>
-              </w:rPr>
-              <w:t>2670</w:t>
-            </w:r>
-          </w:p>
-        </w:tc>
-        <w:tc>
-          <w:tcPr>
-            <w:tcW w:type="dxa" w:w="1568"/>
-          </w:tcPr>
-          <w:p>
-            <w:pPr>
-              <w:spacing w:line="240" w:lineRule="auto"/>
-            </w:pPr>
-            <w:r/>
-            <w:r>
-              <w:rPr>
-                <w:rFonts w:ascii="Times New Roman" w:hAnsi="Times New Roman" w:eastAsia="Times New Roman" w:cs="Times New Roman"/>
-                <w:color w:val="000000"/>
-                <w:sz w:val="20"/>
-              </w:rPr>
-              <w:t>GS</w:t>
-            </w:r>
-          </w:p>
-        </w:tc>
-        <w:tc>
-          <w:tcPr>
-            <w:tcW w:type="dxa" w:w="1568"/>
-          </w:tcPr>
-          <w:p>
-            <w:pPr>
-              <w:spacing w:line="240" w:lineRule="auto"/>
-            </w:pPr>
-            <w:r/>
-            <w:r>
-              <w:rPr>
-                <w:rFonts w:ascii="Times New Roman" w:hAnsi="Times New Roman" w:eastAsia="Times New Roman" w:cs="Times New Roman"/>
-                <w:color w:val="000000"/>
-                <w:sz w:val="20"/>
-              </w:rPr>
-              <w:t>52</w:t>
-            </w:r>
-          </w:p>
-        </w:tc>
-        <w:tc>
-          <w:tcPr>
-            <w:tcW w:type="dxa" w:w="1568"/>
-          </w:tcPr>
-          <w:p>
-            <w:pPr>
-              <w:spacing w:line="240" w:lineRule="auto"/>
-            </w:pPr>
-            <w:r/>
-            <w:r>
-              <w:rPr>
-                <w:rFonts w:ascii="Times New Roman" w:hAnsi="Times New Roman" w:eastAsia="Times New Roman" w:cs="Times New Roman"/>
-                <w:color w:val="000000"/>
-                <w:sz w:val="20"/>
-              </w:rPr>
-              <w:t>0.64</w:t>
-            </w:r>
-          </w:p>
-        </w:tc>
-      </w:tr>
-      <w:tr>
-        <w:tc>
-          <w:tcPr>
-            <w:tcW w:type="dxa" w:w="1568"/>
-          </w:tcPr>
-          <w:p>
-            <w:pPr>
-              <w:spacing w:line="240" w:lineRule="auto"/>
-            </w:pPr>
-            <w:r/>
-            <w:r>
-              <w:rPr>
-                <w:rFonts w:ascii="Times New Roman" w:hAnsi="Times New Roman" w:eastAsia="Times New Roman" w:cs="Times New Roman"/>
-                <w:color w:val="000000"/>
-                <w:sz w:val="20"/>
-              </w:rPr>
-              <w:t>2</w:t>
-            </w:r>
-          </w:p>
-        </w:tc>
-        <w:tc>
-          <w:tcPr>
-            <w:tcW w:type="dxa" w:w="1568"/>
-          </w:tcPr>
-          <w:p>
-            <w:pPr>
-              <w:spacing w:line="240" w:lineRule="auto"/>
-            </w:pPr>
-            <w:r/>
-            <w:r>
-              <w:rPr>
-                <w:rFonts w:ascii="Times New Roman" w:hAnsi="Times New Roman" w:eastAsia="Times New Roman" w:cs="Times New Roman"/>
-                <w:color w:val="000000"/>
-                <w:sz w:val="20"/>
-              </w:rPr>
-              <w:t>(Vaillancourt, 1996)</w:t>
-            </w:r>
-          </w:p>
-        </w:tc>
-        <w:tc>
-          <w:tcPr>
-            <w:tcW w:type="dxa" w:w="1568"/>
-          </w:tcPr>
-          <w:p>
-            <w:pPr>
-              <w:spacing w:line="240" w:lineRule="auto"/>
-            </w:pPr>
-            <w:r/>
-            <w:r>
-              <w:rPr>
-                <w:rFonts w:ascii="Times New Roman" w:hAnsi="Times New Roman" w:eastAsia="Times New Roman" w:cs="Times New Roman"/>
-                <w:color w:val="000000"/>
-                <w:sz w:val="20"/>
-              </w:rPr>
-              <w:t>145</w:t>
-            </w:r>
-          </w:p>
-        </w:tc>
-        <w:tc>
-          <w:tcPr>
-            <w:tcW w:type="dxa" w:w="1568"/>
-          </w:tcPr>
-          <w:p>
-            <w:pPr>
-              <w:spacing w:line="240" w:lineRule="auto"/>
-            </w:pPr>
-            <w:r/>
-            <w:r>
-              <w:rPr>
-                <w:rFonts w:ascii="Times New Roman" w:hAnsi="Times New Roman" w:eastAsia="Times New Roman" w:cs="Times New Roman"/>
-                <w:color w:val="000000"/>
-                <w:sz w:val="20"/>
-              </w:rPr>
-              <w:t>GS</w:t>
-            </w:r>
-          </w:p>
-        </w:tc>
-        <w:tc>
-          <w:tcPr>
-            <w:tcW w:type="dxa" w:w="1568"/>
-          </w:tcPr>
-          <w:p>
-            <w:pPr>
-              <w:spacing w:line="240" w:lineRule="auto"/>
-            </w:pPr>
-            <w:r/>
-            <w:r>
-              <w:rPr>
-                <w:rFonts w:ascii="Times New Roman" w:hAnsi="Times New Roman" w:eastAsia="Times New Roman" w:cs="Times New Roman"/>
-                <w:color w:val="000000"/>
-                <w:sz w:val="20"/>
-              </w:rPr>
-              <w:t>36</w:t>
-            </w:r>
-          </w:p>
-        </w:tc>
-        <w:tc>
-          <w:tcPr>
-            <w:tcW w:type="dxa" w:w="1568"/>
-          </w:tcPr>
-          <w:p>
-            <w:pPr>
-              <w:spacing w:line="240" w:lineRule="auto"/>
-            </w:pPr>
-            <w:r/>
-            <w:r>
-              <w:rPr>
-                <w:rFonts w:ascii="Times New Roman" w:hAnsi="Times New Roman" w:eastAsia="Times New Roman" w:cs="Times New Roman"/>
-                <w:color w:val="000000"/>
-                <w:sz w:val="20"/>
-              </w:rPr>
-              <w:t>0.57</w:t>
-            </w:r>
-          </w:p>
-        </w:tc>
-      </w:tr>
-      <w:tr>
-        <w:tc>
-          <w:tcPr>
-            <w:tcW w:type="dxa" w:w="1568"/>
-          </w:tcPr>
-          <w:p>
-            <w:pPr>
-              <w:spacing w:line="240" w:lineRule="auto"/>
-            </w:pPr>
-            <w:r/>
-            <w:r>
-              <w:rPr>
-                <w:rFonts w:ascii="Times New Roman" w:hAnsi="Times New Roman" w:eastAsia="Times New Roman" w:cs="Times New Roman"/>
-                <w:color w:val="000000"/>
-                <w:sz w:val="20"/>
-              </w:rPr>
-              <w:t>3</w:t>
-            </w:r>
-          </w:p>
-        </w:tc>
-        <w:tc>
-          <w:tcPr>
-            <w:tcW w:type="dxa" w:w="1568"/>
-          </w:tcPr>
-          <w:p>
-            <w:pPr>
-              <w:spacing w:line="240" w:lineRule="auto"/>
-            </w:pPr>
-            <w:r/>
-            <w:r>
-              <w:rPr>
-                <w:rFonts w:ascii="Times New Roman" w:hAnsi="Times New Roman" w:eastAsia="Times New Roman" w:cs="Times New Roman"/>
-                <w:color w:val="000000"/>
-                <w:sz w:val="20"/>
-              </w:rPr>
-              <w:t>(Commission B-B, 1969)</w:t>
-            </w:r>
-          </w:p>
-        </w:tc>
-        <w:tc>
-          <w:tcPr>
-            <w:tcW w:type="dxa" w:w="1568"/>
-          </w:tcPr>
-          <w:p>
-            <w:pPr>
-              <w:spacing w:line="240" w:lineRule="auto"/>
-            </w:pPr>
-            <w:r/>
-            <w:r>
-              <w:rPr>
-                <w:rFonts w:ascii="Times New Roman" w:hAnsi="Times New Roman" w:eastAsia="Times New Roman" w:cs="Times New Roman"/>
-                <w:color w:val="000000"/>
-                <w:sz w:val="20"/>
-              </w:rPr>
-              <w:t>19</w:t>
-            </w:r>
-          </w:p>
-        </w:tc>
-        <w:tc>
-          <w:tcPr>
-            <w:tcW w:type="dxa" w:w="1568"/>
-          </w:tcPr>
-          <w:p>
-            <w:pPr>
-              <w:spacing w:line="240" w:lineRule="auto"/>
-            </w:pPr>
-            <w:r/>
-            <w:r>
-              <w:rPr>
-                <w:rFonts w:ascii="Times New Roman" w:hAnsi="Times New Roman" w:eastAsia="Times New Roman" w:cs="Times New Roman"/>
-                <w:color w:val="000000"/>
-                <w:sz w:val="20"/>
-              </w:rPr>
-              <w:t>GS</w:t>
-            </w:r>
-          </w:p>
-        </w:tc>
-        <w:tc>
-          <w:tcPr>
-            <w:tcW w:type="dxa" w:w="1568"/>
-          </w:tcPr>
-          <w:p>
-            <w:pPr>
-              <w:spacing w:line="240" w:lineRule="auto"/>
-            </w:pPr>
-            <w:r/>
-            <w:r>
-              <w:rPr>
-                <w:rFonts w:ascii="Times New Roman" w:hAnsi="Times New Roman" w:eastAsia="Times New Roman" w:cs="Times New Roman"/>
-                <w:color w:val="000000"/>
-                <w:sz w:val="20"/>
-              </w:rPr>
-              <w:t>83</w:t>
-            </w:r>
-          </w:p>
-        </w:tc>
-        <w:tc>
-          <w:tcPr>
-            <w:tcW w:type="dxa" w:w="1568"/>
-          </w:tcPr>
-          <w:p>
-            <w:pPr>
-              <w:spacing w:line="240" w:lineRule="auto"/>
-            </w:pPr>
-            <w:r/>
-            <w:r>
-              <w:rPr>
-                <w:rFonts w:ascii="Times New Roman" w:hAnsi="Times New Roman" w:eastAsia="Times New Roman" w:cs="Times New Roman"/>
-                <w:color w:val="000000"/>
-                <w:sz w:val="20"/>
-              </w:rPr>
-              <w:t>0.57</w:t>
-            </w:r>
-          </w:p>
-        </w:tc>
-      </w:tr>
-      <w:tr>
-        <w:tc>
-          <w:tcPr>
-            <w:tcW w:type="dxa" w:w="1568"/>
-          </w:tcPr>
-          <w:p>
-            <w:pPr>
-              <w:spacing w:line="240" w:lineRule="auto"/>
-            </w:pPr>
-            <w:r/>
-            <w:r>
-              <w:rPr>
-                <w:rFonts w:ascii="Times New Roman" w:hAnsi="Times New Roman" w:eastAsia="Times New Roman" w:cs="Times New Roman"/>
-                <w:color w:val="000000"/>
-                <w:sz w:val="20"/>
-              </w:rPr>
-              <w:t>4</w:t>
-            </w:r>
-          </w:p>
-        </w:tc>
-        <w:tc>
-          <w:tcPr>
-            <w:tcW w:type="dxa" w:w="1568"/>
-          </w:tcPr>
-          <w:p>
-            <w:pPr>
-              <w:spacing w:line="240" w:lineRule="auto"/>
-            </w:pPr>
-            <w:r/>
-            <w:r>
-              <w:rPr>
-                <w:rFonts w:ascii="Times New Roman" w:hAnsi="Times New Roman" w:eastAsia="Times New Roman" w:cs="Times New Roman"/>
-                <w:color w:val="000000"/>
-                <w:sz w:val="20"/>
-              </w:rPr>
-              <w:t>(Levine, 1990)</w:t>
-            </w:r>
-          </w:p>
-        </w:tc>
-        <w:tc>
-          <w:tcPr>
-            <w:tcW w:type="dxa" w:w="1568"/>
-          </w:tcPr>
-          <w:p>
-            <w:pPr>
-              <w:spacing w:line="240" w:lineRule="auto"/>
-            </w:pPr>
-            <w:r/>
-            <w:r>
-              <w:rPr>
-                <w:rFonts w:ascii="Times New Roman" w:hAnsi="Times New Roman" w:eastAsia="Times New Roman" w:cs="Times New Roman"/>
-                <w:color w:val="000000"/>
-                <w:sz w:val="20"/>
-              </w:rPr>
-              <w:t>437</w:t>
-            </w:r>
-          </w:p>
-        </w:tc>
-        <w:tc>
-          <w:tcPr>
-            <w:tcW w:type="dxa" w:w="1568"/>
-          </w:tcPr>
-          <w:p>
-            <w:pPr>
-              <w:spacing w:line="240" w:lineRule="auto"/>
-            </w:pPr>
-            <w:r/>
-            <w:r>
-              <w:rPr>
-                <w:rFonts w:ascii="Times New Roman" w:hAnsi="Times New Roman" w:eastAsia="Times New Roman" w:cs="Times New Roman"/>
-                <w:color w:val="000000"/>
-                <w:sz w:val="20"/>
-              </w:rPr>
-              <w:t>GS</w:t>
-            </w:r>
-          </w:p>
-        </w:tc>
-        <w:tc>
-          <w:tcPr>
-            <w:tcW w:type="dxa" w:w="1568"/>
-          </w:tcPr>
-          <w:p>
-            <w:pPr>
-              <w:spacing w:line="240" w:lineRule="auto"/>
-            </w:pPr>
-            <w:r/>
-            <w:r>
-              <w:rPr>
-                <w:rFonts w:ascii="Times New Roman" w:hAnsi="Times New Roman" w:eastAsia="Times New Roman" w:cs="Times New Roman"/>
-                <w:color w:val="000000"/>
-                <w:sz w:val="20"/>
-              </w:rPr>
-              <w:t>28</w:t>
-            </w:r>
-          </w:p>
-        </w:tc>
-        <w:tc>
-          <w:tcPr>
-            <w:tcW w:type="dxa" w:w="1568"/>
-          </w:tcPr>
-          <w:p>
-            <w:pPr>
-              <w:spacing w:line="240" w:lineRule="auto"/>
-            </w:pPr>
-            <w:r/>
-            <w:r>
-              <w:rPr>
-                <w:rFonts w:ascii="Times New Roman" w:hAnsi="Times New Roman" w:eastAsia="Times New Roman" w:cs="Times New Roman"/>
-                <w:color w:val="000000"/>
-                <w:sz w:val="20"/>
-              </w:rPr>
-              <w:t>0.56</w:t>
-            </w:r>
-          </w:p>
-        </w:tc>
-      </w:tr>
-      <w:tr>
-        <w:tc>
-          <w:tcPr>
-            <w:tcW w:type="dxa" w:w="1568"/>
-          </w:tcPr>
-          <w:p>
-            <w:pPr>
-              <w:spacing w:line="240" w:lineRule="auto"/>
-            </w:pPr>
-            <w:r/>
-            <w:r>
-              <w:rPr>
-                <w:rFonts w:ascii="Times New Roman" w:hAnsi="Times New Roman" w:eastAsia="Times New Roman" w:cs="Times New Roman"/>
-                <w:color w:val="000000"/>
-                <w:sz w:val="20"/>
-              </w:rPr>
-              <w:t>5</w:t>
-            </w:r>
-          </w:p>
-        </w:tc>
-        <w:tc>
-          <w:tcPr>
-            <w:tcW w:type="dxa" w:w="1568"/>
-          </w:tcPr>
-          <w:p>
-            <w:pPr>
-              <w:spacing w:line="240" w:lineRule="auto"/>
-            </w:pPr>
-            <w:r/>
-            <w:r>
-              <w:rPr>
-                <w:rFonts w:ascii="Times New Roman" w:hAnsi="Times New Roman" w:eastAsia="Times New Roman" w:cs="Times New Roman"/>
-                <w:color w:val="000000"/>
-                <w:sz w:val="20"/>
-              </w:rPr>
-              <w:t>(Vaillancourt et al., 2007)</w:t>
-            </w:r>
-          </w:p>
-        </w:tc>
-        <w:tc>
-          <w:tcPr>
-            <w:tcW w:type="dxa" w:w="1568"/>
-          </w:tcPr>
-          <w:p>
-            <w:pPr>
-              <w:spacing w:line="240" w:lineRule="auto"/>
-            </w:pPr>
-            <w:r/>
-            <w:r>
-              <w:rPr>
-                <w:rFonts w:ascii="Times New Roman" w:hAnsi="Times New Roman" w:eastAsia="Times New Roman" w:cs="Times New Roman"/>
-                <w:color w:val="000000"/>
-                <w:sz w:val="20"/>
-              </w:rPr>
-              <w:t>91</w:t>
-            </w:r>
-          </w:p>
-        </w:tc>
-        <w:tc>
-          <w:tcPr>
-            <w:tcW w:type="dxa" w:w="1568"/>
-          </w:tcPr>
-          <w:p>
-            <w:pPr>
-              <w:spacing w:line="240" w:lineRule="auto"/>
-            </w:pPr>
-            <w:r/>
-            <w:r>
-              <w:rPr>
-                <w:rFonts w:ascii="Times New Roman" w:hAnsi="Times New Roman" w:eastAsia="Times New Roman" w:cs="Times New Roman"/>
-                <w:color w:val="000000"/>
-                <w:sz w:val="20"/>
-              </w:rPr>
-              <w:t>GS</w:t>
-            </w:r>
-          </w:p>
-        </w:tc>
-        <w:tc>
-          <w:tcPr>
-            <w:tcW w:type="dxa" w:w="1568"/>
-          </w:tcPr>
-          <w:p>
-            <w:pPr>
-              <w:spacing w:line="240" w:lineRule="auto"/>
-            </w:pPr>
-            <w:r/>
-            <w:r>
-              <w:rPr>
-                <w:rFonts w:ascii="Times New Roman" w:hAnsi="Times New Roman" w:eastAsia="Times New Roman" w:cs="Times New Roman"/>
-                <w:color w:val="000000"/>
-                <w:sz w:val="20"/>
-              </w:rPr>
-              <w:t>27</w:t>
-            </w:r>
-          </w:p>
-        </w:tc>
-        <w:tc>
-          <w:tcPr>
-            <w:tcW w:type="dxa" w:w="1568"/>
-          </w:tcPr>
-          <w:p>
-            <w:pPr>
-              <w:spacing w:line="240" w:lineRule="auto"/>
-            </w:pPr>
-            <w:r/>
-            <w:r>
-              <w:rPr>
-                <w:rFonts w:ascii="Times New Roman" w:hAnsi="Times New Roman" w:eastAsia="Times New Roman" w:cs="Times New Roman"/>
-                <w:color w:val="000000"/>
-                <w:sz w:val="20"/>
-              </w:rPr>
-              <w:t>0.56</w:t>
-            </w:r>
-          </w:p>
-        </w:tc>
-      </w:tr>
-      <w:tr>
-        <w:tc>
-          <w:tcPr>
-            <w:tcW w:type="dxa" w:w="1568"/>
-          </w:tcPr>
-          <w:p>
-            <w:pPr>
-              <w:spacing w:line="240" w:lineRule="auto"/>
-            </w:pPr>
-            <w:r/>
-            <w:r>
-              <w:rPr>
-                <w:rFonts w:ascii="Times New Roman" w:hAnsi="Times New Roman" w:eastAsia="Times New Roman" w:cs="Times New Roman"/>
-                <w:color w:val="000000"/>
-                <w:sz w:val="20"/>
-              </w:rPr>
-              <w:t>6</w:t>
-            </w:r>
-          </w:p>
-        </w:tc>
-        <w:tc>
-          <w:tcPr>
-            <w:tcW w:type="dxa" w:w="1568"/>
-          </w:tcPr>
-          <w:p>
-            <w:pPr>
-              <w:spacing w:line="240" w:lineRule="auto"/>
-            </w:pPr>
-            <w:r/>
-            <w:r>
-              <w:rPr>
-                <w:rFonts w:ascii="Times New Roman" w:hAnsi="Times New Roman" w:eastAsia="Times New Roman" w:cs="Times New Roman"/>
-                <w:color w:val="000000"/>
-                <w:sz w:val="20"/>
-              </w:rPr>
-              <w:t>(Lieberson, 1970)</w:t>
-            </w:r>
-          </w:p>
-        </w:tc>
-        <w:tc>
-          <w:tcPr>
-            <w:tcW w:type="dxa" w:w="1568"/>
-          </w:tcPr>
-          <w:p>
-            <w:pPr>
-              <w:spacing w:line="240" w:lineRule="auto"/>
-            </w:pPr>
-            <w:r/>
-            <w:r>
-              <w:rPr>
-                <w:rFonts w:ascii="Times New Roman" w:hAnsi="Times New Roman" w:eastAsia="Times New Roman" w:cs="Times New Roman"/>
-                <w:color w:val="000000"/>
-                <w:sz w:val="20"/>
-              </w:rPr>
-              <w:t>361</w:t>
-            </w:r>
-          </w:p>
-        </w:tc>
-        <w:tc>
-          <w:tcPr>
-            <w:tcW w:type="dxa" w:w="1568"/>
-          </w:tcPr>
-          <w:p>
-            <w:pPr>
-              <w:spacing w:line="240" w:lineRule="auto"/>
-            </w:pPr>
-            <w:r/>
-            <w:r>
-              <w:rPr>
-                <w:rFonts w:ascii="Times New Roman" w:hAnsi="Times New Roman" w:eastAsia="Times New Roman" w:cs="Times New Roman"/>
-                <w:color w:val="000000"/>
-                <w:sz w:val="20"/>
-              </w:rPr>
-              <w:t>GS</w:t>
-            </w:r>
-          </w:p>
-        </w:tc>
-        <w:tc>
-          <w:tcPr>
-            <w:tcW w:type="dxa" w:w="1568"/>
-          </w:tcPr>
-          <w:p>
-            <w:pPr>
-              <w:spacing w:line="240" w:lineRule="auto"/>
-            </w:pPr>
-            <w:r/>
-            <w:r>
-              <w:rPr>
-                <w:rFonts w:ascii="Times New Roman" w:hAnsi="Times New Roman" w:eastAsia="Times New Roman" w:cs="Times New Roman"/>
-                <w:color w:val="000000"/>
-                <w:sz w:val="20"/>
-              </w:rPr>
-              <w:t>49</w:t>
-            </w:r>
-          </w:p>
-        </w:tc>
-        <w:tc>
-          <w:tcPr>
-            <w:tcW w:type="dxa" w:w="1568"/>
-          </w:tcPr>
-          <w:p>
-            <w:pPr>
-              <w:spacing w:line="240" w:lineRule="auto"/>
-            </w:pPr>
-            <w:r/>
-            <w:r>
-              <w:rPr>
-                <w:rFonts w:ascii="Times New Roman" w:hAnsi="Times New Roman" w:eastAsia="Times New Roman" w:cs="Times New Roman"/>
-                <w:color w:val="000000"/>
-                <w:sz w:val="20"/>
-              </w:rPr>
-              <w:t>0.56</w:t>
-            </w:r>
-          </w:p>
-        </w:tc>
-      </w:tr>
-      <w:tr>
-        <w:tc>
-          <w:tcPr>
-            <w:tcW w:type="dxa" w:w="1568"/>
-          </w:tcPr>
-          <w:p>
-            <w:pPr>
-              <w:spacing w:line="240" w:lineRule="auto"/>
-            </w:pPr>
-            <w:r/>
-            <w:r>
-              <w:rPr>
-                <w:rFonts w:ascii="Times New Roman" w:hAnsi="Times New Roman" w:eastAsia="Times New Roman" w:cs="Times New Roman"/>
-                <w:color w:val="000000"/>
-                <w:sz w:val="20"/>
-              </w:rPr>
-              <w:t>7</w:t>
-            </w:r>
-          </w:p>
-        </w:tc>
-        <w:tc>
-          <w:tcPr>
-            <w:tcW w:type="dxa" w:w="1568"/>
-          </w:tcPr>
-          <w:p>
-            <w:pPr>
-              <w:spacing w:line="240" w:lineRule="auto"/>
-            </w:pPr>
-            <w:r/>
-            <w:r>
-              <w:rPr>
-                <w:rFonts w:ascii="Times New Roman" w:hAnsi="Times New Roman" w:eastAsia="Times New Roman" w:cs="Times New Roman"/>
-                <w:color w:val="000000"/>
-                <w:sz w:val="20"/>
-              </w:rPr>
-              <w:t>(Albouy, 2008)</w:t>
-            </w:r>
-          </w:p>
-        </w:tc>
-        <w:tc>
-          <w:tcPr>
-            <w:tcW w:type="dxa" w:w="1568"/>
-          </w:tcPr>
-          <w:p>
-            <w:pPr>
-              <w:spacing w:line="240" w:lineRule="auto"/>
-            </w:pPr>
-            <w:r/>
-            <w:r>
-              <w:rPr>
-                <w:rFonts w:ascii="Times New Roman" w:hAnsi="Times New Roman" w:eastAsia="Times New Roman" w:cs="Times New Roman"/>
-                <w:color w:val="000000"/>
-                <w:sz w:val="20"/>
-              </w:rPr>
-              <w:t>101</w:t>
-            </w:r>
-          </w:p>
-        </w:tc>
-        <w:tc>
-          <w:tcPr>
-            <w:tcW w:type="dxa" w:w="1568"/>
-          </w:tcPr>
-          <w:p>
-            <w:pPr>
-              <w:spacing w:line="240" w:lineRule="auto"/>
-            </w:pPr>
-            <w:r/>
-            <w:r>
-              <w:rPr>
-                <w:rFonts w:ascii="Times New Roman" w:hAnsi="Times New Roman" w:eastAsia="Times New Roman" w:cs="Times New Roman"/>
-                <w:color w:val="000000"/>
-                <w:sz w:val="20"/>
-              </w:rPr>
-              <w:t>GS</w:t>
-            </w:r>
-          </w:p>
-        </w:tc>
-        <w:tc>
-          <w:tcPr>
-            <w:tcW w:type="dxa" w:w="1568"/>
-          </w:tcPr>
-          <w:p>
-            <w:pPr>
-              <w:spacing w:line="240" w:lineRule="auto"/>
-            </w:pPr>
-            <w:r/>
-            <w:r>
-              <w:rPr>
-                <w:rFonts w:ascii="Times New Roman" w:hAnsi="Times New Roman" w:eastAsia="Times New Roman" w:cs="Times New Roman"/>
-                <w:color w:val="000000"/>
-                <w:sz w:val="20"/>
-              </w:rPr>
-              <w:t>23</w:t>
-            </w:r>
-          </w:p>
-        </w:tc>
-        <w:tc>
-          <w:tcPr>
-            <w:tcW w:type="dxa" w:w="1568"/>
-          </w:tcPr>
-          <w:p>
-            <w:pPr>
-              <w:spacing w:line="240" w:lineRule="auto"/>
-            </w:pPr>
-            <w:r/>
-            <w:r>
-              <w:rPr>
-                <w:rFonts w:ascii="Times New Roman" w:hAnsi="Times New Roman" w:eastAsia="Times New Roman" w:cs="Times New Roman"/>
-                <w:color w:val="000000"/>
-                <w:sz w:val="20"/>
-              </w:rPr>
-              <w:t>0.55</w:t>
-            </w:r>
-          </w:p>
-        </w:tc>
-      </w:tr>
-      <w:tr>
-        <w:tc>
-          <w:tcPr>
-            <w:tcW w:type="dxa" w:w="1568"/>
-          </w:tcPr>
-          <w:p>
-            <w:pPr>
-              <w:spacing w:line="240" w:lineRule="auto"/>
-            </w:pPr>
-            <w:r/>
-            <w:r>
-              <w:rPr>
-                <w:rFonts w:ascii="Times New Roman" w:hAnsi="Times New Roman" w:eastAsia="Times New Roman" w:cs="Times New Roman"/>
-                <w:color w:val="000000"/>
-                <w:sz w:val="20"/>
-              </w:rPr>
-              <w:t>8</w:t>
-            </w:r>
-          </w:p>
-        </w:tc>
-        <w:tc>
-          <w:tcPr>
-            <w:tcW w:type="dxa" w:w="1568"/>
-          </w:tcPr>
-          <w:p>
-            <w:pPr>
-              <w:spacing w:line="240" w:lineRule="auto"/>
-            </w:pPr>
-            <w:r/>
-            <w:r>
-              <w:rPr>
-                <w:rFonts w:ascii="Times New Roman" w:hAnsi="Times New Roman" w:eastAsia="Times New Roman" w:cs="Times New Roman"/>
-                <w:color w:val="000000"/>
-                <w:sz w:val="20"/>
-              </w:rPr>
-              <w:t>(Carliner, 1981)</w:t>
-            </w:r>
-          </w:p>
-        </w:tc>
-        <w:tc>
-          <w:tcPr>
-            <w:tcW w:type="dxa" w:w="1568"/>
-          </w:tcPr>
-          <w:p>
-            <w:pPr>
-              <w:spacing w:line="240" w:lineRule="auto"/>
-            </w:pPr>
-            <w:r/>
-            <w:r>
-              <w:rPr>
-                <w:rFonts w:ascii="Times New Roman" w:hAnsi="Times New Roman" w:eastAsia="Times New Roman" w:cs="Times New Roman"/>
-                <w:color w:val="000000"/>
-                <w:sz w:val="20"/>
-              </w:rPr>
-              <w:t>253</w:t>
-            </w:r>
-          </w:p>
-        </w:tc>
-        <w:tc>
-          <w:tcPr>
-            <w:tcW w:type="dxa" w:w="1568"/>
-          </w:tcPr>
-          <w:p>
-            <w:pPr>
-              <w:spacing w:line="240" w:lineRule="auto"/>
-            </w:pPr>
-            <w:r/>
-            <w:r>
-              <w:rPr>
-                <w:rFonts w:ascii="Times New Roman" w:hAnsi="Times New Roman" w:eastAsia="Times New Roman" w:cs="Times New Roman"/>
-                <w:color w:val="000000"/>
-                <w:sz w:val="20"/>
-              </w:rPr>
-              <w:t>GS</w:t>
-            </w:r>
-          </w:p>
-        </w:tc>
-        <w:tc>
-          <w:tcPr>
-            <w:tcW w:type="dxa" w:w="1568"/>
-          </w:tcPr>
-          <w:p>
-            <w:pPr>
-              <w:spacing w:line="240" w:lineRule="auto"/>
-            </w:pPr>
-            <w:r/>
-            <w:r>
-              <w:rPr>
-                <w:rFonts w:ascii="Times New Roman" w:hAnsi="Times New Roman" w:eastAsia="Times New Roman" w:cs="Times New Roman"/>
-                <w:color w:val="000000"/>
-                <w:sz w:val="20"/>
-              </w:rPr>
-              <w:t>39</w:t>
-            </w:r>
-          </w:p>
-        </w:tc>
-        <w:tc>
-          <w:tcPr>
-            <w:tcW w:type="dxa" w:w="1568"/>
-          </w:tcPr>
-          <w:p>
-            <w:pPr>
-              <w:spacing w:line="240" w:lineRule="auto"/>
-            </w:pPr>
-            <w:r/>
-            <w:r>
-              <w:rPr>
-                <w:rFonts w:ascii="Times New Roman" w:hAnsi="Times New Roman" w:eastAsia="Times New Roman" w:cs="Times New Roman"/>
-                <w:color w:val="000000"/>
-                <w:sz w:val="20"/>
-              </w:rPr>
-              <w:t>0.55</w:t>
-            </w:r>
-          </w:p>
-        </w:tc>
-      </w:tr>
-      <w:tr>
-        <w:tc>
-          <w:tcPr>
-            <w:tcW w:type="dxa" w:w="1568"/>
-          </w:tcPr>
-          <w:p>
-            <w:pPr>
-              <w:spacing w:line="240" w:lineRule="auto"/>
-            </w:pPr>
-            <w:r/>
-            <w:r>
-              <w:rPr>
-                <w:rFonts w:ascii="Times New Roman" w:hAnsi="Times New Roman" w:eastAsia="Times New Roman" w:cs="Times New Roman"/>
-                <w:color w:val="000000"/>
-                <w:sz w:val="20"/>
-              </w:rPr>
-              <w:t>9</w:t>
-            </w:r>
-          </w:p>
-        </w:tc>
-        <w:tc>
-          <w:tcPr>
-            <w:tcW w:type="dxa" w:w="1568"/>
-          </w:tcPr>
-          <w:p>
-            <w:pPr>
-              <w:spacing w:line="240" w:lineRule="auto"/>
-            </w:pPr>
-            <w:r/>
-            <w:r>
-              <w:rPr>
-                <w:rFonts w:ascii="Times New Roman" w:hAnsi="Times New Roman" w:eastAsia="Times New Roman" w:cs="Times New Roman"/>
-                <w:color w:val="000000"/>
-                <w:sz w:val="20"/>
-              </w:rPr>
-              <w:t>(Shapiro et Stelcner, 1997)</w:t>
-            </w:r>
-          </w:p>
-        </w:tc>
-        <w:tc>
-          <w:tcPr>
-            <w:tcW w:type="dxa" w:w="1568"/>
-          </w:tcPr>
-          <w:p>
-            <w:pPr>
-              <w:spacing w:line="240" w:lineRule="auto"/>
-            </w:pPr>
-            <w:r/>
-            <w:r>
-              <w:rPr>
-                <w:rFonts w:ascii="Times New Roman" w:hAnsi="Times New Roman" w:eastAsia="Times New Roman" w:cs="Times New Roman"/>
-                <w:color w:val="000000"/>
-                <w:sz w:val="20"/>
-              </w:rPr>
-              <w:t>121</w:t>
-            </w:r>
-          </w:p>
-        </w:tc>
-        <w:tc>
-          <w:tcPr>
-            <w:tcW w:type="dxa" w:w="1568"/>
-          </w:tcPr>
-          <w:p>
-            <w:pPr>
-              <w:spacing w:line="240" w:lineRule="auto"/>
-            </w:pPr>
-            <w:r/>
-            <w:r>
-              <w:rPr>
-                <w:rFonts w:ascii="Times New Roman" w:hAnsi="Times New Roman" w:eastAsia="Times New Roman" w:cs="Times New Roman"/>
-                <w:color w:val="000000"/>
-                <w:sz w:val="20"/>
-              </w:rPr>
-              <w:t>GS</w:t>
-            </w:r>
-          </w:p>
-        </w:tc>
-        <w:tc>
-          <w:tcPr>
-            <w:tcW w:type="dxa" w:w="1568"/>
-          </w:tcPr>
-          <w:p>
-            <w:pPr>
-              <w:spacing w:line="240" w:lineRule="auto"/>
-            </w:pPr>
-            <w:r/>
-            <w:r>
-              <w:rPr>
-                <w:rFonts w:ascii="Times New Roman" w:hAnsi="Times New Roman" w:eastAsia="Times New Roman" w:cs="Times New Roman"/>
-                <w:color w:val="000000"/>
-                <w:sz w:val="20"/>
-              </w:rPr>
-              <w:t>29</w:t>
-            </w:r>
-          </w:p>
-        </w:tc>
-        <w:tc>
-          <w:tcPr>
-            <w:tcW w:type="dxa" w:w="1568"/>
-          </w:tcPr>
-          <w:p>
-            <w:pPr>
-              <w:spacing w:line="240" w:lineRule="auto"/>
-            </w:pPr>
-            <w:r/>
-            <w:r>
-              <w:rPr>
-                <w:rFonts w:ascii="Times New Roman" w:hAnsi="Times New Roman" w:eastAsia="Times New Roman" w:cs="Times New Roman"/>
-                <w:color w:val="000000"/>
-                <w:sz w:val="20"/>
-              </w:rPr>
-              <w:t>0.54</w:t>
-            </w:r>
-          </w:p>
-        </w:tc>
-      </w:tr>
-      <w:tr>
-        <w:tc>
-          <w:tcPr>
-            <w:tcW w:type="dxa" w:w="1568"/>
-          </w:tcPr>
-          <w:p>
-            <w:pPr>
-              <w:spacing w:line="240" w:lineRule="auto"/>
-            </w:pPr>
-            <w:r/>
-            <w:r>
-              <w:rPr>
-                <w:rFonts w:ascii="Times New Roman" w:hAnsi="Times New Roman" w:eastAsia="Times New Roman" w:cs="Times New Roman"/>
-                <w:color w:val="000000"/>
-                <w:sz w:val="20"/>
-              </w:rPr>
-              <w:t>10</w:t>
-            </w:r>
-          </w:p>
-        </w:tc>
-        <w:tc>
-          <w:tcPr>
-            <w:tcW w:type="dxa" w:w="1568"/>
-          </w:tcPr>
-          <w:p>
-            <w:pPr>
-              <w:spacing w:line="240" w:lineRule="auto"/>
-            </w:pPr>
-            <w:r/>
-            <w:r>
-              <w:rPr>
-                <w:rFonts w:ascii="Times New Roman" w:hAnsi="Times New Roman" w:eastAsia="Times New Roman" w:cs="Times New Roman"/>
-                <w:color w:val="000000"/>
-                <w:sz w:val="20"/>
-              </w:rPr>
-              <w:t>(Vaillancourt, 1980)</w:t>
-            </w:r>
-          </w:p>
-        </w:tc>
-        <w:tc>
-          <w:tcPr>
-            <w:tcW w:type="dxa" w:w="1568"/>
-          </w:tcPr>
-          <w:p>
-            <w:pPr>
-              <w:spacing w:line="240" w:lineRule="auto"/>
-            </w:pPr>
-            <w:r/>
-            <w:r>
-              <w:rPr>
-                <w:rFonts w:ascii="Times New Roman" w:hAnsi="Times New Roman" w:eastAsia="Times New Roman" w:cs="Times New Roman"/>
-                <w:color w:val="000000"/>
-                <w:sz w:val="20"/>
-              </w:rPr>
-              <w:t>70</w:t>
-            </w:r>
-          </w:p>
-        </w:tc>
-        <w:tc>
-          <w:tcPr>
-            <w:tcW w:type="dxa" w:w="1568"/>
-          </w:tcPr>
-          <w:p>
-            <w:pPr>
-              <w:spacing w:line="240" w:lineRule="auto"/>
-            </w:pPr>
-            <w:r/>
-            <w:r>
-              <w:rPr>
-                <w:rFonts w:ascii="Times New Roman" w:hAnsi="Times New Roman" w:eastAsia="Times New Roman" w:cs="Times New Roman"/>
-                <w:color w:val="000000"/>
-                <w:sz w:val="20"/>
-              </w:rPr>
-              <w:t>GS</w:t>
-            </w:r>
-          </w:p>
-        </w:tc>
-        <w:tc>
-          <w:tcPr>
-            <w:tcW w:type="dxa" w:w="1568"/>
-          </w:tcPr>
-          <w:p>
-            <w:pPr>
-              <w:spacing w:line="240" w:lineRule="auto"/>
-            </w:pPr>
-            <w:r/>
-            <w:r>
-              <w:rPr>
-                <w:rFonts w:ascii="Times New Roman" w:hAnsi="Times New Roman" w:eastAsia="Times New Roman" w:cs="Times New Roman"/>
-                <w:color w:val="000000"/>
-                <w:sz w:val="20"/>
-              </w:rPr>
-              <w:t>48</w:t>
-            </w:r>
-          </w:p>
-        </w:tc>
-        <w:tc>
-          <w:tcPr>
-            <w:tcW w:type="dxa" w:w="1568"/>
-          </w:tcPr>
-          <w:p>
-            <w:pPr>
-              <w:spacing w:line="240" w:lineRule="auto"/>
-            </w:pPr>
-            <w:r/>
-            <w:r>
-              <w:rPr>
-                <w:rFonts w:ascii="Times New Roman" w:hAnsi="Times New Roman" w:eastAsia="Times New Roman" w:cs="Times New Roman"/>
-                <w:color w:val="000000"/>
-                <w:sz w:val="20"/>
-              </w:rPr>
-              <w:t>0.53</w:t>
-            </w:r>
-          </w:p>
-        </w:tc>
-      </w:tr>
-      <w:tr>
-        <w:tc>
-          <w:tcPr>
-            <w:tcW w:type="dxa" w:w="1568"/>
-          </w:tcPr>
-          <w:p>
-            <w:pPr>
-              <w:spacing w:line="240" w:lineRule="auto"/>
-            </w:pPr>
-            <w:r/>
-            <w:r>
-              <w:rPr>
-                <w:rFonts w:ascii="Times New Roman" w:hAnsi="Times New Roman" w:eastAsia="Times New Roman" w:cs="Times New Roman"/>
-                <w:color w:val="000000"/>
-                <w:sz w:val="20"/>
-              </w:rPr>
-              <w:t>11</w:t>
-            </w:r>
-          </w:p>
-        </w:tc>
-        <w:tc>
-          <w:tcPr>
-            <w:tcW w:type="dxa" w:w="1568"/>
-          </w:tcPr>
-          <w:p>
-            <w:pPr>
-              <w:spacing w:line="240" w:lineRule="auto"/>
-            </w:pPr>
-            <w:r/>
-            <w:r>
-              <w:rPr>
-                <w:rFonts w:ascii="Times New Roman" w:hAnsi="Times New Roman" w:eastAsia="Times New Roman" w:cs="Times New Roman"/>
-                <w:color w:val="000000"/>
-                <w:sz w:val="20"/>
-              </w:rPr>
-              <w:t>(Christofides et Swidinsky, 2010)</w:t>
-            </w:r>
-          </w:p>
-        </w:tc>
-        <w:tc>
-          <w:tcPr>
-            <w:tcW w:type="dxa" w:w="1568"/>
-          </w:tcPr>
-          <w:p>
-            <w:pPr>
-              <w:spacing w:line="240" w:lineRule="auto"/>
-            </w:pPr>
-            <w:r/>
-            <w:r>
-              <w:rPr>
-                <w:rFonts w:ascii="Times New Roman" w:hAnsi="Times New Roman" w:eastAsia="Times New Roman" w:cs="Times New Roman"/>
-                <w:color w:val="000000"/>
-                <w:sz w:val="20"/>
-              </w:rPr>
-              <w:t>91</w:t>
-            </w:r>
-          </w:p>
-        </w:tc>
-        <w:tc>
-          <w:tcPr>
-            <w:tcW w:type="dxa" w:w="1568"/>
-          </w:tcPr>
-          <w:p>
-            <w:pPr>
-              <w:spacing w:line="240" w:lineRule="auto"/>
-            </w:pPr>
-            <w:r/>
-            <w:r>
-              <w:rPr>
-                <w:rFonts w:ascii="Times New Roman" w:hAnsi="Times New Roman" w:eastAsia="Times New Roman" w:cs="Times New Roman"/>
-                <w:color w:val="000000"/>
-                <w:sz w:val="20"/>
-              </w:rPr>
-              <w:t>GS</w:t>
-            </w:r>
-          </w:p>
-        </w:tc>
-        <w:tc>
-          <w:tcPr>
-            <w:tcW w:type="dxa" w:w="1568"/>
-          </w:tcPr>
-          <w:p>
-            <w:pPr>
-              <w:spacing w:line="240" w:lineRule="auto"/>
-            </w:pPr>
-            <w:r/>
-            <w:r>
-              <w:rPr>
-                <w:rFonts w:ascii="Times New Roman" w:hAnsi="Times New Roman" w:eastAsia="Times New Roman" w:cs="Times New Roman"/>
-                <w:color w:val="000000"/>
-                <w:sz w:val="20"/>
-              </w:rPr>
-              <w:t>15</w:t>
-            </w:r>
-          </w:p>
-        </w:tc>
-        <w:tc>
-          <w:tcPr>
-            <w:tcW w:type="dxa" w:w="1568"/>
-          </w:tcPr>
-          <w:p>
-            <w:pPr>
-              <w:spacing w:line="240" w:lineRule="auto"/>
-            </w:pPr>
-            <w:r/>
-            <w:r>
-              <w:rPr>
-                <w:rFonts w:ascii="Times New Roman" w:hAnsi="Times New Roman" w:eastAsia="Times New Roman" w:cs="Times New Roman"/>
-                <w:color w:val="000000"/>
-                <w:sz w:val="20"/>
-              </w:rPr>
-              <w:t>0.52</w:t>
-            </w:r>
-          </w:p>
-        </w:tc>
-      </w:tr>
-      <w:tr>
-        <w:tc>
-          <w:tcPr>
-            <w:tcW w:type="dxa" w:w="1568"/>
-          </w:tcPr>
-          <w:p>
-            <w:pPr>
-              <w:spacing w:line="240" w:lineRule="auto"/>
-            </w:pPr>
-            <w:r/>
-            <w:r>
-              <w:rPr>
-                <w:rFonts w:ascii="Times New Roman" w:hAnsi="Times New Roman" w:eastAsia="Times New Roman" w:cs="Times New Roman"/>
-                <w:color w:val="000000"/>
-                <w:sz w:val="20"/>
-              </w:rPr>
-              <w:t>12</w:t>
-            </w:r>
-          </w:p>
-        </w:tc>
-        <w:tc>
-          <w:tcPr>
-            <w:tcW w:type="dxa" w:w="1568"/>
-          </w:tcPr>
-          <w:p>
-            <w:pPr>
-              <w:spacing w:line="240" w:lineRule="auto"/>
-            </w:pPr>
-            <w:r/>
-            <w:r>
-              <w:rPr>
-                <w:rFonts w:ascii="Times New Roman" w:hAnsi="Times New Roman" w:eastAsia="Times New Roman" w:cs="Times New Roman"/>
-                <w:color w:val="000000"/>
-                <w:sz w:val="20"/>
-              </w:rPr>
-              <w:t>(Grenier, 1987)</w:t>
-            </w:r>
-          </w:p>
-        </w:tc>
-        <w:tc>
-          <w:tcPr>
-            <w:tcW w:type="dxa" w:w="1568"/>
-          </w:tcPr>
-          <w:p>
-            <w:pPr>
-              <w:spacing w:line="240" w:lineRule="auto"/>
-            </w:pPr>
-            <w:r/>
-            <w:r>
-              <w:rPr>
-                <w:rFonts w:ascii="Times New Roman" w:hAnsi="Times New Roman" w:eastAsia="Times New Roman" w:cs="Times New Roman"/>
-                <w:color w:val="000000"/>
-                <w:sz w:val="20"/>
-              </w:rPr>
-              <w:t>73</w:t>
-            </w:r>
-          </w:p>
-        </w:tc>
-        <w:tc>
-          <w:tcPr>
-            <w:tcW w:type="dxa" w:w="1568"/>
-          </w:tcPr>
-          <w:p>
-            <w:pPr>
-              <w:spacing w:line="240" w:lineRule="auto"/>
-            </w:pPr>
-            <w:r/>
-            <w:r>
-              <w:rPr>
-                <w:rFonts w:ascii="Times New Roman" w:hAnsi="Times New Roman" w:eastAsia="Times New Roman" w:cs="Times New Roman"/>
-                <w:color w:val="000000"/>
-                <w:sz w:val="20"/>
-              </w:rPr>
-              <w:t>GS</w:t>
-            </w:r>
-          </w:p>
-        </w:tc>
-        <w:tc>
-          <w:tcPr>
-            <w:tcW w:type="dxa" w:w="1568"/>
-          </w:tcPr>
-          <w:p>
-            <w:pPr>
-              <w:spacing w:line="240" w:lineRule="auto"/>
-            </w:pPr>
-            <w:r/>
-            <w:r>
-              <w:rPr>
-                <w:rFonts w:ascii="Times New Roman" w:hAnsi="Times New Roman" w:eastAsia="Times New Roman" w:cs="Times New Roman"/>
-                <w:color w:val="000000"/>
-                <w:sz w:val="20"/>
-              </w:rPr>
-              <w:t>33</w:t>
-            </w:r>
-          </w:p>
-        </w:tc>
-        <w:tc>
-          <w:tcPr>
-            <w:tcW w:type="dxa" w:w="1568"/>
-          </w:tcPr>
-          <w:p>
-            <w:pPr>
-              <w:spacing w:line="240" w:lineRule="auto"/>
-            </w:pPr>
-            <w:r/>
-            <w:r>
-              <w:rPr>
-                <w:rFonts w:ascii="Times New Roman" w:hAnsi="Times New Roman" w:eastAsia="Times New Roman" w:cs="Times New Roman"/>
-                <w:color w:val="000000"/>
-                <w:sz w:val="20"/>
-              </w:rPr>
-              <w:t>0.50</w:t>
-            </w:r>
-          </w:p>
-        </w:tc>
-      </w:tr>
-      <w:tr>
-        <w:tc>
-          <w:tcPr>
-            <w:tcW w:type="dxa" w:w="1568"/>
-          </w:tcPr>
-          <w:p>
-            <w:pPr>
-              <w:spacing w:line="240" w:lineRule="auto"/>
-            </w:pPr>
-            <w:r/>
-            <w:r>
-              <w:rPr>
-                <w:rFonts w:ascii="Times New Roman" w:hAnsi="Times New Roman" w:eastAsia="Times New Roman" w:cs="Times New Roman"/>
-                <w:color w:val="000000"/>
-                <w:sz w:val="20"/>
-              </w:rPr>
-              <w:t>13</w:t>
-            </w:r>
-          </w:p>
-        </w:tc>
-        <w:tc>
-          <w:tcPr>
-            <w:tcW w:type="dxa" w:w="1568"/>
-          </w:tcPr>
-          <w:p>
-            <w:pPr>
-              <w:spacing w:line="240" w:lineRule="auto"/>
-            </w:pPr>
-            <w:r/>
-            <w:r>
-              <w:rPr>
-                <w:rFonts w:ascii="Times New Roman" w:hAnsi="Times New Roman" w:eastAsia="Times New Roman" w:cs="Times New Roman"/>
-                <w:color w:val="000000"/>
-                <w:sz w:val="20"/>
-              </w:rPr>
-              <w:t>(Bourhis, 2019)</w:t>
-            </w:r>
-          </w:p>
-        </w:tc>
-        <w:tc>
-          <w:tcPr>
-            <w:tcW w:type="dxa" w:w="1568"/>
-          </w:tcPr>
-          <w:p>
-            <w:pPr>
-              <w:spacing w:line="240" w:lineRule="auto"/>
-            </w:pPr>
-            <w:r/>
-            <w:r>
-              <w:rPr>
-                <w:rFonts w:ascii="Times New Roman" w:hAnsi="Times New Roman" w:eastAsia="Times New Roman" w:cs="Times New Roman"/>
-                <w:color w:val="000000"/>
-                <w:sz w:val="20"/>
-              </w:rPr>
-              <w:t>39</w:t>
-            </w:r>
-          </w:p>
-        </w:tc>
-        <w:tc>
-          <w:tcPr>
-            <w:tcW w:type="dxa" w:w="1568"/>
-          </w:tcPr>
-          <w:p>
-            <w:pPr>
-              <w:spacing w:line="240" w:lineRule="auto"/>
-            </w:pPr>
-            <w:r/>
-            <w:r>
-              <w:rPr>
-                <w:rFonts w:ascii="Times New Roman" w:hAnsi="Times New Roman" w:eastAsia="Times New Roman" w:cs="Times New Roman"/>
-                <w:color w:val="000000"/>
-                <w:sz w:val="20"/>
-              </w:rPr>
-              <w:t>GS</w:t>
-            </w:r>
-          </w:p>
-        </w:tc>
-        <w:tc>
-          <w:tcPr>
-            <w:tcW w:type="dxa" w:w="1568"/>
-          </w:tcPr>
-          <w:p>
-            <w:pPr>
-              <w:spacing w:line="240" w:lineRule="auto"/>
-            </w:pPr>
-            <w:r/>
-            <w:r>
-              <w:rPr>
-                <w:rFonts w:ascii="Times New Roman" w:hAnsi="Times New Roman" w:eastAsia="Times New Roman" w:cs="Times New Roman"/>
-                <w:color w:val="000000"/>
-                <w:sz w:val="20"/>
-              </w:rPr>
-              <w:t>7</w:t>
-            </w:r>
-          </w:p>
-        </w:tc>
-        <w:tc>
-          <w:tcPr>
-            <w:tcW w:type="dxa" w:w="1568"/>
-          </w:tcPr>
-          <w:p>
-            <w:pPr>
-              <w:spacing w:line="240" w:lineRule="auto"/>
-            </w:pPr>
-            <w:r/>
-            <w:r>
-              <w:rPr>
-                <w:rFonts w:ascii="Times New Roman" w:hAnsi="Times New Roman" w:eastAsia="Times New Roman" w:cs="Times New Roman"/>
-                <w:color w:val="000000"/>
-                <w:sz w:val="20"/>
-              </w:rPr>
-              <w:t>0.49</w:t>
-            </w:r>
-          </w:p>
-        </w:tc>
-      </w:tr>
-      <w:tr>
-        <w:tc>
-          <w:tcPr>
-            <w:tcW w:type="dxa" w:w="1568"/>
-          </w:tcPr>
-          <w:p>
-            <w:pPr>
-              <w:spacing w:line="240" w:lineRule="auto"/>
-            </w:pPr>
-            <w:r/>
-            <w:r>
-              <w:rPr>
-                <w:rFonts w:ascii="Times New Roman" w:hAnsi="Times New Roman" w:eastAsia="Times New Roman" w:cs="Times New Roman"/>
-                <w:color w:val="000000"/>
-                <w:sz w:val="20"/>
-              </w:rPr>
-              <w:t>14</w:t>
-            </w:r>
-          </w:p>
-        </w:tc>
-        <w:tc>
-          <w:tcPr>
-            <w:tcW w:type="dxa" w:w="1568"/>
-          </w:tcPr>
-          <w:p>
-            <w:pPr>
-              <w:spacing w:line="240" w:lineRule="auto"/>
-            </w:pPr>
-            <w:r/>
-            <w:r>
-              <w:rPr>
-                <w:rFonts w:ascii="Times New Roman" w:hAnsi="Times New Roman" w:eastAsia="Times New Roman" w:cs="Times New Roman"/>
-                <w:color w:val="000000"/>
-                <w:sz w:val="20"/>
-              </w:rPr>
-              <w:t>(Nadeau, 2010)</w:t>
-            </w:r>
-          </w:p>
-        </w:tc>
-        <w:tc>
-          <w:tcPr>
-            <w:tcW w:type="dxa" w:w="1568"/>
-          </w:tcPr>
-          <w:p>
-            <w:pPr>
-              <w:spacing w:line="240" w:lineRule="auto"/>
-            </w:pPr>
-            <w:r/>
-            <w:r>
-              <w:rPr>
-                <w:rFonts w:ascii="Times New Roman" w:hAnsi="Times New Roman" w:eastAsia="Times New Roman" w:cs="Times New Roman"/>
-                <w:color w:val="000000"/>
-                <w:sz w:val="20"/>
-              </w:rPr>
-              <w:t>35</w:t>
-            </w:r>
-          </w:p>
-        </w:tc>
-        <w:tc>
-          <w:tcPr>
-            <w:tcW w:type="dxa" w:w="1568"/>
-          </w:tcPr>
-          <w:p>
-            <w:pPr>
-              <w:spacing w:line="240" w:lineRule="auto"/>
-            </w:pPr>
-            <w:r/>
-            <w:r>
-              <w:rPr>
-                <w:rFonts w:ascii="Times New Roman" w:hAnsi="Times New Roman" w:eastAsia="Times New Roman" w:cs="Times New Roman"/>
-                <w:color w:val="000000"/>
-                <w:sz w:val="20"/>
-              </w:rPr>
-              <w:t>GS</w:t>
-            </w:r>
-          </w:p>
-        </w:tc>
-        <w:tc>
-          <w:tcPr>
-            <w:tcW w:type="dxa" w:w="1568"/>
-          </w:tcPr>
-          <w:p>
-            <w:pPr>
-              <w:spacing w:line="240" w:lineRule="auto"/>
-            </w:pPr>
-            <w:r/>
-            <w:r>
-              <w:rPr>
-                <w:rFonts w:ascii="Times New Roman" w:hAnsi="Times New Roman" w:eastAsia="Times New Roman" w:cs="Times New Roman"/>
-                <w:color w:val="000000"/>
-                <w:sz w:val="20"/>
-              </w:rPr>
-              <w:t>15</w:t>
-            </w:r>
-          </w:p>
-        </w:tc>
-        <w:tc>
-          <w:tcPr>
-            <w:tcW w:type="dxa" w:w="1568"/>
-          </w:tcPr>
-          <w:p>
-            <w:pPr>
-              <w:spacing w:line="240" w:lineRule="auto"/>
-            </w:pPr>
-            <w:r/>
-            <w:r>
-              <w:rPr>
-                <w:rFonts w:ascii="Times New Roman" w:hAnsi="Times New Roman" w:eastAsia="Times New Roman" w:cs="Times New Roman"/>
-                <w:color w:val="000000"/>
-                <w:sz w:val="20"/>
-              </w:rPr>
-              <w:t>0.48</w:t>
-            </w:r>
-          </w:p>
-        </w:tc>
-      </w:tr>
-      <w:tr>
-        <w:tc>
-          <w:tcPr>
-            <w:tcW w:type="dxa" w:w="1568"/>
-          </w:tcPr>
-          <w:p>
-            <w:pPr>
-              <w:spacing w:line="240" w:lineRule="auto"/>
-            </w:pPr>
-            <w:r/>
-            <w:r>
-              <w:rPr>
-                <w:rFonts w:ascii="Times New Roman" w:hAnsi="Times New Roman" w:eastAsia="Times New Roman" w:cs="Times New Roman"/>
-                <w:color w:val="000000"/>
-                <w:sz w:val="20"/>
-              </w:rPr>
-              <w:t>15</w:t>
-            </w:r>
-          </w:p>
-        </w:tc>
-        <w:tc>
-          <w:tcPr>
-            <w:tcW w:type="dxa" w:w="1568"/>
-          </w:tcPr>
-          <w:p>
-            <w:pPr>
-              <w:spacing w:line="240" w:lineRule="auto"/>
-            </w:pPr>
-            <w:r/>
-            <w:r>
-              <w:rPr>
-                <w:rFonts w:ascii="Times New Roman" w:hAnsi="Times New Roman" w:eastAsia="Times New Roman" w:cs="Times New Roman"/>
-                <w:color w:val="000000"/>
-                <w:sz w:val="20"/>
-              </w:rPr>
-              <w:t>(Chiswick et Miller, 1988)</w:t>
-            </w:r>
-          </w:p>
-        </w:tc>
-        <w:tc>
-          <w:tcPr>
-            <w:tcW w:type="dxa" w:w="1568"/>
-          </w:tcPr>
-          <w:p>
-            <w:pPr>
-              <w:spacing w:line="240" w:lineRule="auto"/>
-            </w:pPr>
-            <w:r/>
-            <w:r>
-              <w:rPr>
-                <w:rFonts w:ascii="Times New Roman" w:hAnsi="Times New Roman" w:eastAsia="Times New Roman" w:cs="Times New Roman"/>
-                <w:color w:val="000000"/>
-                <w:sz w:val="20"/>
-              </w:rPr>
-              <w:t>155</w:t>
-            </w:r>
-          </w:p>
-        </w:tc>
-        <w:tc>
-          <w:tcPr>
-            <w:tcW w:type="dxa" w:w="1568"/>
-          </w:tcPr>
-          <w:p>
-            <w:pPr>
-              <w:spacing w:line="240" w:lineRule="auto"/>
-            </w:pPr>
-            <w:r/>
-            <w:r>
-              <w:rPr>
-                <w:rFonts w:ascii="Times New Roman" w:hAnsi="Times New Roman" w:eastAsia="Times New Roman" w:cs="Times New Roman"/>
-                <w:color w:val="000000"/>
-                <w:sz w:val="20"/>
-              </w:rPr>
-              <w:t>GS</w:t>
-            </w:r>
-          </w:p>
-        </w:tc>
-        <w:tc>
-          <w:tcPr>
-            <w:tcW w:type="dxa" w:w="1568"/>
-          </w:tcPr>
-          <w:p>
-            <w:pPr>
-              <w:spacing w:line="240" w:lineRule="auto"/>
-            </w:pPr>
-            <w:r/>
-            <w:r>
-              <w:rPr>
-                <w:rFonts w:ascii="Times New Roman" w:hAnsi="Times New Roman" w:eastAsia="Times New Roman" w:cs="Times New Roman"/>
-                <w:color w:val="000000"/>
-                <w:sz w:val="20"/>
-              </w:rPr>
-              <w:t>21</w:t>
-            </w:r>
-          </w:p>
-        </w:tc>
-        <w:tc>
-          <w:tcPr>
-            <w:tcW w:type="dxa" w:w="1568"/>
-          </w:tcPr>
-          <w:p>
-            <w:pPr>
-              <w:spacing w:line="240" w:lineRule="auto"/>
-            </w:pPr>
-            <w:r/>
-            <w:r>
-              <w:rPr>
-                <w:rFonts w:ascii="Times New Roman" w:hAnsi="Times New Roman" w:eastAsia="Times New Roman" w:cs="Times New Roman"/>
-                <w:color w:val="000000"/>
-                <w:sz w:val="20"/>
-              </w:rPr>
-              <w:t>0.48</w:t>
-            </w:r>
-          </w:p>
-        </w:tc>
-      </w:tr>
-      <w:tr>
-        <w:tc>
-          <w:tcPr>
-            <w:tcW w:type="dxa" w:w="1568"/>
-          </w:tcPr>
-          <w:p>
-            <w:pPr>
-              <w:spacing w:line="240" w:lineRule="auto"/>
-            </w:pPr>
-            <w:r/>
-            <w:r>
-              <w:rPr>
-                <w:rFonts w:ascii="Times New Roman" w:hAnsi="Times New Roman" w:eastAsia="Times New Roman" w:cs="Times New Roman"/>
-                <w:color w:val="000000"/>
-                <w:sz w:val="20"/>
-              </w:rPr>
-              <w:t>16</w:t>
-            </w:r>
-          </w:p>
-        </w:tc>
-        <w:tc>
-          <w:tcPr>
-            <w:tcW w:type="dxa" w:w="1568"/>
-          </w:tcPr>
-          <w:p>
-            <w:pPr>
-              <w:spacing w:line="240" w:lineRule="auto"/>
-            </w:pPr>
-            <w:r/>
-            <w:r>
-              <w:rPr>
-                <w:rFonts w:ascii="Times New Roman" w:hAnsi="Times New Roman" w:eastAsia="Times New Roman" w:cs="Times New Roman"/>
-                <w:color w:val="000000"/>
-                <w:sz w:val="20"/>
-              </w:rPr>
-              <w:t>(Vaillancourt et al., 2013)</w:t>
-            </w:r>
-          </w:p>
-        </w:tc>
-        <w:tc>
-          <w:tcPr>
-            <w:tcW w:type="dxa" w:w="1568"/>
-          </w:tcPr>
-          <w:p>
-            <w:pPr>
-              <w:spacing w:line="240" w:lineRule="auto"/>
-            </w:pPr>
-            <w:r/>
-            <w:r>
-              <w:rPr>
-                <w:rFonts w:ascii="Times New Roman" w:hAnsi="Times New Roman" w:eastAsia="Times New Roman" w:cs="Times New Roman"/>
-                <w:color w:val="000000"/>
-                <w:sz w:val="20"/>
-              </w:rPr>
-              <w:t>24</w:t>
-            </w:r>
-          </w:p>
-        </w:tc>
-        <w:tc>
-          <w:tcPr>
-            <w:tcW w:type="dxa" w:w="1568"/>
-          </w:tcPr>
-          <w:p>
-            <w:pPr>
-              <w:spacing w:line="240" w:lineRule="auto"/>
-            </w:pPr>
-            <w:r/>
-            <w:r>
-              <w:rPr>
-                <w:rFonts w:ascii="Times New Roman" w:hAnsi="Times New Roman" w:eastAsia="Times New Roman" w:cs="Times New Roman"/>
-                <w:color w:val="000000"/>
-                <w:sz w:val="20"/>
-              </w:rPr>
-              <w:t>GS</w:t>
-            </w:r>
-          </w:p>
-        </w:tc>
-        <w:tc>
-          <w:tcPr>
-            <w:tcW w:type="dxa" w:w="1568"/>
-          </w:tcPr>
-          <w:p>
-            <w:pPr>
-              <w:spacing w:line="240" w:lineRule="auto"/>
-            </w:pPr>
-            <w:r/>
-            <w:r>
-              <w:rPr>
-                <w:rFonts w:ascii="Times New Roman" w:hAnsi="Times New Roman" w:eastAsia="Times New Roman" w:cs="Times New Roman"/>
-                <w:color w:val="000000"/>
-                <w:sz w:val="20"/>
-              </w:rPr>
-              <w:t>15</w:t>
-            </w:r>
-          </w:p>
-        </w:tc>
-        <w:tc>
-          <w:tcPr>
-            <w:tcW w:type="dxa" w:w="1568"/>
-          </w:tcPr>
-          <w:p>
-            <w:pPr>
-              <w:spacing w:line="240" w:lineRule="auto"/>
-            </w:pPr>
-            <w:r/>
-            <w:r>
-              <w:rPr>
-                <w:rFonts w:ascii="Times New Roman" w:hAnsi="Times New Roman" w:eastAsia="Times New Roman" w:cs="Times New Roman"/>
-                <w:color w:val="000000"/>
-                <w:sz w:val="20"/>
-              </w:rPr>
-              <w:t>0.48</w:t>
-            </w:r>
-          </w:p>
-        </w:tc>
-      </w:tr>
-      <w:tr>
-        <w:tc>
-          <w:tcPr>
-            <w:tcW w:type="dxa" w:w="1568"/>
-          </w:tcPr>
-          <w:p>
-            <w:pPr>
-              <w:spacing w:line="240" w:lineRule="auto"/>
-            </w:pPr>
-            <w:r/>
-            <w:r>
-              <w:rPr>
-                <w:rFonts w:ascii="Times New Roman" w:hAnsi="Times New Roman" w:eastAsia="Times New Roman" w:cs="Times New Roman"/>
-                <w:color w:val="000000"/>
-                <w:sz w:val="20"/>
-              </w:rPr>
-              <w:t>17</w:t>
-            </w:r>
-          </w:p>
-        </w:tc>
-        <w:tc>
-          <w:tcPr>
-            <w:tcW w:type="dxa" w:w="1568"/>
-          </w:tcPr>
-          <w:p>
-            <w:pPr>
-              <w:spacing w:line="240" w:lineRule="auto"/>
-            </w:pPr>
-            <w:r/>
-            <w:r>
-              <w:rPr>
-                <w:rFonts w:ascii="Times New Roman" w:hAnsi="Times New Roman" w:eastAsia="Times New Roman" w:cs="Times New Roman"/>
-                <w:color w:val="000000"/>
-                <w:sz w:val="20"/>
-              </w:rPr>
-              <w:t>(PERT, 2023)</w:t>
-            </w:r>
-          </w:p>
-        </w:tc>
-        <w:tc>
-          <w:tcPr>
-            <w:tcW w:type="dxa" w:w="1568"/>
-          </w:tcPr>
-          <w:p>
-            <w:pPr>
-              <w:spacing w:line="240" w:lineRule="auto"/>
-            </w:pPr>
-            <w:r/>
-            <w:r>
-              <w:rPr>
-                <w:rFonts w:ascii="Times New Roman" w:hAnsi="Times New Roman" w:eastAsia="Times New Roman" w:cs="Times New Roman"/>
-                <w:color w:val="000000"/>
-                <w:sz w:val="20"/>
-              </w:rPr>
-              <w:t>33</w:t>
-            </w:r>
-          </w:p>
-        </w:tc>
-        <w:tc>
-          <w:tcPr>
-            <w:tcW w:type="dxa" w:w="1568"/>
-          </w:tcPr>
-          <w:p>
-            <w:pPr>
-              <w:spacing w:line="240" w:lineRule="auto"/>
-            </w:pPr>
-            <w:r/>
-            <w:r>
-              <w:rPr>
-                <w:rFonts w:ascii="Times New Roman" w:hAnsi="Times New Roman" w:eastAsia="Times New Roman" w:cs="Times New Roman"/>
-                <w:color w:val="000000"/>
-                <w:sz w:val="20"/>
-              </w:rPr>
-              <w:t>imputé</w:t>
-            </w:r>
-          </w:p>
-        </w:tc>
-        <w:tc>
-          <w:tcPr>
-            <w:tcW w:type="dxa" w:w="1568"/>
-          </w:tcPr>
-          <w:p>
-            <w:pPr>
-              <w:spacing w:line="240" w:lineRule="auto"/>
-            </w:pPr>
-            <w:r/>
-            <w:r>
-              <w:rPr>
-                <w:rFonts w:ascii="Times New Roman" w:hAnsi="Times New Roman" w:eastAsia="Times New Roman" w:cs="Times New Roman"/>
-                <w:color w:val="000000"/>
-                <w:sz w:val="20"/>
-              </w:rPr>
-              <w:t>2</w:t>
-            </w:r>
-          </w:p>
-        </w:tc>
-        <w:tc>
-          <w:tcPr>
-            <w:tcW w:type="dxa" w:w="1568"/>
-          </w:tcPr>
-          <w:p>
-            <w:pPr>
-              <w:spacing w:line="240" w:lineRule="auto"/>
-            </w:pPr>
-            <w:r/>
-            <w:r>
-              <w:rPr>
-                <w:rFonts w:ascii="Times New Roman" w:hAnsi="Times New Roman" w:eastAsia="Times New Roman" w:cs="Times New Roman"/>
-                <w:color w:val="000000"/>
-                <w:sz w:val="20"/>
-              </w:rPr>
-              <w:t>0.48</w:t>
-            </w:r>
-          </w:p>
-        </w:tc>
-      </w:tr>
-      <w:tr>
-        <w:tc>
-          <w:tcPr>
-            <w:tcW w:type="dxa" w:w="1568"/>
-          </w:tcPr>
-          <w:p>
-            <w:pPr>
-              <w:spacing w:line="240" w:lineRule="auto"/>
-            </w:pPr>
-            <w:r/>
-            <w:r>
-              <w:rPr>
-                <w:rFonts w:ascii="Times New Roman" w:hAnsi="Times New Roman" w:eastAsia="Times New Roman" w:cs="Times New Roman"/>
-                <w:color w:val="000000"/>
-                <w:sz w:val="20"/>
-              </w:rPr>
-              <w:t>18</w:t>
-            </w:r>
-          </w:p>
-        </w:tc>
-        <w:tc>
-          <w:tcPr>
-            <w:tcW w:type="dxa" w:w="1568"/>
-          </w:tcPr>
-          <w:p>
-            <w:pPr>
-              <w:spacing w:line="240" w:lineRule="auto"/>
-            </w:pPr>
-            <w:r/>
-            <w:r>
-              <w:rPr>
-                <w:rFonts w:ascii="Times New Roman" w:hAnsi="Times New Roman" w:eastAsia="Times New Roman" w:cs="Times New Roman"/>
-                <w:color w:val="000000"/>
-                <w:sz w:val="20"/>
-              </w:rPr>
-              <w:t>(Boulet, 1980)</w:t>
-            </w:r>
-          </w:p>
-        </w:tc>
-        <w:tc>
-          <w:tcPr>
-            <w:tcW w:type="dxa" w:w="1568"/>
-          </w:tcPr>
-          <w:p>
-            <w:pPr>
-              <w:spacing w:line="240" w:lineRule="auto"/>
-            </w:pPr>
-            <w:r/>
-            <w:r>
-              <w:rPr>
-                <w:rFonts w:ascii="Times New Roman" w:hAnsi="Times New Roman" w:eastAsia="Times New Roman" w:cs="Times New Roman"/>
-                <w:color w:val="000000"/>
-                <w:sz w:val="20"/>
-              </w:rPr>
-              <w:t>33</w:t>
-            </w:r>
-          </w:p>
-        </w:tc>
-        <w:tc>
-          <w:tcPr>
-            <w:tcW w:type="dxa" w:w="1568"/>
-          </w:tcPr>
-          <w:p>
-            <w:pPr>
-              <w:spacing w:line="240" w:lineRule="auto"/>
-            </w:pPr>
-            <w:r/>
-            <w:r>
-              <w:rPr>
-                <w:rFonts w:ascii="Times New Roman" w:hAnsi="Times New Roman" w:eastAsia="Times New Roman" w:cs="Times New Roman"/>
-                <w:color w:val="000000"/>
-                <w:sz w:val="20"/>
-              </w:rPr>
-              <w:t>imputé</w:t>
-            </w:r>
-          </w:p>
-        </w:tc>
-        <w:tc>
-          <w:tcPr>
-            <w:tcW w:type="dxa" w:w="1568"/>
-          </w:tcPr>
-          <w:p>
-            <w:pPr>
-              <w:spacing w:line="240" w:lineRule="auto"/>
-            </w:pPr>
-            <w:r/>
-            <w:r>
-              <w:rPr>
-                <w:rFonts w:ascii="Times New Roman" w:hAnsi="Times New Roman" w:eastAsia="Times New Roman" w:cs="Times New Roman"/>
-                <w:color w:val="000000"/>
-                <w:sz w:val="20"/>
-              </w:rPr>
-              <w:t>44</w:t>
-            </w:r>
-          </w:p>
-        </w:tc>
-        <w:tc>
-          <w:tcPr>
-            <w:tcW w:type="dxa" w:w="1568"/>
-          </w:tcPr>
-          <w:p>
-            <w:pPr>
-              <w:spacing w:line="240" w:lineRule="auto"/>
-            </w:pPr>
-            <w:r/>
-            <w:r>
-              <w:rPr>
-                <w:rFonts w:ascii="Times New Roman" w:hAnsi="Times New Roman" w:eastAsia="Times New Roman" w:cs="Times New Roman"/>
-                <w:color w:val="000000"/>
-                <w:sz w:val="20"/>
-              </w:rPr>
-              <w:t>0.48</w:t>
-            </w:r>
-          </w:p>
-        </w:tc>
-      </w:tr>
-      <w:tr>
-        <w:tc>
-          <w:tcPr>
-            <w:tcW w:type="dxa" w:w="1568"/>
-          </w:tcPr>
-          <w:p>
-            <w:pPr>
-              <w:spacing w:line="240" w:lineRule="auto"/>
-            </w:pPr>
-            <w:r/>
-            <w:r>
-              <w:rPr>
-                <w:rFonts w:ascii="Times New Roman" w:hAnsi="Times New Roman" w:eastAsia="Times New Roman" w:cs="Times New Roman"/>
-                <w:color w:val="000000"/>
-                <w:sz w:val="20"/>
-              </w:rPr>
-              <w:t>19</w:t>
-            </w:r>
-          </w:p>
-        </w:tc>
-        <w:tc>
-          <w:tcPr>
-            <w:tcW w:type="dxa" w:w="1568"/>
-          </w:tcPr>
-          <w:p>
-            <w:pPr>
-              <w:spacing w:line="240" w:lineRule="auto"/>
-            </w:pPr>
-            <w:r/>
-            <w:r>
-              <w:rPr>
-                <w:rFonts w:ascii="Times New Roman" w:hAnsi="Times New Roman" w:eastAsia="Times New Roman" w:cs="Times New Roman"/>
-                <w:color w:val="000000"/>
-                <w:sz w:val="20"/>
-              </w:rPr>
-              <w:t>(OQLF, 2022)</w:t>
-            </w:r>
-          </w:p>
-        </w:tc>
-        <w:tc>
-          <w:tcPr>
-            <w:tcW w:type="dxa" w:w="1568"/>
-          </w:tcPr>
-          <w:p>
-            <w:pPr>
-              <w:spacing w:line="240" w:lineRule="auto"/>
-            </w:pPr>
-            <w:r/>
-            <w:r>
-              <w:rPr>
-                <w:rFonts w:ascii="Times New Roman" w:hAnsi="Times New Roman" w:eastAsia="Times New Roman" w:cs="Times New Roman"/>
-                <w:color w:val="000000"/>
-                <w:sz w:val="20"/>
-              </w:rPr>
-              <w:t>33</w:t>
-            </w:r>
-          </w:p>
-        </w:tc>
-        <w:tc>
-          <w:tcPr>
-            <w:tcW w:type="dxa" w:w="1568"/>
-          </w:tcPr>
-          <w:p>
-            <w:pPr>
-              <w:spacing w:line="240" w:lineRule="auto"/>
-            </w:pPr>
-            <w:r/>
-            <w:r>
-              <w:rPr>
-                <w:rFonts w:ascii="Times New Roman" w:hAnsi="Times New Roman" w:eastAsia="Times New Roman" w:cs="Times New Roman"/>
-                <w:color w:val="000000"/>
-                <w:sz w:val="20"/>
-              </w:rPr>
-              <w:t>imputé</w:t>
-            </w:r>
-          </w:p>
-        </w:tc>
-        <w:tc>
-          <w:tcPr>
-            <w:tcW w:type="dxa" w:w="1568"/>
-          </w:tcPr>
-          <w:p>
-            <w:pPr>
-              <w:spacing w:line="240" w:lineRule="auto"/>
-            </w:pPr>
-            <w:r/>
-            <w:r>
-              <w:rPr>
-                <w:rFonts w:ascii="Times New Roman" w:hAnsi="Times New Roman" w:eastAsia="Times New Roman" w:cs="Times New Roman"/>
-                <w:color w:val="000000"/>
-                <w:sz w:val="20"/>
-              </w:rPr>
-              <w:t>2</w:t>
-            </w:r>
-          </w:p>
-        </w:tc>
-        <w:tc>
-          <w:tcPr>
-            <w:tcW w:type="dxa" w:w="1568"/>
-          </w:tcPr>
-          <w:p>
-            <w:pPr>
-              <w:spacing w:line="240" w:lineRule="auto"/>
-            </w:pPr>
-            <w:r/>
-            <w:r>
-              <w:rPr>
-                <w:rFonts w:ascii="Times New Roman" w:hAnsi="Times New Roman" w:eastAsia="Times New Roman" w:cs="Times New Roman"/>
-                <w:color w:val="000000"/>
-                <w:sz w:val="20"/>
-              </w:rPr>
-              <w:t>0.48</w:t>
-            </w:r>
-          </w:p>
-        </w:tc>
-      </w:tr>
-      <w:tr>
-        <w:tc>
-          <w:tcPr>
-            <w:tcW w:type="dxa" w:w="1568"/>
-          </w:tcPr>
-          <w:p>
-            <w:pPr>
-              <w:spacing w:line="240" w:lineRule="auto"/>
-            </w:pPr>
-            <w:r/>
-            <w:r>
-              <w:rPr>
-                <w:rFonts w:ascii="Times New Roman" w:hAnsi="Times New Roman" w:eastAsia="Times New Roman" w:cs="Times New Roman"/>
-                <w:color w:val="000000"/>
-                <w:sz w:val="20"/>
-              </w:rPr>
-              <w:t>20</w:t>
-            </w:r>
-          </w:p>
-        </w:tc>
-        <w:tc>
-          <w:tcPr>
-            <w:tcW w:type="dxa" w:w="1568"/>
-          </w:tcPr>
-          <w:p>
-            <w:pPr>
-              <w:spacing w:line="240" w:lineRule="auto"/>
-            </w:pPr>
-            <w:r/>
-            <w:r>
-              <w:rPr>
-                <w:rFonts w:ascii="Times New Roman" w:hAnsi="Times New Roman" w:eastAsia="Times New Roman" w:cs="Times New Roman"/>
-                <w:color w:val="000000"/>
-                <w:sz w:val="20"/>
-              </w:rPr>
-              <w:t>(Floch et Pocock, 2012)</w:t>
-            </w:r>
-          </w:p>
-        </w:tc>
-        <w:tc>
-          <w:tcPr>
-            <w:tcW w:type="dxa" w:w="1568"/>
-          </w:tcPr>
-          <w:p>
-            <w:pPr>
-              <w:spacing w:line="240" w:lineRule="auto"/>
-            </w:pPr>
-            <w:r/>
-            <w:r>
-              <w:rPr>
-                <w:rFonts w:ascii="Times New Roman" w:hAnsi="Times New Roman" w:eastAsia="Times New Roman" w:cs="Times New Roman"/>
-                <w:color w:val="000000"/>
-                <w:sz w:val="20"/>
-              </w:rPr>
-              <w:t>49</w:t>
-            </w:r>
-          </w:p>
-        </w:tc>
-        <w:tc>
-          <w:tcPr>
-            <w:tcW w:type="dxa" w:w="1568"/>
-          </w:tcPr>
-          <w:p>
-            <w:pPr>
-              <w:spacing w:line="240" w:lineRule="auto"/>
-            </w:pPr>
-            <w:r/>
-            <w:r>
-              <w:rPr>
-                <w:rFonts w:ascii="Times New Roman" w:hAnsi="Times New Roman" w:eastAsia="Times New Roman" w:cs="Times New Roman"/>
-                <w:color w:val="000000"/>
-                <w:sz w:val="20"/>
-              </w:rPr>
-              <w:t>GS</w:t>
-            </w:r>
-          </w:p>
-        </w:tc>
-        <w:tc>
-          <w:tcPr>
-            <w:tcW w:type="dxa" w:w="1568"/>
-          </w:tcPr>
-          <w:p>
-            <w:pPr>
-              <w:spacing w:line="240" w:lineRule="auto"/>
-            </w:pPr>
-            <w:r/>
-            <w:r>
-              <w:rPr>
-                <w:rFonts w:ascii="Times New Roman" w:hAnsi="Times New Roman" w:eastAsia="Times New Roman" w:cs="Times New Roman"/>
-                <w:color w:val="000000"/>
-                <w:sz w:val="20"/>
-              </w:rPr>
-              <w:t>7</w:t>
-            </w:r>
-          </w:p>
-        </w:tc>
-        <w:tc>
-          <w:tcPr>
-            <w:tcW w:type="dxa" w:w="1568"/>
-          </w:tcPr>
-          <w:p>
-            <w:pPr>
-              <w:spacing w:line="240" w:lineRule="auto"/>
-            </w:pPr>
-            <w:r/>
-            <w:r>
-              <w:rPr>
-                <w:rFonts w:ascii="Times New Roman" w:hAnsi="Times New Roman" w:eastAsia="Times New Roman" w:cs="Times New Roman"/>
-                <w:color w:val="000000"/>
-                <w:sz w:val="20"/>
-              </w:rPr>
-              <w:t>0.48</w:t>
-            </w:r>
-          </w:p>
-        </w:tc>
-      </w:tr>
-      <w:tr>
-        <w:tc>
-          <w:tcPr>
-            <w:tcW w:type="dxa" w:w="1568"/>
-          </w:tcPr>
-          <w:p>
-            <w:pPr>
-              <w:spacing w:line="240" w:lineRule="auto"/>
-            </w:pPr>
-            <w:r/>
-            <w:r>
-              <w:rPr>
-                <w:rFonts w:ascii="Times New Roman" w:hAnsi="Times New Roman" w:eastAsia="Times New Roman" w:cs="Times New Roman"/>
-                <w:color w:val="000000"/>
-                <w:sz w:val="20"/>
-              </w:rPr>
-              <w:t>21</w:t>
-            </w:r>
-          </w:p>
-        </w:tc>
-        <w:tc>
-          <w:tcPr>
-            <w:tcW w:type="dxa" w:w="1568"/>
-          </w:tcPr>
-          <w:p>
-            <w:pPr>
-              <w:spacing w:line="240" w:lineRule="auto"/>
-            </w:pPr>
-            <w:r/>
-            <w:r>
-              <w:rPr>
-                <w:rFonts w:ascii="Times New Roman" w:hAnsi="Times New Roman" w:eastAsia="Times New Roman" w:cs="Times New Roman"/>
-                <w:color w:val="000000"/>
-                <w:sz w:val="20"/>
-              </w:rPr>
-              <w:t>(Raynauld et al., 1966)</w:t>
-            </w:r>
-          </w:p>
-        </w:tc>
-        <w:tc>
-          <w:tcPr>
-            <w:tcW w:type="dxa" w:w="1568"/>
-          </w:tcPr>
-          <w:p>
-            <w:pPr>
-              <w:spacing w:line="240" w:lineRule="auto"/>
-            </w:pPr>
-            <w:r/>
-            <w:r>
-              <w:rPr>
-                <w:rFonts w:ascii="Times New Roman" w:hAnsi="Times New Roman" w:eastAsia="Times New Roman" w:cs="Times New Roman"/>
-                <w:color w:val="000000"/>
-                <w:sz w:val="20"/>
-              </w:rPr>
-              <w:t>33</w:t>
-            </w:r>
-          </w:p>
-        </w:tc>
-        <w:tc>
-          <w:tcPr>
-            <w:tcW w:type="dxa" w:w="1568"/>
-          </w:tcPr>
-          <w:p>
-            <w:pPr>
-              <w:spacing w:line="240" w:lineRule="auto"/>
-            </w:pPr>
-            <w:r/>
-            <w:r>
-              <w:rPr>
-                <w:rFonts w:ascii="Times New Roman" w:hAnsi="Times New Roman" w:eastAsia="Times New Roman" w:cs="Times New Roman"/>
-                <w:color w:val="000000"/>
-                <w:sz w:val="20"/>
-              </w:rPr>
-              <w:t>imputé</w:t>
-            </w:r>
-          </w:p>
-        </w:tc>
-        <w:tc>
-          <w:tcPr>
-            <w:tcW w:type="dxa" w:w="1568"/>
-          </w:tcPr>
-          <w:p>
-            <w:pPr>
-              <w:spacing w:line="240" w:lineRule="auto"/>
-            </w:pPr>
-            <w:r/>
-            <w:r>
-              <w:rPr>
-                <w:rFonts w:ascii="Times New Roman" w:hAnsi="Times New Roman" w:eastAsia="Times New Roman" w:cs="Times New Roman"/>
-                <w:color w:val="000000"/>
-                <w:sz w:val="20"/>
-              </w:rPr>
-              <w:t>56</w:t>
-            </w:r>
-          </w:p>
-        </w:tc>
-        <w:tc>
-          <w:tcPr>
-            <w:tcW w:type="dxa" w:w="1568"/>
-          </w:tcPr>
-          <w:p>
-            <w:pPr>
-              <w:spacing w:line="240" w:lineRule="auto"/>
-            </w:pPr>
-            <w:r/>
-            <w:r>
-              <w:rPr>
-                <w:rFonts w:ascii="Times New Roman" w:hAnsi="Times New Roman" w:eastAsia="Times New Roman" w:cs="Times New Roman"/>
-                <w:color w:val="000000"/>
-                <w:sz w:val="20"/>
-              </w:rPr>
-              <w:t>0.47</w:t>
-            </w:r>
-          </w:p>
-        </w:tc>
-      </w:tr>
-      <w:tr>
-        <w:tc>
-          <w:tcPr>
-            <w:tcW w:type="dxa" w:w="1568"/>
-          </w:tcPr>
-          <w:p>
-            <w:pPr>
-              <w:spacing w:line="240" w:lineRule="auto"/>
-            </w:pPr>
-            <w:r/>
-            <w:r>
-              <w:rPr>
-                <w:rFonts w:ascii="Times New Roman" w:hAnsi="Times New Roman" w:eastAsia="Times New Roman" w:cs="Times New Roman"/>
-                <w:color w:val="000000"/>
-                <w:sz w:val="20"/>
-              </w:rPr>
-              <w:t>22</w:t>
-            </w:r>
-          </w:p>
-        </w:tc>
-        <w:tc>
-          <w:tcPr>
-            <w:tcW w:type="dxa" w:w="1568"/>
-          </w:tcPr>
-          <w:p>
-            <w:pPr>
-              <w:spacing w:line="240" w:lineRule="auto"/>
-            </w:pPr>
-            <w:r/>
-            <w:r>
-              <w:rPr>
-                <w:rFonts w:ascii="Times New Roman" w:hAnsi="Times New Roman" w:eastAsia="Times New Roman" w:cs="Times New Roman"/>
-                <w:color w:val="000000"/>
-                <w:sz w:val="20"/>
-              </w:rPr>
-              <w:t>(Bourhis et Sioufi, 2017)</w:t>
-            </w:r>
-          </w:p>
-        </w:tc>
-        <w:tc>
-          <w:tcPr>
-            <w:tcW w:type="dxa" w:w="1568"/>
-          </w:tcPr>
-          <w:p>
-            <w:pPr>
-              <w:spacing w:line="240" w:lineRule="auto"/>
-            </w:pPr>
-            <w:r/>
-            <w:r>
-              <w:rPr>
-                <w:rFonts w:ascii="Times New Roman" w:hAnsi="Times New Roman" w:eastAsia="Times New Roman" w:cs="Times New Roman"/>
-                <w:color w:val="000000"/>
-                <w:sz w:val="20"/>
-              </w:rPr>
-              <w:t>47</w:t>
-            </w:r>
-          </w:p>
-        </w:tc>
-        <w:tc>
-          <w:tcPr>
-            <w:tcW w:type="dxa" w:w="1568"/>
-          </w:tcPr>
-          <w:p>
-            <w:pPr>
-              <w:spacing w:line="240" w:lineRule="auto"/>
-            </w:pPr>
-            <w:r/>
-            <w:r>
-              <w:rPr>
-                <w:rFonts w:ascii="Times New Roman" w:hAnsi="Times New Roman" w:eastAsia="Times New Roman" w:cs="Times New Roman"/>
-                <w:color w:val="000000"/>
-                <w:sz w:val="20"/>
-              </w:rPr>
-              <w:t>GS</w:t>
-            </w:r>
-          </w:p>
-        </w:tc>
-        <w:tc>
-          <w:tcPr>
-            <w:tcW w:type="dxa" w:w="1568"/>
-          </w:tcPr>
-          <w:p>
-            <w:pPr>
-              <w:spacing w:line="240" w:lineRule="auto"/>
-            </w:pPr>
-            <w:r/>
-            <w:r>
-              <w:rPr>
-                <w:rFonts w:ascii="Times New Roman" w:hAnsi="Times New Roman" w:eastAsia="Times New Roman" w:cs="Times New Roman"/>
-                <w:color w:val="000000"/>
-                <w:sz w:val="20"/>
-              </w:rPr>
-              <w:t>1</w:t>
-            </w:r>
-          </w:p>
-        </w:tc>
-        <w:tc>
-          <w:tcPr>
-            <w:tcW w:type="dxa" w:w="1568"/>
-          </w:tcPr>
-          <w:p>
-            <w:pPr>
-              <w:spacing w:line="240" w:lineRule="auto"/>
-            </w:pPr>
-            <w:r/>
-            <w:r>
-              <w:rPr>
-                <w:rFonts w:ascii="Times New Roman" w:hAnsi="Times New Roman" w:eastAsia="Times New Roman" w:cs="Times New Roman"/>
-                <w:color w:val="000000"/>
-                <w:sz w:val="20"/>
-              </w:rPr>
-              <w:t>0.47</w:t>
-            </w:r>
-          </w:p>
-        </w:tc>
-      </w:tr>
-      <w:tr>
-        <w:tc>
-          <w:tcPr>
-            <w:tcW w:type="dxa" w:w="1568"/>
-          </w:tcPr>
-          <w:p>
-            <w:pPr>
-              <w:spacing w:line="240" w:lineRule="auto"/>
-            </w:pPr>
-            <w:r/>
-            <w:r>
-              <w:rPr>
-                <w:rFonts w:ascii="Times New Roman" w:hAnsi="Times New Roman" w:eastAsia="Times New Roman" w:cs="Times New Roman"/>
-                <w:color w:val="000000"/>
-                <w:sz w:val="20"/>
-              </w:rPr>
-              <w:t>23</w:t>
-            </w:r>
-          </w:p>
-        </w:tc>
-        <w:tc>
-          <w:tcPr>
-            <w:tcW w:type="dxa" w:w="1568"/>
-          </w:tcPr>
-          <w:p>
-            <w:pPr>
-              <w:spacing w:line="240" w:lineRule="auto"/>
-            </w:pPr>
-            <w:r/>
-            <w:r>
-              <w:rPr>
-                <w:rFonts w:ascii="Times New Roman" w:hAnsi="Times New Roman" w:eastAsia="Times New Roman" w:cs="Times New Roman"/>
-                <w:color w:val="000000"/>
-                <w:sz w:val="20"/>
-              </w:rPr>
-              <w:t>(Dean et Geloso, 2022)</w:t>
-            </w:r>
-          </w:p>
-        </w:tc>
-        <w:tc>
-          <w:tcPr>
-            <w:tcW w:type="dxa" w:w="1568"/>
-          </w:tcPr>
-          <w:p>
-            <w:pPr>
-              <w:spacing w:line="240" w:lineRule="auto"/>
-            </w:pPr>
-            <w:r/>
-            <w:r>
-              <w:rPr>
-                <w:rFonts w:ascii="Times New Roman" w:hAnsi="Times New Roman" w:eastAsia="Times New Roman" w:cs="Times New Roman"/>
-                <w:color w:val="000000"/>
-                <w:sz w:val="20"/>
-              </w:rPr>
-              <w:t>18</w:t>
-            </w:r>
-          </w:p>
-        </w:tc>
-        <w:tc>
-          <w:tcPr>
-            <w:tcW w:type="dxa" w:w="1568"/>
-          </w:tcPr>
-          <w:p>
-            <w:pPr>
-              <w:spacing w:line="240" w:lineRule="auto"/>
-            </w:pPr>
-            <w:r/>
-            <w:r>
-              <w:rPr>
-                <w:rFonts w:ascii="Times New Roman" w:hAnsi="Times New Roman" w:eastAsia="Times New Roman" w:cs="Times New Roman"/>
-                <w:color w:val="000000"/>
-                <w:sz w:val="20"/>
-              </w:rPr>
-              <w:t>GS</w:t>
-            </w:r>
-          </w:p>
-        </w:tc>
-        <w:tc>
-          <w:tcPr>
-            <w:tcW w:type="dxa" w:w="1568"/>
-          </w:tcPr>
-          <w:p>
-            <w:pPr>
-              <w:spacing w:line="240" w:lineRule="auto"/>
-            </w:pPr>
-            <w:r/>
-            <w:r>
-              <w:rPr>
-                <w:rFonts w:ascii="Times New Roman" w:hAnsi="Times New Roman" w:eastAsia="Times New Roman" w:cs="Times New Roman"/>
-                <w:color w:val="000000"/>
-                <w:sz w:val="20"/>
-              </w:rPr>
-              <w:t>4</w:t>
-            </w:r>
-          </w:p>
-        </w:tc>
-        <w:tc>
-          <w:tcPr>
-            <w:tcW w:type="dxa" w:w="1568"/>
-          </w:tcPr>
-          <w:p>
-            <w:pPr>
-              <w:spacing w:line="240" w:lineRule="auto"/>
-            </w:pPr>
-            <w:r/>
-            <w:r>
-              <w:rPr>
-                <w:rFonts w:ascii="Times New Roman" w:hAnsi="Times New Roman" w:eastAsia="Times New Roman" w:cs="Times New Roman"/>
-                <w:color w:val="000000"/>
-                <w:sz w:val="20"/>
-              </w:rPr>
-              <w:t>0.46</w:t>
-            </w:r>
-          </w:p>
-        </w:tc>
-      </w:tr>
-      <w:tr>
-        <w:tc>
-          <w:tcPr>
-            <w:tcW w:type="dxa" w:w="1568"/>
-          </w:tcPr>
-          <w:p>
-            <w:pPr>
-              <w:spacing w:line="240" w:lineRule="auto"/>
-            </w:pPr>
-            <w:r/>
-            <w:r>
-              <w:rPr>
-                <w:rFonts w:ascii="Times New Roman" w:hAnsi="Times New Roman" w:eastAsia="Times New Roman" w:cs="Times New Roman"/>
-                <w:color w:val="000000"/>
-                <w:sz w:val="20"/>
-              </w:rPr>
-              <w:t>24</w:t>
-            </w:r>
-          </w:p>
-        </w:tc>
-        <w:tc>
-          <w:tcPr>
-            <w:tcW w:type="dxa" w:w="1568"/>
-          </w:tcPr>
-          <w:p>
-            <w:pPr>
-              <w:spacing w:line="240" w:lineRule="auto"/>
-            </w:pPr>
-            <w:r/>
-            <w:r>
-              <w:rPr>
-                <w:rFonts w:ascii="Times New Roman" w:hAnsi="Times New Roman" w:eastAsia="Times New Roman" w:cs="Times New Roman"/>
-                <w:color w:val="000000"/>
-                <w:sz w:val="20"/>
-              </w:rPr>
-              <w:t>(Grenier et Nadeau, 2016)</w:t>
-            </w:r>
-          </w:p>
-        </w:tc>
-        <w:tc>
-          <w:tcPr>
-            <w:tcW w:type="dxa" w:w="1568"/>
-          </w:tcPr>
-          <w:p>
-            <w:pPr>
-              <w:spacing w:line="240" w:lineRule="auto"/>
-            </w:pPr>
-            <w:r/>
-            <w:r>
-              <w:rPr>
-                <w:rFonts w:ascii="Times New Roman" w:hAnsi="Times New Roman" w:eastAsia="Times New Roman" w:cs="Times New Roman"/>
-                <w:color w:val="000000"/>
-                <w:sz w:val="20"/>
-              </w:rPr>
-              <w:t>27</w:t>
-            </w:r>
-          </w:p>
-        </w:tc>
-        <w:tc>
-          <w:tcPr>
-            <w:tcW w:type="dxa" w:w="1568"/>
-          </w:tcPr>
-          <w:p>
-            <w:pPr>
-              <w:spacing w:line="240" w:lineRule="auto"/>
-            </w:pPr>
-            <w:r/>
-            <w:r>
-              <w:rPr>
-                <w:rFonts w:ascii="Times New Roman" w:hAnsi="Times New Roman" w:eastAsia="Times New Roman" w:cs="Times New Roman"/>
-                <w:color w:val="000000"/>
-                <w:sz w:val="20"/>
-              </w:rPr>
-              <w:t>GS</w:t>
-            </w:r>
-          </w:p>
-        </w:tc>
-        <w:tc>
-          <w:tcPr>
-            <w:tcW w:type="dxa" w:w="1568"/>
-          </w:tcPr>
-          <w:p>
-            <w:pPr>
-              <w:spacing w:line="240" w:lineRule="auto"/>
-            </w:pPr>
-            <w:r/>
-            <w:r>
-              <w:rPr>
-                <w:rFonts w:ascii="Times New Roman" w:hAnsi="Times New Roman" w:eastAsia="Times New Roman" w:cs="Times New Roman"/>
-                <w:color w:val="000000"/>
-                <w:sz w:val="20"/>
-              </w:rPr>
-              <w:t>4</w:t>
-            </w:r>
-          </w:p>
-        </w:tc>
-        <w:tc>
-          <w:tcPr>
-            <w:tcW w:type="dxa" w:w="1568"/>
-          </w:tcPr>
-          <w:p>
-            <w:pPr>
-              <w:spacing w:line="240" w:lineRule="auto"/>
-            </w:pPr>
-            <w:r/>
-            <w:r>
-              <w:rPr>
-                <w:rFonts w:ascii="Times New Roman" w:hAnsi="Times New Roman" w:eastAsia="Times New Roman" w:cs="Times New Roman"/>
-                <w:color w:val="000000"/>
-                <w:sz w:val="20"/>
-              </w:rPr>
-              <w:t>0.45</w:t>
-            </w:r>
-          </w:p>
-        </w:tc>
-      </w:tr>
-      <w:tr>
-        <w:tc>
-          <w:tcPr>
-            <w:tcW w:type="dxa" w:w="1568"/>
-          </w:tcPr>
-          <w:p>
-            <w:pPr>
-              <w:spacing w:line="240" w:lineRule="auto"/>
-            </w:pPr>
-            <w:r/>
-            <w:r>
-              <w:rPr>
-                <w:rFonts w:ascii="Times New Roman" w:hAnsi="Times New Roman" w:eastAsia="Times New Roman" w:cs="Times New Roman"/>
-                <w:color w:val="000000"/>
-                <w:sz w:val="20"/>
-              </w:rPr>
-              <w:t>25</w:t>
-            </w:r>
-          </w:p>
-        </w:tc>
-        <w:tc>
-          <w:tcPr>
-            <w:tcW w:type="dxa" w:w="1568"/>
-          </w:tcPr>
-          <w:p>
-            <w:pPr>
-              <w:spacing w:line="240" w:lineRule="auto"/>
-            </w:pPr>
-            <w:r/>
-            <w:r>
-              <w:rPr>
-                <w:rFonts w:ascii="Times New Roman" w:hAnsi="Times New Roman" w:eastAsia="Times New Roman" w:cs="Times New Roman"/>
-                <w:color w:val="000000"/>
-                <w:sz w:val="20"/>
-              </w:rPr>
-              <w:t>(Gagnon et al., 2023)</w:t>
-            </w:r>
-          </w:p>
-        </w:tc>
-        <w:tc>
-          <w:tcPr>
-            <w:tcW w:type="dxa" w:w="1568"/>
-          </w:tcPr>
-          <w:p>
-            <w:pPr>
-              <w:spacing w:line="240" w:lineRule="auto"/>
-            </w:pPr>
-            <w:r/>
-            <w:r>
-              <w:rPr>
-                <w:rFonts w:ascii="Times New Roman" w:hAnsi="Times New Roman" w:eastAsia="Times New Roman" w:cs="Times New Roman"/>
-                <w:color w:val="000000"/>
-                <w:sz w:val="20"/>
-              </w:rPr>
-              <w:t>12</w:t>
-            </w:r>
-          </w:p>
-        </w:tc>
-        <w:tc>
-          <w:tcPr>
-            <w:tcW w:type="dxa" w:w="1568"/>
-          </w:tcPr>
-          <w:p>
-            <w:pPr>
-              <w:spacing w:line="240" w:lineRule="auto"/>
-            </w:pPr>
-            <w:r/>
-            <w:r>
-              <w:rPr>
-                <w:rFonts w:ascii="Times New Roman" w:hAnsi="Times New Roman" w:eastAsia="Times New Roman" w:cs="Times New Roman"/>
-                <w:color w:val="000000"/>
-                <w:sz w:val="20"/>
-              </w:rPr>
-              <w:t>GS</w:t>
-            </w:r>
-          </w:p>
-        </w:tc>
-        <w:tc>
-          <w:tcPr>
-            <w:tcW w:type="dxa" w:w="1568"/>
-          </w:tcPr>
-          <w:p>
-            <w:pPr>
-              <w:spacing w:line="240" w:lineRule="auto"/>
-            </w:pPr>
-            <w:r/>
-            <w:r>
-              <w:rPr>
-                <w:rFonts w:ascii="Times New Roman" w:hAnsi="Times New Roman" w:eastAsia="Times New Roman" w:cs="Times New Roman"/>
-                <w:color w:val="000000"/>
-                <w:sz w:val="20"/>
-              </w:rPr>
-              <w:t>4</w:t>
-            </w:r>
-          </w:p>
-        </w:tc>
-        <w:tc>
-          <w:tcPr>
-            <w:tcW w:type="dxa" w:w="1568"/>
-          </w:tcPr>
-          <w:p>
-            <w:pPr>
-              <w:spacing w:line="240" w:lineRule="auto"/>
-            </w:pPr>
-            <w:r/>
-            <w:r>
-              <w:rPr>
-                <w:rFonts w:ascii="Times New Roman" w:hAnsi="Times New Roman" w:eastAsia="Times New Roman" w:cs="Times New Roman"/>
-                <w:color w:val="000000"/>
-                <w:sz w:val="20"/>
-              </w:rPr>
-              <w:t>0.45</w:t>
-            </w:r>
-          </w:p>
-        </w:tc>
-      </w:tr>
-      <w:tr>
-        <w:tc>
-          <w:tcPr>
-            <w:tcW w:type="dxa" w:w="1568"/>
-          </w:tcPr>
-          <w:p>
-            <w:pPr>
-              <w:spacing w:line="240" w:lineRule="auto"/>
-            </w:pPr>
-            <w:r/>
-            <w:r>
-              <w:rPr>
-                <w:rFonts w:ascii="Times New Roman" w:hAnsi="Times New Roman" w:eastAsia="Times New Roman" w:cs="Times New Roman"/>
-                <w:color w:val="000000"/>
-                <w:sz w:val="20"/>
-              </w:rPr>
-              <w:t>26</w:t>
-            </w:r>
-          </w:p>
-        </w:tc>
-        <w:tc>
-          <w:tcPr>
-            <w:tcW w:type="dxa" w:w="1568"/>
-          </w:tcPr>
-          <w:p>
-            <w:pPr>
-              <w:spacing w:line="240" w:lineRule="auto"/>
-            </w:pPr>
-            <w:r/>
-            <w:r>
-              <w:rPr>
-                <w:rFonts w:ascii="Times New Roman" w:hAnsi="Times New Roman" w:eastAsia="Times New Roman" w:cs="Times New Roman"/>
-                <w:color w:val="000000"/>
-                <w:sz w:val="20"/>
-              </w:rPr>
-              <w:t>(Vaillancourt, 2018)</w:t>
-            </w:r>
-          </w:p>
-        </w:tc>
-        <w:tc>
-          <w:tcPr>
-            <w:tcW w:type="dxa" w:w="1568"/>
-          </w:tcPr>
-          <w:p>
-            <w:pPr>
-              <w:spacing w:line="240" w:lineRule="auto"/>
-            </w:pPr>
-            <w:r/>
-            <w:r>
-              <w:rPr>
-                <w:rFonts w:ascii="Times New Roman" w:hAnsi="Times New Roman" w:eastAsia="Times New Roman" w:cs="Times New Roman"/>
-                <w:color w:val="000000"/>
-                <w:sz w:val="20"/>
-              </w:rPr>
-              <w:t>12</w:t>
-            </w:r>
-          </w:p>
-        </w:tc>
-        <w:tc>
-          <w:tcPr>
-            <w:tcW w:type="dxa" w:w="1568"/>
-          </w:tcPr>
-          <w:p>
-            <w:pPr>
-              <w:spacing w:line="240" w:lineRule="auto"/>
-            </w:pPr>
-            <w:r/>
-            <w:r>
-              <w:rPr>
-                <w:rFonts w:ascii="Times New Roman" w:hAnsi="Times New Roman" w:eastAsia="Times New Roman" w:cs="Times New Roman"/>
-                <w:color w:val="000000"/>
-                <w:sz w:val="20"/>
-              </w:rPr>
-              <w:t>GS</w:t>
-            </w:r>
-          </w:p>
-        </w:tc>
-        <w:tc>
-          <w:tcPr>
-            <w:tcW w:type="dxa" w:w="1568"/>
-          </w:tcPr>
-          <w:p>
-            <w:pPr>
-              <w:spacing w:line="240" w:lineRule="auto"/>
-            </w:pPr>
-            <w:r/>
-            <w:r>
-              <w:rPr>
-                <w:rFonts w:ascii="Times New Roman" w:hAnsi="Times New Roman" w:eastAsia="Times New Roman" w:cs="Times New Roman"/>
-                <w:color w:val="000000"/>
-                <w:sz w:val="20"/>
-              </w:rPr>
-              <w:t>7</w:t>
-            </w:r>
-          </w:p>
-        </w:tc>
-        <w:tc>
-          <w:tcPr>
-            <w:tcW w:type="dxa" w:w="1568"/>
-          </w:tcPr>
-          <w:p>
-            <w:pPr>
-              <w:spacing w:line="240" w:lineRule="auto"/>
-            </w:pPr>
-            <w:r/>
-            <w:r>
-              <w:rPr>
-                <w:rFonts w:ascii="Times New Roman" w:hAnsi="Times New Roman" w:eastAsia="Times New Roman" w:cs="Times New Roman"/>
-                <w:color w:val="000000"/>
-                <w:sz w:val="20"/>
-              </w:rPr>
-              <w:t>0.44</w:t>
-            </w:r>
-          </w:p>
-        </w:tc>
-      </w:tr>
-      <w:tr>
-        <w:tc>
-          <w:tcPr>
-            <w:tcW w:type="dxa" w:w="1568"/>
-          </w:tcPr>
-          <w:p>
-            <w:pPr>
-              <w:spacing w:line="240" w:lineRule="auto"/>
-            </w:pPr>
-            <w:r/>
-            <w:r>
-              <w:rPr>
-                <w:rFonts w:ascii="Times New Roman" w:hAnsi="Times New Roman" w:eastAsia="Times New Roman" w:cs="Times New Roman"/>
-                <w:color w:val="000000"/>
-                <w:sz w:val="20"/>
-              </w:rPr>
-              <w:t>27</w:t>
-            </w:r>
-          </w:p>
-        </w:tc>
-        <w:tc>
-          <w:tcPr>
-            <w:tcW w:type="dxa" w:w="1568"/>
-          </w:tcPr>
-          <w:p>
-            <w:pPr>
-              <w:spacing w:line="240" w:lineRule="auto"/>
-            </w:pPr>
-            <w:r/>
-            <w:r>
-              <w:rPr>
-                <w:rFonts w:ascii="Times New Roman" w:hAnsi="Times New Roman" w:eastAsia="Times New Roman" w:cs="Times New Roman"/>
-                <w:color w:val="000000"/>
-                <w:sz w:val="20"/>
-              </w:rPr>
-              <w:t>(Grenier, 2019)</w:t>
-            </w:r>
-          </w:p>
-        </w:tc>
-        <w:tc>
-          <w:tcPr>
-            <w:tcW w:type="dxa" w:w="1568"/>
-          </w:tcPr>
-          <w:p>
-            <w:pPr>
-              <w:spacing w:line="240" w:lineRule="auto"/>
-            </w:pPr>
-            <w:r/>
-            <w:r>
-              <w:rPr>
-                <w:rFonts w:ascii="Times New Roman" w:hAnsi="Times New Roman" w:eastAsia="Times New Roman" w:cs="Times New Roman"/>
-                <w:color w:val="000000"/>
-                <w:sz w:val="20"/>
-              </w:rPr>
-              <w:t>11</w:t>
-            </w:r>
-          </w:p>
-        </w:tc>
-        <w:tc>
-          <w:tcPr>
-            <w:tcW w:type="dxa" w:w="1568"/>
-          </w:tcPr>
-          <w:p>
-            <w:pPr>
-              <w:spacing w:line="240" w:lineRule="auto"/>
-            </w:pPr>
-            <w:r/>
-            <w:r>
-              <w:rPr>
-                <w:rFonts w:ascii="Times New Roman" w:hAnsi="Times New Roman" w:eastAsia="Times New Roman" w:cs="Times New Roman"/>
-                <w:color w:val="000000"/>
-                <w:sz w:val="20"/>
-              </w:rPr>
-              <w:t>Cons. cal.</w:t>
-            </w:r>
-          </w:p>
-        </w:tc>
-        <w:tc>
-          <w:tcPr>
-            <w:tcW w:type="dxa" w:w="1568"/>
-          </w:tcPr>
-          <w:p>
-            <w:pPr>
-              <w:spacing w:line="240" w:lineRule="auto"/>
-            </w:pPr>
-            <w:r/>
-            <w:r>
-              <w:rPr>
-                <w:rFonts w:ascii="Times New Roman" w:hAnsi="Times New Roman" w:eastAsia="Times New Roman" w:cs="Times New Roman"/>
-                <w:color w:val="000000"/>
-                <w:sz w:val="20"/>
-              </w:rPr>
-              <w:t>6</w:t>
-            </w:r>
-          </w:p>
-        </w:tc>
-        <w:tc>
-          <w:tcPr>
-            <w:tcW w:type="dxa" w:w="1568"/>
-          </w:tcPr>
-          <w:p>
-            <w:pPr>
-              <w:spacing w:line="240" w:lineRule="auto"/>
-            </w:pPr>
-            <w:r/>
-            <w:r>
-              <w:rPr>
-                <w:rFonts w:ascii="Times New Roman" w:hAnsi="Times New Roman" w:eastAsia="Times New Roman" w:cs="Times New Roman"/>
-                <w:color w:val="000000"/>
-                <w:sz w:val="20"/>
-              </w:rPr>
-              <w:t>0.44</w:t>
-            </w:r>
-          </w:p>
-        </w:tc>
-      </w:tr>
-      <w:tr>
-        <w:tc>
-          <w:tcPr>
-            <w:tcW w:type="dxa" w:w="1568"/>
-          </w:tcPr>
-          <w:p>
-            <w:pPr>
-              <w:spacing w:line="240" w:lineRule="auto"/>
-            </w:pPr>
-            <w:r/>
-            <w:r>
-              <w:rPr>
-                <w:rFonts w:ascii="Times New Roman" w:hAnsi="Times New Roman" w:eastAsia="Times New Roman" w:cs="Times New Roman"/>
-                <w:color w:val="000000"/>
-                <w:sz w:val="20"/>
-              </w:rPr>
-              <w:t>28</w:t>
-            </w:r>
-          </w:p>
-        </w:tc>
-        <w:tc>
-          <w:tcPr>
-            <w:tcW w:type="dxa" w:w="1568"/>
-          </w:tcPr>
-          <w:p>
-            <w:pPr>
-              <w:spacing w:line="240" w:lineRule="auto"/>
-            </w:pPr>
-            <w:r/>
-            <w:r>
-              <w:rPr>
-                <w:rFonts w:ascii="Times New Roman" w:hAnsi="Times New Roman" w:eastAsia="Times New Roman" w:cs="Times New Roman"/>
-                <w:color w:val="000000"/>
-                <w:sz w:val="20"/>
-              </w:rPr>
-              <w:t>(Vaillancourt et Touchette, 2001)</w:t>
-            </w:r>
-          </w:p>
-        </w:tc>
-        <w:tc>
-          <w:tcPr>
-            <w:tcW w:type="dxa" w:w="1568"/>
-          </w:tcPr>
-          <w:p>
-            <w:pPr>
-              <w:spacing w:line="240" w:lineRule="auto"/>
-            </w:pPr>
-            <w:r/>
-            <w:r>
-              <w:rPr>
-                <w:rFonts w:ascii="Times New Roman" w:hAnsi="Times New Roman" w:eastAsia="Times New Roman" w:cs="Times New Roman"/>
-                <w:color w:val="000000"/>
-                <w:sz w:val="20"/>
-              </w:rPr>
-              <w:t>33</w:t>
-            </w:r>
-          </w:p>
-        </w:tc>
-        <w:tc>
-          <w:tcPr>
-            <w:tcW w:type="dxa" w:w="1568"/>
-          </w:tcPr>
-          <w:p>
-            <w:pPr>
-              <w:spacing w:line="240" w:lineRule="auto"/>
-            </w:pPr>
-            <w:r/>
-            <w:r>
-              <w:rPr>
-                <w:rFonts w:ascii="Times New Roman" w:hAnsi="Times New Roman" w:eastAsia="Times New Roman" w:cs="Times New Roman"/>
-                <w:color w:val="000000"/>
-                <w:sz w:val="20"/>
-              </w:rPr>
-              <w:t>imputé</w:t>
-            </w:r>
-          </w:p>
-        </w:tc>
-        <w:tc>
-          <w:tcPr>
-            <w:tcW w:type="dxa" w:w="1568"/>
-          </w:tcPr>
-          <w:p>
-            <w:pPr>
-              <w:spacing w:line="240" w:lineRule="auto"/>
-            </w:pPr>
-            <w:r/>
-            <w:r>
-              <w:rPr>
-                <w:rFonts w:ascii="Times New Roman" w:hAnsi="Times New Roman" w:eastAsia="Times New Roman" w:cs="Times New Roman"/>
-                <w:color w:val="000000"/>
-                <w:sz w:val="20"/>
-              </w:rPr>
-              <w:t>13</w:t>
-            </w:r>
-          </w:p>
-        </w:tc>
-        <w:tc>
-          <w:tcPr>
-            <w:tcW w:type="dxa" w:w="1568"/>
-          </w:tcPr>
-          <w:p>
-            <w:pPr>
-              <w:spacing w:line="240" w:lineRule="auto"/>
-            </w:pPr>
-            <w:r/>
-            <w:r>
-              <w:rPr>
-                <w:rFonts w:ascii="Times New Roman" w:hAnsi="Times New Roman" w:eastAsia="Times New Roman" w:cs="Times New Roman"/>
-                <w:color w:val="000000"/>
-                <w:sz w:val="20"/>
-              </w:rPr>
-              <w:t>0.44</w:t>
-            </w:r>
-          </w:p>
-        </w:tc>
-      </w:tr>
-      <w:tr>
-        <w:tc>
-          <w:tcPr>
-            <w:tcW w:type="dxa" w:w="1568"/>
-          </w:tcPr>
-          <w:p>
-            <w:pPr>
-              <w:spacing w:line="240" w:lineRule="auto"/>
-            </w:pPr>
-            <w:r/>
-            <w:r>
-              <w:rPr>
-                <w:rFonts w:ascii="Times New Roman" w:hAnsi="Times New Roman" w:eastAsia="Times New Roman" w:cs="Times New Roman"/>
-                <w:color w:val="000000"/>
-                <w:sz w:val="20"/>
-              </w:rPr>
-              <w:t>29</w:t>
-            </w:r>
-          </w:p>
-        </w:tc>
-        <w:tc>
-          <w:tcPr>
-            <w:tcW w:type="dxa" w:w="1568"/>
-          </w:tcPr>
-          <w:p>
-            <w:pPr>
-              <w:spacing w:line="240" w:lineRule="auto"/>
-            </w:pPr>
-            <w:r/>
-            <w:r>
-              <w:rPr>
-                <w:rFonts w:ascii="Times New Roman" w:hAnsi="Times New Roman" w:eastAsia="Times New Roman" w:cs="Times New Roman"/>
-                <w:color w:val="000000"/>
-                <w:sz w:val="20"/>
-              </w:rPr>
-              <w:t>(Pettinicchio, 2012)</w:t>
-            </w:r>
-          </w:p>
-        </w:tc>
-        <w:tc>
-          <w:tcPr>
-            <w:tcW w:type="dxa" w:w="1568"/>
-          </w:tcPr>
-          <w:p>
-            <w:pPr>
-              <w:spacing w:line="240" w:lineRule="auto"/>
-            </w:pPr>
-            <w:r/>
-            <w:r>
-              <w:rPr>
-                <w:rFonts w:ascii="Times New Roman" w:hAnsi="Times New Roman" w:eastAsia="Times New Roman" w:cs="Times New Roman"/>
-                <w:color w:val="000000"/>
-                <w:sz w:val="20"/>
-              </w:rPr>
-              <w:t>31</w:t>
-            </w:r>
-          </w:p>
-        </w:tc>
-        <w:tc>
-          <w:tcPr>
-            <w:tcW w:type="dxa" w:w="1568"/>
-          </w:tcPr>
-          <w:p>
-            <w:pPr>
-              <w:spacing w:line="240" w:lineRule="auto"/>
-            </w:pPr>
-            <w:r/>
-            <w:r>
-              <w:rPr>
-                <w:rFonts w:ascii="Times New Roman" w:hAnsi="Times New Roman" w:eastAsia="Times New Roman" w:cs="Times New Roman"/>
-                <w:color w:val="000000"/>
-                <w:sz w:val="20"/>
-              </w:rPr>
-              <w:t>Cons. cal.</w:t>
-            </w:r>
-          </w:p>
-        </w:tc>
-        <w:tc>
-          <w:tcPr>
-            <w:tcW w:type="dxa" w:w="1568"/>
-          </w:tcPr>
-          <w:p>
-            <w:pPr>
-              <w:spacing w:line="240" w:lineRule="auto"/>
-            </w:pPr>
-            <w:r/>
-            <w:r>
-              <w:rPr>
-                <w:rFonts w:ascii="Times New Roman" w:hAnsi="Times New Roman" w:eastAsia="Times New Roman" w:cs="Times New Roman"/>
-                <w:color w:val="000000"/>
-                <w:sz w:val="20"/>
-              </w:rPr>
-              <w:t>2</w:t>
-            </w:r>
-          </w:p>
-        </w:tc>
-        <w:tc>
-          <w:tcPr>
-            <w:tcW w:type="dxa" w:w="1568"/>
-          </w:tcPr>
-          <w:p>
-            <w:pPr>
-              <w:spacing w:line="240" w:lineRule="auto"/>
-            </w:pPr>
-            <w:r/>
-            <w:r>
-              <w:rPr>
-                <w:rFonts w:ascii="Times New Roman" w:hAnsi="Times New Roman" w:eastAsia="Times New Roman" w:cs="Times New Roman"/>
-                <w:color w:val="000000"/>
-                <w:sz w:val="20"/>
-              </w:rPr>
-              <w:t>0.44</w:t>
-            </w:r>
-          </w:p>
-        </w:tc>
-      </w:tr>
-      <w:tr>
-        <w:tc>
-          <w:tcPr>
-            <w:tcW w:type="dxa" w:w="1568"/>
-          </w:tcPr>
-          <w:p>
-            <w:pPr>
-              <w:spacing w:line="240" w:lineRule="auto"/>
-            </w:pPr>
-            <w:r/>
-            <w:r>
-              <w:rPr>
-                <w:rFonts w:ascii="Times New Roman" w:hAnsi="Times New Roman" w:eastAsia="Times New Roman" w:cs="Times New Roman"/>
-                <w:color w:val="000000"/>
-                <w:sz w:val="20"/>
-              </w:rPr>
-              <w:t>30</w:t>
-            </w:r>
-          </w:p>
-        </w:tc>
-        <w:tc>
-          <w:tcPr>
-            <w:tcW w:type="dxa" w:w="1568"/>
-          </w:tcPr>
-          <w:p>
-            <w:pPr>
-              <w:spacing w:line="240" w:lineRule="auto"/>
-            </w:pPr>
-            <w:r/>
-            <w:r>
-              <w:rPr>
-                <w:rFonts w:ascii="Times New Roman" w:hAnsi="Times New Roman" w:eastAsia="Times New Roman" w:cs="Times New Roman"/>
-                <w:color w:val="000000"/>
-                <w:sz w:val="20"/>
-              </w:rPr>
-              <w:t>(Vaillancourt et Vaillancourt, 2005)</w:t>
-            </w:r>
-          </w:p>
-        </w:tc>
-        <w:tc>
-          <w:tcPr>
-            <w:tcW w:type="dxa" w:w="1568"/>
-          </w:tcPr>
-          <w:p>
-            <w:pPr>
-              <w:spacing w:line="240" w:lineRule="auto"/>
-            </w:pPr>
-            <w:r/>
-            <w:r>
-              <w:rPr>
-                <w:rFonts w:ascii="Times New Roman" w:hAnsi="Times New Roman" w:eastAsia="Times New Roman" w:cs="Times New Roman"/>
-                <w:color w:val="000000"/>
-                <w:sz w:val="20"/>
-              </w:rPr>
-              <w:t>33</w:t>
-            </w:r>
-          </w:p>
-        </w:tc>
-        <w:tc>
-          <w:tcPr>
-            <w:tcW w:type="dxa" w:w="1568"/>
-          </w:tcPr>
-          <w:p>
-            <w:pPr>
-              <w:spacing w:line="240" w:lineRule="auto"/>
-            </w:pPr>
-            <w:r/>
-            <w:r>
-              <w:rPr>
-                <w:rFonts w:ascii="Times New Roman" w:hAnsi="Times New Roman" w:eastAsia="Times New Roman" w:cs="Times New Roman"/>
-                <w:color w:val="000000"/>
-                <w:sz w:val="20"/>
-              </w:rPr>
-              <w:t>imputé</w:t>
-            </w:r>
-          </w:p>
-        </w:tc>
-        <w:tc>
-          <w:tcPr>
-            <w:tcW w:type="dxa" w:w="1568"/>
-          </w:tcPr>
-          <w:p>
-            <w:pPr>
-              <w:spacing w:line="240" w:lineRule="auto"/>
-            </w:pPr>
-            <w:r/>
-            <w:r>
-              <w:rPr>
-                <w:rFonts w:ascii="Times New Roman" w:hAnsi="Times New Roman" w:eastAsia="Times New Roman" w:cs="Times New Roman"/>
-                <w:color w:val="000000"/>
-                <w:sz w:val="20"/>
-              </w:rPr>
-              <w:t>7</w:t>
-            </w:r>
-          </w:p>
-        </w:tc>
-        <w:tc>
-          <w:tcPr>
-            <w:tcW w:type="dxa" w:w="1568"/>
-          </w:tcPr>
-          <w:p>
-            <w:pPr>
-              <w:spacing w:line="240" w:lineRule="auto"/>
-            </w:pPr>
-            <w:r/>
-            <w:r>
-              <w:rPr>
-                <w:rFonts w:ascii="Times New Roman" w:hAnsi="Times New Roman" w:eastAsia="Times New Roman" w:cs="Times New Roman"/>
-                <w:color w:val="000000"/>
-                <w:sz w:val="20"/>
-              </w:rPr>
-              <w:t>0.43</w:t>
-            </w:r>
-          </w:p>
-        </w:tc>
-      </w:tr>
-    </w:tbl>
-    <w:p>
-      <w:pPr>
-        <w:pStyle w:val="Caption"/>
-        <w:spacing w:line="240" w:lineRule="auto"/>
-      </w:pPr>
-      <w:r>
-        <w:rPr>
-          <w:rFonts w:ascii="Times New Roman" w:hAnsi="Times New Roman" w:eastAsia="Times New Roman" w:cs="Times New Roman"/>
-          <w:color w:val="000000"/>
-          <w:sz w:val="24"/>
-        </w:rPr>
-        <w:t>Tableau 1. Composantes de l'indice de pertinence des trente lectures (GS : Google Scholar ; Cons. cal. : compte Consensus ramené à l'échelle Google Scholar ; imputé : médiane).</w:t>
-      </w:r>
-    </w:p>
-    <w:p>
-      <w:pPr>
-        <w:pStyle w:val="Heading1"/>
-      </w:pPr>
-      <w:r>
-        <w:rPr>
-          <w:rFonts w:ascii="Times New Roman" w:hAnsi="Times New Roman" w:eastAsia="Times New Roman" w:cs="Times New Roman"/>
-          <w:b/>
-          <w:color w:val="000000"/>
-          <w:sz w:val="24"/>
-        </w:rPr>
-        <w:t>3. Bibliographie {-}</w:t>
+        <w:t>4. Bibliographie {-}</w:t>
       </w:r>
     </w:p>
     <w:p>

</xml_diff>

<commit_message>
Gabarit : bibliographie BibTeX (references.bib + citeproc, nocite du top 30), citations pandoc, sans mention de la CLESSN
Co-Authored-By: Claude Fable 5.1 <noreply@anthropic.com>
Claude-Session: https://claude.ai/code/session_01445z6xKrBFqCGGPpGngyXf
</commit_message>
<xml_diff>
--- a/Gabarit/gabarit_snowballing.docx
+++ b/Gabarit/gabarit_snowballing.docx
@@ -159,7 +159,7 @@
           <w:color w:val="000000"/>
           <w:sz w:val="24"/>
         </w:rPr>
-        <w:t>Nombre total de mots : 387 (page titre et bibliographie exclues)</w:t>
+        <w:t>Nombre total de mots : 356 (page titre et bibliographie exclues)</w:t>
       </w:r>
     </w:p>
     <w:p>
@@ -243,7 +243,7 @@
           <w:color w:val="000000"/>
           <w:sz w:val="24"/>
         </w:rPr>
-        <w:t xml:space="preserve"> (Jalali et Wohlin, 2012) enseignée par la CLESSN : à partir d'un ensemble de départ de onze publications récentes couvrant cinq communautés savantes (économie du langage, histoire économique, sociologie de la stratification, aménagement linguistique, littérature grise sur le recensement de 2021), on dépouille les listes de références (</w:t>
+        <w:t xml:space="preserve"> (Jalali et Wohlin, 2012) : à partir d'un ensemble de départ de onze publications récentes couvrant cinq communautés savantes (économie du langage, histoire économique, sociologie de la stratification, aménagement linguistique, littérature grise sur le recensement de 2021), on dépouille les listes de références (</w:t>
       </w:r>
       <w:r>
         <w:rPr>
@@ -325,7 +325,7 @@
           <w:color w:val="000000"/>
           <w:sz w:val="24"/>
         </w:rPr>
-        <w:t xml:space="preserve">, sinon compte Consensus ramené à l'échelle de Google Scholar), l'année de publication et la récurrence, soit le nombre de bibliographies du corpus qui citent la publication. La figure 1 classe les trente publications incluses les mieux notées ; la figure 2 montre comment elles se citent, la disposition par forces rapprochant les textes qui se citent mutuellement. Les fondateurs vers lesquels convergent les flèches (Commission royale d'enquête sur le bilinguisme et le biculturalisme, 1969 ; Raynauld, Marion et Béland, 1966 ; Vaillancourt, 1980) s'y distinguent des synthèses récentes qui citent sans être encore citées. La grille (CSV et Excel), les bibliographies, les scripts Python (construction de la grille, score, réseau, export Zotero) et le code R des figures sont dans le dépôt GitHub </w:t>
+        <w:t xml:space="preserve">, sinon compte Consensus ramené à l'échelle de Google Scholar), l'année de publication et la récurrence, soit le nombre de bibliographies du corpus qui citent la publication. La figure 1 classe les trente publications incluses les mieux notées ; la figure 2 montre comment elles se citent, la disposition par forces rapprochant les textes qui se citent mutuellement. Les fondateurs vers lesquels convergent les flèches (Commission B-B, 1969 ; Raynauld et al., 1966 ; Vaillancourt, 1980) s'y distinguent des synthèses récentes qui citent sans être encore citées. La grille, les bibliographies, les scripts Python (grille, score, réseau, export Zotero) et le code R des figures sont dans le dépôt GitHub </w:t>
       </w:r>
       <w:r>
         <w:rPr>
@@ -341,7 +341,7 @@
           <w:color w:val="000000"/>
           <w:sz w:val="24"/>
         </w:rPr>
-        <w:t xml:space="preserve"> ; les bibliographies ayant été reconstituées sans accès aux PDF, les récurrences sont des bornes inférieures.</w:t>
+        <w:t xml:space="preserve"> ; les bibliographies ayant été reconstituées sans les PDF, les récurrences sont des bornes inférieures.</w:t>
       </w:r>
     </w:p>
     <w:p>
@@ -489,21 +489,7 @@
           <w:color w:val="000000"/>
           <w:sz w:val="24"/>
         </w:rPr>
-        <w:t>4. Bibliographie {-}</w:t>
-      </w:r>
-    </w:p>
-    <w:p>
-      <w:pPr>
-        <w:spacing w:line="480" w:lineRule="auto"/>
-        <w:jc w:val="both"/>
-      </w:pPr>
-      <w:r>
-        <w:rPr>
-          <w:rFonts w:ascii="Times New Roman" w:hAnsi="Times New Roman" w:eastAsia="Times New Roman" w:cs="Times New Roman"/>
-          <w:color w:val="000000"/>
-          <w:sz w:val="24"/>
-        </w:rPr>
-        <w:t>&lt;div class="bibliographie"&gt;</w:t>
+        <w:t>Bibliographie</w:t>
       </w:r>
     </w:p>
     <w:p>
@@ -534,6 +520,36 @@
           <w:sz w:val="24"/>
         </w:rPr>
         <w:t>. https://doi.org/10.1111/j.1540-5982.2008.00501.x</w:t>
+      </w:r>
+    </w:p>
+    <w:p>
+      <w:pPr>
+        <w:ind w:left="709" w:hanging="709"/>
+      </w:pPr>
+      <w:r>
+        <w:rPr>
+          <w:rFonts w:ascii="Times New Roman" w:hAnsi="Times New Roman" w:eastAsia="Times New Roman" w:cs="Times New Roman"/>
+          <w:color w:val="000000"/>
+          <w:sz w:val="24"/>
+        </w:rPr>
+        <w:t xml:space="preserve">Blishen, B. R. (1958). The construction and use of an occupational class scale. </w:t>
+      </w:r>
+      <w:r>
+        <w:rPr>
+          <w:rFonts w:ascii="Times New Roman" w:hAnsi="Times New Roman" w:eastAsia="Times New Roman" w:cs="Times New Roman"/>
+          <w:i/>
+          <w:color w:val="000000"/>
+          <w:sz w:val="24"/>
+        </w:rPr>
+        <w:t>Canadian Journal of Economics and Political Science, 24(4), 519-531</w:t>
+      </w:r>
+      <w:r>
+        <w:rPr>
+          <w:rFonts w:ascii="Times New Roman" w:hAnsi="Times New Roman" w:eastAsia="Times New Roman" w:cs="Times New Roman"/>
+          <w:color w:val="000000"/>
+          <w:sz w:val="24"/>
+        </w:rPr>
+        <w:t>. https://doi.org/10.2307/139088</w:t>
       </w:r>
     </w:p>
     <w:p>
@@ -675,7 +691,7 @@
           <w:color w:val="000000"/>
           <w:sz w:val="24"/>
         </w:rPr>
-        <w:t>Research in Population Economics, 6, 183-228 (réédité 2007 dans The Economics of Language, Routledge)</w:t>
+        <w:t>Research in Population Economics, 6, 183-228</w:t>
       </w:r>
       <w:r>
         <w:rPr>
@@ -1408,6 +1424,36 @@
     </w:p>
     <w:p>
       <w:pPr>
+        <w:ind w:left="709" w:hanging="709"/>
+      </w:pPr>
+      <w:r>
+        <w:rPr>
+          <w:rFonts w:ascii="Times New Roman" w:hAnsi="Times New Roman" w:eastAsia="Times New Roman" w:cs="Times New Roman"/>
+          <w:color w:val="000000"/>
+          <w:sz w:val="24"/>
+        </w:rPr>
+        <w:t xml:space="preserve">Jalali, S. et Wohlin, C. (2012). Systematic literature studies: Database searches vs. backward snowballing. </w:t>
+      </w:r>
+      <w:r>
+        <w:rPr>
+          <w:rFonts w:ascii="Times New Roman" w:hAnsi="Times New Roman" w:eastAsia="Times New Roman" w:cs="Times New Roman"/>
+          <w:i/>
+          <w:color w:val="000000"/>
+          <w:sz w:val="24"/>
+        </w:rPr>
+        <w:t>Proceedings of the ACM-IEEE International Symposium on Empirical Software Engineering and Measurement</w:t>
+      </w:r>
+      <w:r>
+        <w:rPr>
+          <w:rFonts w:ascii="Times New Roman" w:hAnsi="Times New Roman" w:eastAsia="Times New Roman" w:cs="Times New Roman"/>
+          <w:color w:val="000000"/>
+          <w:sz w:val="24"/>
+        </w:rPr>
+        <w:t>, 29-38. https://doi.org/10.1145/2372251.2372257</w:t>
+      </w:r>
+    </w:p>
+    <w:p>
+      <w:pPr>
         <w:spacing w:line="480" w:lineRule="auto"/>
         <w:jc w:val="both"/>
       </w:pPr>
@@ -1417,7 +1463,7 @@
           <w:color w:val="000000"/>
           <w:sz w:val="24"/>
         </w:rPr>
-        <w:t>&lt;/div&gt;</w:t>
+        <w:t>::: {#refs} :::</w:t>
       </w:r>
     </w:p>
     <w:sectPr>

</xml_diff>

<commit_message>
Comptes Google Scholar : 61 publications (second passage), trois appariements rejetés, ratio 2,41 ; sorties régénérées
Co-Authored-By: Claude Fable 5.1 <noreply@anthropic.com>
Claude-Session: https://claude.ai/code/session_01445z6xKrBFqCGGPpGngyXf
</commit_message>
<xml_diff>
--- a/Gabarit/gabarit_snowballing.docx
+++ b/Gabarit/gabarit_snowballing.docx
@@ -652,6 +652,36 @@
           <w:color w:val="000000"/>
           <w:sz w:val="24"/>
         </w:rPr>
+        <w:t xml:space="preserve">Boyd, M., Goyder, J., Jones, F. E., McRoberts, H. A., Pineo, P. C. et Porter, J. (1985). Ascription and Achievement: Studies in Mobility and Status Attainment in Canada. </w:t>
+      </w:r>
+      <w:r>
+        <w:rPr>
+          <w:rFonts w:ascii="Times New Roman" w:hAnsi="Times New Roman" w:eastAsia="Times New Roman" w:cs="Times New Roman"/>
+          <w:i/>
+          <w:color w:val="000000"/>
+          <w:sz w:val="24"/>
+        </w:rPr>
+        <w:t>Ottawa : Carleton University Press</w:t>
+      </w:r>
+      <w:r>
+        <w:rPr>
+          <w:rFonts w:ascii="Times New Roman" w:hAnsi="Times New Roman" w:eastAsia="Times New Roman" w:cs="Times New Roman"/>
+          <w:color w:val="000000"/>
+          <w:sz w:val="24"/>
+        </w:rPr>
+        <w:t>.</w:t>
+      </w:r>
+    </w:p>
+    <w:p>
+      <w:pPr>
+        <w:ind w:left="709" w:hanging="709"/>
+      </w:pPr>
+      <w:r>
+        <w:rPr>
+          <w:rFonts w:ascii="Times New Roman" w:hAnsi="Times New Roman" w:eastAsia="Times New Roman" w:cs="Times New Roman"/>
+          <w:color w:val="000000"/>
+          <w:sz w:val="24"/>
+        </w:rPr>
         <w:t xml:space="preserve">Carliner, G. (1981). Wage differences by language group and the market for language skills in Canada. </w:t>
       </w:r>
       <w:r>
@@ -892,36 +922,6 @@
           <w:color w:val="000000"/>
           <w:sz w:val="24"/>
         </w:rPr>
-        <w:t xml:space="preserve">Grenier, G. (2019). Quebec's language policy and economic globalization. </w:t>
-      </w:r>
-      <w:r>
-        <w:rPr>
-          <w:rFonts w:ascii="Times New Roman" w:hAnsi="Times New Roman" w:eastAsia="Times New Roman" w:cs="Times New Roman"/>
-          <w:i/>
-          <w:color w:val="000000"/>
-          <w:sz w:val="24"/>
-        </w:rPr>
-        <w:t>Language Problems and Language Planning, 43(2)</w:t>
-      </w:r>
-      <w:r>
-        <w:rPr>
-          <w:rFonts w:ascii="Times New Roman" w:hAnsi="Times New Roman" w:eastAsia="Times New Roman" w:cs="Times New Roman"/>
-          <w:color w:val="000000"/>
-          <w:sz w:val="24"/>
-        </w:rPr>
-        <w:t>. https://doi.org/10.1075/lplp.00041.gre</w:t>
-      </w:r>
-    </w:p>
-    <w:p>
-      <w:pPr>
-        <w:ind w:left="709" w:hanging="709"/>
-      </w:pPr>
-      <w:r>
-        <w:rPr>
-          <w:rFonts w:ascii="Times New Roman" w:hAnsi="Times New Roman" w:eastAsia="Times New Roman" w:cs="Times New Roman"/>
-          <w:color w:val="000000"/>
-          <w:sz w:val="24"/>
-        </w:rPr>
         <w:t xml:space="preserve">Grenier, G. et Nadeau, S. (2016). English as the lingua franca and the economic value of other languages: The case of the language of work in the Montreal labor market. </w:t>
       </w:r>
       <w:r>
@@ -1060,36 +1060,6 @@
           <w:sz w:val="24"/>
         </w:rPr>
         <w:t>. https://www.oqlf.gouv.qc.ca/ressources/sociolinguistique/2022/2022_etude_revenu-emploi-selon-langues-utilisees-travail.pdf</w:t>
-      </w:r>
-    </w:p>
-    <w:p>
-      <w:pPr>
-        <w:ind w:left="709" w:hanging="709"/>
-      </w:pPr>
-      <w:r>
-        <w:rPr>
-          <w:rFonts w:ascii="Times New Roman" w:hAnsi="Times New Roman" w:eastAsia="Times New Roman" w:cs="Times New Roman"/>
-          <w:color w:val="000000"/>
-          <w:sz w:val="24"/>
-        </w:rPr>
-        <w:t xml:space="preserve">Pettinicchio, D. (2012). Migration and ethnic nationalism: Anglophone exit and the 'decolonisation' of Québec. </w:t>
-      </w:r>
-      <w:r>
-        <w:rPr>
-          <w:rFonts w:ascii="Times New Roman" w:hAnsi="Times New Roman" w:eastAsia="Times New Roman" w:cs="Times New Roman"/>
-          <w:i/>
-          <w:color w:val="000000"/>
-          <w:sz w:val="24"/>
-        </w:rPr>
-        <w:t>Nations and Nationalism, 18(4), 719-743</w:t>
-      </w:r>
-      <w:r>
-        <w:rPr>
-          <w:rFonts w:ascii="Times New Roman" w:hAnsi="Times New Roman" w:eastAsia="Times New Roman" w:cs="Times New Roman"/>
-          <w:color w:val="000000"/>
-          <w:sz w:val="24"/>
-        </w:rPr>
-        <w:t>. https://doi.org/10.1111/j.1469-8129.2011.00513.x</w:t>
       </w:r>
     </w:p>
     <w:p>
@@ -1252,6 +1222,36 @@
           <w:color w:val="000000"/>
           <w:sz w:val="24"/>
         </w:rPr>
+        <w:t xml:space="preserve">Vaillancourt, F. (1988). Langue et disparités de statut économique au Québec, 1970 et 1980. </w:t>
+      </w:r>
+      <w:r>
+        <w:rPr>
+          <w:rFonts w:ascii="Times New Roman" w:hAnsi="Times New Roman" w:eastAsia="Times New Roman" w:cs="Times New Roman"/>
+          <w:i/>
+          <w:color w:val="000000"/>
+          <w:sz w:val="24"/>
+        </w:rPr>
+        <w:t>Québec : Conseil de la langue française, coll. Dossiers no 28</w:t>
+      </w:r>
+      <w:r>
+        <w:rPr>
+          <w:rFonts w:ascii="Times New Roman" w:hAnsi="Times New Roman" w:eastAsia="Times New Roman" w:cs="Times New Roman"/>
+          <w:color w:val="000000"/>
+          <w:sz w:val="24"/>
+        </w:rPr>
+        <w:t>.</w:t>
+      </w:r>
+    </w:p>
+    <w:p>
+      <w:pPr>
+        <w:ind w:left="709" w:hanging="709"/>
+      </w:pPr>
+      <w:r>
+        <w:rPr>
+          <w:rFonts w:ascii="Times New Roman" w:hAnsi="Times New Roman" w:eastAsia="Times New Roman" w:cs="Times New Roman"/>
+          <w:color w:val="000000"/>
+          <w:sz w:val="24"/>
+        </w:rPr>
         <w:t xml:space="preserve">Vaillancourt, F. (1996). Language and socioeconomic status in Quebec: measurement, findings, determinants, and policy costs. </w:t>
       </w:r>
       <w:r>
@@ -1312,6 +1312,36 @@
           <w:color w:val="000000"/>
           <w:sz w:val="24"/>
         </w:rPr>
+        <w:t xml:space="preserve">Vaillancourt, F. (2020). La rémunération des attributs linguistiques au Québec : résultats pour 2015 et comparaison 1970-2015. </w:t>
+      </w:r>
+      <w:r>
+        <w:rPr>
+          <w:rFonts w:ascii="Times New Roman" w:hAnsi="Times New Roman" w:eastAsia="Times New Roman" w:cs="Times New Roman"/>
+          <w:i/>
+          <w:color w:val="000000"/>
+          <w:sz w:val="24"/>
+        </w:rPr>
+        <w:t>CIRANO, Rapport 2020s-52 ; version anglaise REAL Working Paper 20-8 (Ulster University)</w:t>
+      </w:r>
+      <w:r>
+        <w:rPr>
+          <w:rFonts w:ascii="Times New Roman" w:hAnsi="Times New Roman" w:eastAsia="Times New Roman" w:cs="Times New Roman"/>
+          <w:color w:val="000000"/>
+          <w:sz w:val="24"/>
+        </w:rPr>
+        <w:t>. https://cirano.qc.ca/files/publications/2020s-52.pdf</w:t>
+      </w:r>
+    </w:p>
+    <w:p>
+      <w:pPr>
+        <w:ind w:left="709" w:hanging="709"/>
+      </w:pPr>
+      <w:r>
+        <w:rPr>
+          <w:rFonts w:ascii="Times New Roman" w:hAnsi="Times New Roman" w:eastAsia="Times New Roman" w:cs="Times New Roman"/>
+          <w:color w:val="000000"/>
+          <w:sz w:val="24"/>
+        </w:rPr>
         <w:t xml:space="preserve">Vaillancourt, F., Lemay, D. et Vaillancourt, L. (2007). Laggards no more: The changed socioeconomic status of francophones in Quebec. </w:t>
       </w:r>
       <w:r>
@@ -1342,36 +1372,6 @@
           <w:color w:val="000000"/>
           <w:sz w:val="24"/>
         </w:rPr>
-        <w:t xml:space="preserve">Vaillancourt, F. et Touchette, C. (2001). Le statut du français sur le marché du travail au Québec, de 1970 à 1995 : les revenus de travail. </w:t>
-      </w:r>
-      <w:r>
-        <w:rPr>
-          <w:rFonts w:ascii="Times New Roman" w:hAnsi="Times New Roman" w:eastAsia="Times New Roman" w:cs="Times New Roman"/>
-          <w:i/>
-          <w:color w:val="000000"/>
-          <w:sz w:val="24"/>
-        </w:rPr>
-        <w:t>Montréal : CIRANO, Rapport de projet 2001RP-04 (pour le Conseil de la langue française)</w:t>
-      </w:r>
-      <w:r>
-        <w:rPr>
-          <w:rFonts w:ascii="Times New Roman" w:hAnsi="Times New Roman" w:eastAsia="Times New Roman" w:cs="Times New Roman"/>
-          <w:color w:val="000000"/>
-          <w:sz w:val="24"/>
-        </w:rPr>
-        <w:t>.</w:t>
-      </w:r>
-    </w:p>
-    <w:p>
-      <w:pPr>
-        <w:ind w:left="709" w:hanging="709"/>
-      </w:pPr>
-      <w:r>
-        <w:rPr>
-          <w:rFonts w:ascii="Times New Roman" w:hAnsi="Times New Roman" w:eastAsia="Times New Roman" w:cs="Times New Roman"/>
-          <w:color w:val="000000"/>
-          <w:sz w:val="24"/>
-        </w:rPr>
         <w:t xml:space="preserve">Vaillancourt, F., Tousignant, J., Chatel-DeRepentigny, J. et Coutu-Mantha, S. (2013). Revenus de travail et rendement des attributs linguistiques au Québec en 2005 et depuis 1970. </w:t>
       </w:r>
       <w:r>
@@ -1390,36 +1390,6 @@
           <w:sz w:val="24"/>
         </w:rPr>
         <w:t>. https://doi.org/10.3138/cpp.39.supplement1.s25</w:t>
-      </w:r>
-    </w:p>
-    <w:p>
-      <w:pPr>
-        <w:ind w:left="709" w:hanging="709"/>
-      </w:pPr>
-      <w:r>
-        <w:rPr>
-          <w:rFonts w:ascii="Times New Roman" w:hAnsi="Times New Roman" w:eastAsia="Times New Roman" w:cs="Times New Roman"/>
-          <w:color w:val="000000"/>
-          <w:sz w:val="24"/>
-        </w:rPr>
-        <w:t xml:space="preserve">Vaillancourt, F. et Vaillancourt, L. (2005). La propriété des employeurs au Québec en 2003 selon le groupe d'appartenance linguistique. </w:t>
-      </w:r>
-      <w:r>
-        <w:rPr>
-          <w:rFonts w:ascii="Times New Roman" w:hAnsi="Times New Roman" w:eastAsia="Times New Roman" w:cs="Times New Roman"/>
-          <w:i/>
-          <w:color w:val="000000"/>
-          <w:sz w:val="24"/>
-        </w:rPr>
-        <w:t>Québec : Conseil supérieur de la langue française</w:t>
-      </w:r>
-      <w:r>
-        <w:rPr>
-          <w:rFonts w:ascii="Times New Roman" w:hAnsi="Times New Roman" w:eastAsia="Times New Roman" w:cs="Times New Roman"/>
-          <w:color w:val="000000"/>
-          <w:sz w:val="24"/>
-        </w:rPr>
-        <w:t>.</w:t>
       </w:r>
     </w:p>
     <w:p>

</xml_diff>

<commit_message>
Gabarit : une figure par page (pleine largeur), saut de page avant la revue de littérature
Co-Authored-By: Claude Fable 5.1 <noreply@anthropic.com>
Claude-Session: https://claude.ai/code/session_01445z6xKrBFqCGGPpGngyXf
</commit_message>
<xml_diff>
--- a/Gabarit/gabarit_snowballing.docx
+++ b/Gabarit/gabarit_snowballing.docx
@@ -345,13 +345,18 @@
       </w:r>
     </w:p>
     <w:p>
+      <w:r>
+        <w:br w:type="page"/>
+      </w:r>
+    </w:p>
+    <w:p>
       <w:pPr>
         <w:jc w:val="center"/>
       </w:pPr>
       <w:r>
         <w:drawing>
           <wp:inline xmlns:a="http://schemas.openxmlformats.org/drawingml/2006/main" xmlns:pic="http://schemas.openxmlformats.org/drawingml/2006/picture">
-            <wp:extent cx="4572000" cy="3526971"/>
+            <wp:extent cx="5760720" cy="4443984"/>
             <wp:docPr id="1" name="Picture 1"/>
             <wp:cNvGraphicFramePr>
               <a:graphicFrameLocks noChangeAspect="1"/>
@@ -372,7 +377,7 @@
                   <pic:spPr>
                     <a:xfrm>
                       <a:off x="0" y="0"/>
-                      <a:ext cx="4572000" cy="3526971"/>
+                      <a:ext cx="5760720" cy="4443984"/>
                     </a:xfrm>
                     <a:prstGeom prst="rect"/>
                   </pic:spPr>
@@ -398,13 +403,18 @@
       </w:r>
     </w:p>
     <w:p>
+      <w:r>
+        <w:br w:type="page"/>
+      </w:r>
+    </w:p>
+    <w:p>
       <w:pPr>
         <w:jc w:val="center"/>
       </w:pPr>
       <w:r>
         <w:drawing>
           <wp:inline xmlns:a="http://schemas.openxmlformats.org/drawingml/2006/main" xmlns:pic="http://schemas.openxmlformats.org/drawingml/2006/picture">
-            <wp:extent cx="4206240" cy="3417570"/>
+            <wp:extent cx="5760720" cy="4680585"/>
             <wp:docPr id="2" name="Picture 2"/>
             <wp:cNvGraphicFramePr>
               <a:graphicFrameLocks noChangeAspect="1"/>
@@ -425,7 +435,7 @@
                   <pic:spPr>
                     <a:xfrm>
                       <a:off x="0" y="0"/>
-                      <a:ext cx="4206240" cy="3417570"/>
+                      <a:ext cx="5760720" cy="4680585"/>
                     </a:xfrm>
                     <a:prstGeom prst="rect"/>
                   </pic:spPr>

</xml_diff>